<commit_message>
fix: corregir auditoria - duplicado seccion 3 en manual, numeracion seccion 10 en especificacion, test_* en pytest
</commit_message>
<xml_diff>
--- a/docs/especificacion-proyecto.docx
+++ b/docs/especificacion-proyecto.docx
@@ -5286,7 +5286,7 @@
         <w:pStyle w:val="Heading2"/>
       </w:pPr>
       <w:r>
-        <w:t xml:space="preserve">10. Plan de Trabajo y Cronograma</w:t>
+        <w:t xml:space="preserve">9.1 Plan de Trabajo y Cronograma</w:t>
       </w:r>
     </w:p>
     <w:bookmarkStart w:id="56" w:name="diagrama-de-gantt"/>
@@ -5295,7 +5295,7 @@
         <w:pStyle w:val="Heading3"/>
       </w:pPr>
       <w:r>
-        <w:t xml:space="preserve">10.1 Diagrama de Gantt</w:t>
+        <w:t xml:space="preserve">9.1.1 Diagrama de Gantt</w:t>
       </w:r>
     </w:p>
     <w:p>
@@ -5721,7 +5721,7 @@
         <w:pStyle w:val="Heading3"/>
       </w:pPr>
       <w:r>
-        <w:t xml:space="preserve">10.2 Prioridades para la Semana 13 (13-17 julio)</w:t>
+        <w:t xml:space="preserve">9.1.2 Prioridades para la Semana 13 (13-17 julio)</w:t>
       </w:r>
     </w:p>
     <w:tbl>

</xml_diff>

<commit_message>
docs: agregar ER diagrama, DDL SQL, consultas SQL, DB Browser guia, Anexos con datos BD + seccion 12 BD design
</commit_message>
<xml_diff>
--- a/docs/especificacion-proyecto.docx
+++ b/docs/especificacion-proyecto.docx
@@ -2,7 +2,7 @@
 <file path=word/document.xml><?xml version="1.0" encoding="utf-8"?>
 <w:document xmlns:w="http://schemas.openxmlformats.org/wordprocessingml/2006/main" xmlns:m="http://schemas.openxmlformats.org/officeDocument/2006/math" xmlns:r="http://schemas.openxmlformats.org/officeDocument/2006/relationships" xmlns:o="urn:schemas-microsoft-com:office:office" xmlns:v="urn:schemas-microsoft-com:vml" xmlns:w10="urn:schemas-microsoft-com:office:word" xmlns:a="http://schemas.openxmlformats.org/drawingml/2006/main" xmlns:pic="http://schemas.openxmlformats.org/drawingml/2006/picture" xmlns:wp="http://schemas.openxmlformats.org/drawingml/2006/wordprocessingDrawing">
   <w:body>
-    <w:bookmarkStart w:id="75" w:name="X6714339993d437513ee7c8489c502450b486867"/>
+    <w:bookmarkStart w:id="84" w:name="X6714339993d437513ee7c8489c502450b486867"/>
     <w:p>
       <w:pPr>
         <w:pStyle w:val="Heading1"/>
@@ -8415,10 +8415,6 @@
               <w:jc w:val="left"/>
             </w:pPr>
             <w:r>
-              <w:rPr>
-                <w:b/>
-                <w:bCs/>
-              </w:rPr>
               <w:t xml:space="preserve">Merge Sort</w:t>
             </w:r>
           </w:p>
@@ -8481,10 +8477,6 @@
               <w:jc w:val="left"/>
             </w:pPr>
             <w:r>
-              <w:rPr>
-                <w:b/>
-                <w:bCs/>
-              </w:rPr>
               <w:t xml:space="preserve">Quick Sort</w:t>
             </w:r>
           </w:p>
@@ -8547,10 +8539,6 @@
               <w:jc w:val="left"/>
             </w:pPr>
             <w:r>
-              <w:rPr>
-                <w:b/>
-                <w:bCs/>
-              </w:rPr>
               <w:t xml:space="preserve">Búsqueda Lineal</w:t>
             </w:r>
           </w:p>
@@ -8613,10 +8601,6 @@
               <w:jc w:val="left"/>
             </w:pPr>
             <w:r>
-              <w:rPr>
-                <w:b/>
-                <w:bCs/>
-              </w:rPr>
               <w:t xml:space="preserve">Búsqueda Binaria</w:t>
             </w:r>
           </w:p>
@@ -8697,13 +8681,2581 @@
       </w:r>
     </w:p>
     <w:bookmarkEnd w:id="66"/>
-    <w:bookmarkStart w:id="67" w:name="pruebas-realizadas"/>
+    <w:bookmarkStart w:id="72" w:name="diseño-de-la-base-de-datos"/>
     <w:p>
       <w:pPr>
         <w:pStyle w:val="Heading2"/>
       </w:pPr>
       <w:r>
-        <w:t xml:space="preserve">12. Pruebas Realizadas</w:t>
+        <w:t xml:space="preserve">12. Diseño de la Base de Datos</w:t>
+      </w:r>
+    </w:p>
+    <w:bookmarkStart w:id="67" w:name="modelo-entidad-relación"/>
+    <w:p>
+      <w:pPr>
+        <w:pStyle w:val="Heading3"/>
+      </w:pPr>
+      <w:r>
+        <w:t xml:space="preserve">12.1 Modelo Entidad-Relación</w:t>
+      </w:r>
+    </w:p>
+    <w:p>
+      <w:pPr>
+        <w:pStyle w:val="SourceCode"/>
+      </w:pPr>
+      <w:r>
+        <w:rPr>
+          <w:rStyle w:val="VerbatimChar"/>
+        </w:rPr>
+        <w:t xml:space="preserve">┌──────────────────┐         ┌──────────────────┐</w:t>
+      </w:r>
+      <w:r>
+        <w:br/>
+      </w:r>
+      <w:r>
+        <w:rPr>
+          <w:rStyle w:val="VerbatimChar"/>
+        </w:rPr>
+        <w:t xml:space="preserve">│     socios       │         │     libros       │</w:t>
+      </w:r>
+      <w:r>
+        <w:br/>
+      </w:r>
+      <w:r>
+        <w:rPr>
+          <w:rStyle w:val="VerbatimChar"/>
+        </w:rPr>
+        <w:t xml:space="preserve">├──────────────────┤         ├──────────────────┤</w:t>
+      </w:r>
+      <w:r>
+        <w:br/>
+      </w:r>
+      <w:r>
+        <w:rPr>
+          <w:rStyle w:val="VerbatimChar"/>
+        </w:rPr>
+        <w:t xml:space="preserve">│PK cedula: TEXT   │         │PK isbn: TEXT     │</w:t>
+      </w:r>
+      <w:r>
+        <w:br/>
+      </w:r>
+      <w:r>
+        <w:rPr>
+          <w:rStyle w:val="VerbatimChar"/>
+        </w:rPr>
+        <w:t xml:space="preserve">│ nombre: TEXT     │         │ titulo: TEXT     │</w:t>
+      </w:r>
+      <w:r>
+        <w:br/>
+      </w:r>
+      <w:r>
+        <w:rPr>
+          <w:rStyle w:val="VerbatimChar"/>
+        </w:rPr>
+        <w:t xml:space="preserve">│ apellido: TEXT   │         │ autor: TEXT      │</w:t>
+      </w:r>
+      <w:r>
+        <w:br/>
+      </w:r>
+      <w:r>
+        <w:rPr>
+          <w:rStyle w:val="VerbatimChar"/>
+        </w:rPr>
+        <w:t xml:space="preserve">│ tipo: TEXT       │         │ editorial: TEXT  │</w:t>
+      </w:r>
+      <w:r>
+        <w:br/>
+      </w:r>
+      <w:r>
+        <w:rPr>
+          <w:rStyle w:val="VerbatimChar"/>
+        </w:rPr>
+        <w:t xml:space="preserve">│ carrera_depto:  │         │ anio: INTEGER    │</w:t>
+      </w:r>
+      <w:r>
+        <w:br/>
+      </w:r>
+      <w:r>
+        <w:rPr>
+          <w:rStyle w:val="VerbatimChar"/>
+        </w:rPr>
+        <w:t xml:space="preserve">│   TEXT           │         │ ejemplares: INT  │</w:t>
+      </w:r>
+      <w:r>
+        <w:br/>
+      </w:r>
+      <w:r>
+        <w:rPr>
+          <w:rStyle w:val="VerbatimChar"/>
+        </w:rPr>
+        <w:t xml:space="preserve">│ semestre: INT    │         │ disponibles: INT │</w:t>
+      </w:r>
+      <w:r>
+        <w:br/>
+      </w:r>
+      <w:r>
+        <w:rPr>
+          <w:rStyle w:val="VerbatimChar"/>
+        </w:rPr>
+        <w:t xml:space="preserve">│ telefono: TEXT   │         └────────┬─────────┘</w:t>
+      </w:r>
+      <w:r>
+        <w:br/>
+      </w:r>
+      <w:r>
+        <w:rPr>
+          <w:rStyle w:val="VerbatimChar"/>
+        </w:rPr>
+        <w:t xml:space="preserve">└────────┬─────────┘                   │</w:t>
+      </w:r>
+      <w:r>
+        <w:br/>
+      </w:r>
+      <w:r>
+        <w:rPr>
+          <w:rStyle w:val="VerbatimChar"/>
+        </w:rPr>
+        <w:t xml:space="preserve">         │                            │</w:t>
+      </w:r>
+      <w:r>
+        <w:br/>
+      </w:r>
+      <w:r>
+        <w:rPr>
+          <w:rStyle w:val="VerbatimChar"/>
+        </w:rPr>
+        <w:t xml:space="preserve">         │ 1                          │ 1</w:t>
+      </w:r>
+      <w:r>
+        <w:br/>
+      </w:r>
+      <w:r>
+        <w:rPr>
+          <w:rStyle w:val="VerbatimChar"/>
+        </w:rPr>
+        <w:t xml:space="preserve">         │                            │</w:t>
+      </w:r>
+      <w:r>
+        <w:br/>
+      </w:r>
+      <w:r>
+        <w:rPr>
+          <w:rStyle w:val="VerbatimChar"/>
+        </w:rPr>
+        <w:t xml:space="preserve">         │ FK                         │ FK</w:t>
+      </w:r>
+      <w:r>
+        <w:br/>
+      </w:r>
+      <w:r>
+        <w:rPr>
+          <w:rStyle w:val="VerbatimChar"/>
+        </w:rPr>
+        <w:t xml:space="preserve">         ▼                            ▼</w:t>
+      </w:r>
+      <w:r>
+        <w:br/>
+      </w:r>
+      <w:r>
+        <w:rPr>
+          <w:rStyle w:val="VerbatimChar"/>
+        </w:rPr>
+        <w:t xml:space="preserve">┌──────────────────────────────────────────────┐</w:t>
+      </w:r>
+      <w:r>
+        <w:br/>
+      </w:r>
+      <w:r>
+        <w:rPr>
+          <w:rStyle w:val="VerbatimChar"/>
+        </w:rPr>
+        <w:t xml:space="preserve">│               prestamos                       │</w:t>
+      </w:r>
+      <w:r>
+        <w:br/>
+      </w:r>
+      <w:r>
+        <w:rPr>
+          <w:rStyle w:val="VerbatimChar"/>
+        </w:rPr>
+        <w:t xml:space="preserve">├──────────────────────────────────────────────┤</w:t>
+      </w:r>
+      <w:r>
+        <w:br/>
+      </w:r>
+      <w:r>
+        <w:rPr>
+          <w:rStyle w:val="VerbatimChar"/>
+        </w:rPr>
+        <w:t xml:space="preserve">│PK id: INTEGER AUTOINCREMENT                  │</w:t>
+      </w:r>
+      <w:r>
+        <w:br/>
+      </w:r>
+      <w:r>
+        <w:rPr>
+          <w:rStyle w:val="VerbatimChar"/>
+        </w:rPr>
+        <w:t xml:space="preserve">│FK cedula_socio → socios(cedula)              │</w:t>
+      </w:r>
+      <w:r>
+        <w:br/>
+      </w:r>
+      <w:r>
+        <w:rPr>
+          <w:rStyle w:val="VerbatimChar"/>
+        </w:rPr>
+        <w:t xml:space="preserve">│FK isbn_libro → libros(isbn)                  │</w:t>
+      </w:r>
+      <w:r>
+        <w:br/>
+      </w:r>
+      <w:r>
+        <w:rPr>
+          <w:rStyle w:val="VerbatimChar"/>
+        </w:rPr>
+        <w:t xml:space="preserve">│ fecha_prestamo: TEXT NOT NULL                 │</w:t>
+      </w:r>
+      <w:r>
+        <w:br/>
+      </w:r>
+      <w:r>
+        <w:rPr>
+          <w:rStyle w:val="VerbatimChar"/>
+        </w:rPr>
+        <w:t xml:space="preserve">│ fecha_devolucion: TEXT (NULL = pendiente)     │</w:t>
+      </w:r>
+      <w:r>
+        <w:br/>
+      </w:r>
+      <w:r>
+        <w:rPr>
+          <w:rStyle w:val="VerbatimChar"/>
+        </w:rPr>
+        <w:t xml:space="preserve">└──────────────────────────────────────────────┘</w:t>
+      </w:r>
+      <w:r>
+        <w:br/>
+      </w:r>
+      <w:r>
+        <w:br/>
+      </w:r>
+      <w:r>
+        <w:rPr>
+          <w:rStyle w:val="VerbatimChar"/>
+        </w:rPr>
+        <w:t xml:space="preserve">┌──────────────────────────────────────────────┐</w:t>
+      </w:r>
+      <w:r>
+        <w:br/>
+      </w:r>
+      <w:r>
+        <w:rPr>
+          <w:rStyle w:val="VerbatimChar"/>
+        </w:rPr>
+        <w:t xml:space="preserve">│               reservas                        │</w:t>
+      </w:r>
+      <w:r>
+        <w:br/>
+      </w:r>
+      <w:r>
+        <w:rPr>
+          <w:rStyle w:val="VerbatimChar"/>
+        </w:rPr>
+        <w:t xml:space="preserve">├──────────────────────────────────────────────┤</w:t>
+      </w:r>
+      <w:r>
+        <w:br/>
+      </w:r>
+      <w:r>
+        <w:rPr>
+          <w:rStyle w:val="VerbatimChar"/>
+        </w:rPr>
+        <w:t xml:space="preserve">│PK id: INTEGER AUTOINCREMENT                  │</w:t>
+      </w:r>
+      <w:r>
+        <w:br/>
+      </w:r>
+      <w:r>
+        <w:rPr>
+          <w:rStyle w:val="VerbatimChar"/>
+        </w:rPr>
+        <w:t xml:space="preserve">│FK cedula_socio → socios(cedula)              │</w:t>
+      </w:r>
+      <w:r>
+        <w:br/>
+      </w:r>
+      <w:r>
+        <w:rPr>
+          <w:rStyle w:val="VerbatimChar"/>
+        </w:rPr>
+        <w:t xml:space="preserve">│FK isbn_libro → libros(isbn)                  │</w:t>
+      </w:r>
+      <w:r>
+        <w:br/>
+      </w:r>
+      <w:r>
+        <w:rPr>
+          <w:rStyle w:val="VerbatimChar"/>
+        </w:rPr>
+        <w:t xml:space="preserve">│ fecha_reserva: TEXT NOT NULL                  │</w:t>
+      </w:r>
+      <w:r>
+        <w:br/>
+      </w:r>
+      <w:r>
+        <w:rPr>
+          <w:rStyle w:val="VerbatimChar"/>
+        </w:rPr>
+        <w:t xml:space="preserve">│ activa: INTEGER DEFAULT 1                     │</w:t>
+      </w:r>
+      <w:r>
+        <w:br/>
+      </w:r>
+      <w:r>
+        <w:rPr>
+          <w:rStyle w:val="VerbatimChar"/>
+        </w:rPr>
+        <w:t xml:space="preserve">└──────────────────────────────────────────────┘</w:t>
+      </w:r>
+    </w:p>
+    <w:p>
+      <w:pPr>
+        <w:pStyle w:val="FirstParagraph"/>
+      </w:pPr>
+      <w:r>
+        <w:rPr>
+          <w:i/>
+          <w:iCs/>
+        </w:rPr>
+        <w:t xml:space="preserve">Nota: Cada socio puede tener 0 o muchos préstamos y 0 o muchas reservas.</w:t>
+      </w:r>
+      <w:r>
+        <w:rPr>
+          <w:i/>
+          <w:iCs/>
+        </w:rPr>
+        <w:t xml:space="preserve"> </w:t>
+      </w:r>
+      <w:r>
+        <w:rPr>
+          <w:i/>
+          <w:iCs/>
+        </w:rPr>
+        <w:t xml:space="preserve">Cada libro puede estar en 0 o muchos préstamos y 0 o muchas reservas.</w:t>
+      </w:r>
+    </w:p>
+    <w:bookmarkEnd w:id="67"/>
+    <w:bookmarkStart w:id="68" w:name="esquema-sql-ddl"/>
+    <w:p>
+      <w:pPr>
+        <w:pStyle w:val="Heading3"/>
+      </w:pPr>
+      <w:r>
+        <w:t xml:space="preserve">12.2 Esquema SQL (DDL)</w:t>
+      </w:r>
+    </w:p>
+    <w:p>
+      <w:pPr>
+        <w:pStyle w:val="SourceCode"/>
+      </w:pPr>
+      <w:r>
+        <w:rPr>
+          <w:rStyle w:val="KeywordTok"/>
+        </w:rPr>
+        <w:t xml:space="preserve">CREATE</w:t>
+      </w:r>
+      <w:r>
+        <w:rPr>
+          <w:rStyle w:val="NormalTok"/>
+        </w:rPr>
+        <w:t xml:space="preserve"> </w:t>
+      </w:r>
+      <w:r>
+        <w:rPr>
+          <w:rStyle w:val="KeywordTok"/>
+        </w:rPr>
+        <w:t xml:space="preserve">TABLE</w:t>
+      </w:r>
+      <w:r>
+        <w:rPr>
+          <w:rStyle w:val="NormalTok"/>
+        </w:rPr>
+        <w:t xml:space="preserve"> </w:t>
+      </w:r>
+      <w:r>
+        <w:rPr>
+          <w:rStyle w:val="ControlFlowTok"/>
+        </w:rPr>
+        <w:t xml:space="preserve">IF</w:t>
+      </w:r>
+      <w:r>
+        <w:rPr>
+          <w:rStyle w:val="NormalTok"/>
+        </w:rPr>
+        <w:t xml:space="preserve"> </w:t>
+      </w:r>
+      <w:r>
+        <w:rPr>
+          <w:rStyle w:val="KeywordTok"/>
+        </w:rPr>
+        <w:t xml:space="preserve">NOT</w:t>
+      </w:r>
+      <w:r>
+        <w:rPr>
+          <w:rStyle w:val="NormalTok"/>
+        </w:rPr>
+        <w:t xml:space="preserve"> </w:t>
+      </w:r>
+      <w:r>
+        <w:rPr>
+          <w:rStyle w:val="KeywordTok"/>
+        </w:rPr>
+        <w:t xml:space="preserve">EXISTS</w:t>
+      </w:r>
+      <w:r>
+        <w:rPr>
+          <w:rStyle w:val="NormalTok"/>
+        </w:rPr>
+        <w:t xml:space="preserve"> socios (</w:t>
+      </w:r>
+      <w:r>
+        <w:br/>
+      </w:r>
+      <w:r>
+        <w:rPr>
+          <w:rStyle w:val="NormalTok"/>
+        </w:rPr>
+        <w:t xml:space="preserve">    cedula TEXT </w:t>
+      </w:r>
+      <w:r>
+        <w:rPr>
+          <w:rStyle w:val="KeywordTok"/>
+        </w:rPr>
+        <w:t xml:space="preserve">PRIMARY</w:t>
+      </w:r>
+      <w:r>
+        <w:rPr>
+          <w:rStyle w:val="NormalTok"/>
+        </w:rPr>
+        <w:t xml:space="preserve"> </w:t>
+      </w:r>
+      <w:r>
+        <w:rPr>
+          <w:rStyle w:val="KeywordTok"/>
+        </w:rPr>
+        <w:t xml:space="preserve">KEY</w:t>
+      </w:r>
+      <w:r>
+        <w:rPr>
+          <w:rStyle w:val="NormalTok"/>
+        </w:rPr>
+        <w:t xml:space="preserve">,</w:t>
+      </w:r>
+      <w:r>
+        <w:br/>
+      </w:r>
+      <w:r>
+        <w:rPr>
+          <w:rStyle w:val="NormalTok"/>
+        </w:rPr>
+        <w:t xml:space="preserve">    nombre TEXT </w:t>
+      </w:r>
+      <w:r>
+        <w:rPr>
+          <w:rStyle w:val="KeywordTok"/>
+        </w:rPr>
+        <w:t xml:space="preserve">NOT</w:t>
+      </w:r>
+      <w:r>
+        <w:rPr>
+          <w:rStyle w:val="NormalTok"/>
+        </w:rPr>
+        <w:t xml:space="preserve"> </w:t>
+      </w:r>
+      <w:r>
+        <w:rPr>
+          <w:rStyle w:val="KeywordTok"/>
+        </w:rPr>
+        <w:t xml:space="preserve">NULL</w:t>
+      </w:r>
+      <w:r>
+        <w:rPr>
+          <w:rStyle w:val="NormalTok"/>
+        </w:rPr>
+        <w:t xml:space="preserve">,</w:t>
+      </w:r>
+      <w:r>
+        <w:br/>
+      </w:r>
+      <w:r>
+        <w:rPr>
+          <w:rStyle w:val="NormalTok"/>
+        </w:rPr>
+        <w:t xml:space="preserve">    apellido TEXT </w:t>
+      </w:r>
+      <w:r>
+        <w:rPr>
+          <w:rStyle w:val="KeywordTok"/>
+        </w:rPr>
+        <w:t xml:space="preserve">NOT</w:t>
+      </w:r>
+      <w:r>
+        <w:rPr>
+          <w:rStyle w:val="NormalTok"/>
+        </w:rPr>
+        <w:t xml:space="preserve"> </w:t>
+      </w:r>
+      <w:r>
+        <w:rPr>
+          <w:rStyle w:val="KeywordTok"/>
+        </w:rPr>
+        <w:t xml:space="preserve">NULL</w:t>
+      </w:r>
+      <w:r>
+        <w:rPr>
+          <w:rStyle w:val="NormalTok"/>
+        </w:rPr>
+        <w:t xml:space="preserve">,</w:t>
+      </w:r>
+      <w:r>
+        <w:br/>
+      </w:r>
+      <w:r>
+        <w:rPr>
+          <w:rStyle w:val="NormalTok"/>
+        </w:rPr>
+        <w:t xml:space="preserve">    tipo TEXT </w:t>
+      </w:r>
+      <w:r>
+        <w:rPr>
+          <w:rStyle w:val="KeywordTok"/>
+        </w:rPr>
+        <w:t xml:space="preserve">NOT</w:t>
+      </w:r>
+      <w:r>
+        <w:rPr>
+          <w:rStyle w:val="NormalTok"/>
+        </w:rPr>
+        <w:t xml:space="preserve"> </w:t>
+      </w:r>
+      <w:r>
+        <w:rPr>
+          <w:rStyle w:val="KeywordTok"/>
+        </w:rPr>
+        <w:t xml:space="preserve">NULL</w:t>
+      </w:r>
+      <w:r>
+        <w:rPr>
+          <w:rStyle w:val="NormalTok"/>
+        </w:rPr>
+        <w:t xml:space="preserve"> </w:t>
+      </w:r>
+      <w:r>
+        <w:rPr>
+          <w:rStyle w:val="KeywordTok"/>
+        </w:rPr>
+        <w:t xml:space="preserve">CHECK</w:t>
+      </w:r>
+      <w:r>
+        <w:rPr>
+          <w:rStyle w:val="NormalTok"/>
+        </w:rPr>
+        <w:t xml:space="preserve">(tipo </w:t>
+      </w:r>
+      <w:r>
+        <w:rPr>
+          <w:rStyle w:val="KeywordTok"/>
+        </w:rPr>
+        <w:t xml:space="preserve">IN</w:t>
+      </w:r>
+      <w:r>
+        <w:rPr>
+          <w:rStyle w:val="NormalTok"/>
+        </w:rPr>
+        <w:t xml:space="preserve"> (</w:t>
+      </w:r>
+      <w:r>
+        <w:rPr>
+          <w:rStyle w:val="StringTok"/>
+        </w:rPr>
+        <w:t xml:space="preserve">'Estudiante'</w:t>
+      </w:r>
+      <w:r>
+        <w:rPr>
+          <w:rStyle w:val="NormalTok"/>
+        </w:rPr>
+        <w:t xml:space="preserve">, </w:t>
+      </w:r>
+      <w:r>
+        <w:rPr>
+          <w:rStyle w:val="StringTok"/>
+        </w:rPr>
+        <w:t xml:space="preserve">'Docente'</w:t>
+      </w:r>
+      <w:r>
+        <w:rPr>
+          <w:rStyle w:val="NormalTok"/>
+        </w:rPr>
+        <w:t xml:space="preserve">)),</w:t>
+      </w:r>
+      <w:r>
+        <w:br/>
+      </w:r>
+      <w:r>
+        <w:rPr>
+          <w:rStyle w:val="NormalTok"/>
+        </w:rPr>
+        <w:t xml:space="preserve">    carrera_departamento TEXT,</w:t>
+      </w:r>
+      <w:r>
+        <w:br/>
+      </w:r>
+      <w:r>
+        <w:rPr>
+          <w:rStyle w:val="NormalTok"/>
+        </w:rPr>
+        <w:t xml:space="preserve">    semestre </w:t>
+      </w:r>
+      <w:r>
+        <w:rPr>
+          <w:rStyle w:val="DataTypeTok"/>
+        </w:rPr>
+        <w:t xml:space="preserve">INTEGER</w:t>
+      </w:r>
+      <w:r>
+        <w:rPr>
+          <w:rStyle w:val="NormalTok"/>
+        </w:rPr>
+        <w:t xml:space="preserve">,</w:t>
+      </w:r>
+      <w:r>
+        <w:br/>
+      </w:r>
+      <w:r>
+        <w:rPr>
+          <w:rStyle w:val="NormalTok"/>
+        </w:rPr>
+        <w:t xml:space="preserve">    telefono TEXT</w:t>
+      </w:r>
+      <w:r>
+        <w:br/>
+      </w:r>
+      <w:r>
+        <w:rPr>
+          <w:rStyle w:val="NormalTok"/>
+        </w:rPr>
+        <w:t xml:space="preserve">);</w:t>
+      </w:r>
+      <w:r>
+        <w:br/>
+      </w:r>
+      <w:r>
+        <w:br/>
+      </w:r>
+      <w:r>
+        <w:rPr>
+          <w:rStyle w:val="KeywordTok"/>
+        </w:rPr>
+        <w:t xml:space="preserve">CREATE</w:t>
+      </w:r>
+      <w:r>
+        <w:rPr>
+          <w:rStyle w:val="NormalTok"/>
+        </w:rPr>
+        <w:t xml:space="preserve"> </w:t>
+      </w:r>
+      <w:r>
+        <w:rPr>
+          <w:rStyle w:val="KeywordTok"/>
+        </w:rPr>
+        <w:t xml:space="preserve">TABLE</w:t>
+      </w:r>
+      <w:r>
+        <w:rPr>
+          <w:rStyle w:val="NormalTok"/>
+        </w:rPr>
+        <w:t xml:space="preserve"> </w:t>
+      </w:r>
+      <w:r>
+        <w:rPr>
+          <w:rStyle w:val="ControlFlowTok"/>
+        </w:rPr>
+        <w:t xml:space="preserve">IF</w:t>
+      </w:r>
+      <w:r>
+        <w:rPr>
+          <w:rStyle w:val="NormalTok"/>
+        </w:rPr>
+        <w:t xml:space="preserve"> </w:t>
+      </w:r>
+      <w:r>
+        <w:rPr>
+          <w:rStyle w:val="KeywordTok"/>
+        </w:rPr>
+        <w:t xml:space="preserve">NOT</w:t>
+      </w:r>
+      <w:r>
+        <w:rPr>
+          <w:rStyle w:val="NormalTok"/>
+        </w:rPr>
+        <w:t xml:space="preserve"> </w:t>
+      </w:r>
+      <w:r>
+        <w:rPr>
+          <w:rStyle w:val="KeywordTok"/>
+        </w:rPr>
+        <w:t xml:space="preserve">EXISTS</w:t>
+      </w:r>
+      <w:r>
+        <w:rPr>
+          <w:rStyle w:val="NormalTok"/>
+        </w:rPr>
+        <w:t xml:space="preserve"> libros (</w:t>
+      </w:r>
+      <w:r>
+        <w:br/>
+      </w:r>
+      <w:r>
+        <w:rPr>
+          <w:rStyle w:val="NormalTok"/>
+        </w:rPr>
+        <w:t xml:space="preserve">    isbn TEXT </w:t>
+      </w:r>
+      <w:r>
+        <w:rPr>
+          <w:rStyle w:val="KeywordTok"/>
+        </w:rPr>
+        <w:t xml:space="preserve">PRIMARY</w:t>
+      </w:r>
+      <w:r>
+        <w:rPr>
+          <w:rStyle w:val="NormalTok"/>
+        </w:rPr>
+        <w:t xml:space="preserve"> </w:t>
+      </w:r>
+      <w:r>
+        <w:rPr>
+          <w:rStyle w:val="KeywordTok"/>
+        </w:rPr>
+        <w:t xml:space="preserve">KEY</w:t>
+      </w:r>
+      <w:r>
+        <w:rPr>
+          <w:rStyle w:val="NormalTok"/>
+        </w:rPr>
+        <w:t xml:space="preserve">,</w:t>
+      </w:r>
+      <w:r>
+        <w:br/>
+      </w:r>
+      <w:r>
+        <w:rPr>
+          <w:rStyle w:val="NormalTok"/>
+        </w:rPr>
+        <w:t xml:space="preserve">    titulo TEXT </w:t>
+      </w:r>
+      <w:r>
+        <w:rPr>
+          <w:rStyle w:val="KeywordTok"/>
+        </w:rPr>
+        <w:t xml:space="preserve">NOT</w:t>
+      </w:r>
+      <w:r>
+        <w:rPr>
+          <w:rStyle w:val="NormalTok"/>
+        </w:rPr>
+        <w:t xml:space="preserve"> </w:t>
+      </w:r>
+      <w:r>
+        <w:rPr>
+          <w:rStyle w:val="KeywordTok"/>
+        </w:rPr>
+        <w:t xml:space="preserve">NULL</w:t>
+      </w:r>
+      <w:r>
+        <w:rPr>
+          <w:rStyle w:val="NormalTok"/>
+        </w:rPr>
+        <w:t xml:space="preserve">,</w:t>
+      </w:r>
+      <w:r>
+        <w:br/>
+      </w:r>
+      <w:r>
+        <w:rPr>
+          <w:rStyle w:val="NormalTok"/>
+        </w:rPr>
+        <w:t xml:space="preserve">    autor TEXT </w:t>
+      </w:r>
+      <w:r>
+        <w:rPr>
+          <w:rStyle w:val="KeywordTok"/>
+        </w:rPr>
+        <w:t xml:space="preserve">NOT</w:t>
+      </w:r>
+      <w:r>
+        <w:rPr>
+          <w:rStyle w:val="NormalTok"/>
+        </w:rPr>
+        <w:t xml:space="preserve"> </w:t>
+      </w:r>
+      <w:r>
+        <w:rPr>
+          <w:rStyle w:val="KeywordTok"/>
+        </w:rPr>
+        <w:t xml:space="preserve">NULL</w:t>
+      </w:r>
+      <w:r>
+        <w:rPr>
+          <w:rStyle w:val="NormalTok"/>
+        </w:rPr>
+        <w:t xml:space="preserve">,</w:t>
+      </w:r>
+      <w:r>
+        <w:br/>
+      </w:r>
+      <w:r>
+        <w:rPr>
+          <w:rStyle w:val="NormalTok"/>
+        </w:rPr>
+        <w:t xml:space="preserve">    editorial TEXT,</w:t>
+      </w:r>
+      <w:r>
+        <w:br/>
+      </w:r>
+      <w:r>
+        <w:rPr>
+          <w:rStyle w:val="NormalTok"/>
+        </w:rPr>
+        <w:t xml:space="preserve">    anio </w:t>
+      </w:r>
+      <w:r>
+        <w:rPr>
+          <w:rStyle w:val="DataTypeTok"/>
+        </w:rPr>
+        <w:t xml:space="preserve">INTEGER</w:t>
+      </w:r>
+      <w:r>
+        <w:rPr>
+          <w:rStyle w:val="NormalTok"/>
+        </w:rPr>
+        <w:t xml:space="preserve">,</w:t>
+      </w:r>
+      <w:r>
+        <w:br/>
+      </w:r>
+      <w:r>
+        <w:rPr>
+          <w:rStyle w:val="NormalTok"/>
+        </w:rPr>
+        <w:t xml:space="preserve">    ejemplares </w:t>
+      </w:r>
+      <w:r>
+        <w:rPr>
+          <w:rStyle w:val="DataTypeTok"/>
+        </w:rPr>
+        <w:t xml:space="preserve">INTEGER</w:t>
+      </w:r>
+      <w:r>
+        <w:rPr>
+          <w:rStyle w:val="NormalTok"/>
+        </w:rPr>
+        <w:t xml:space="preserve"> </w:t>
+      </w:r>
+      <w:r>
+        <w:rPr>
+          <w:rStyle w:val="KeywordTok"/>
+        </w:rPr>
+        <w:t xml:space="preserve">DEFAULT</w:t>
+      </w:r>
+      <w:r>
+        <w:rPr>
+          <w:rStyle w:val="NormalTok"/>
+        </w:rPr>
+        <w:t xml:space="preserve"> </w:t>
+      </w:r>
+      <w:r>
+        <w:rPr>
+          <w:rStyle w:val="DecValTok"/>
+        </w:rPr>
+        <w:t xml:space="preserve">1</w:t>
+      </w:r>
+      <w:r>
+        <w:rPr>
+          <w:rStyle w:val="NormalTok"/>
+        </w:rPr>
+        <w:t xml:space="preserve">,</w:t>
+      </w:r>
+      <w:r>
+        <w:br/>
+      </w:r>
+      <w:r>
+        <w:rPr>
+          <w:rStyle w:val="NormalTok"/>
+        </w:rPr>
+        <w:t xml:space="preserve">    disponibles </w:t>
+      </w:r>
+      <w:r>
+        <w:rPr>
+          <w:rStyle w:val="DataTypeTok"/>
+        </w:rPr>
+        <w:t xml:space="preserve">INTEGER</w:t>
+      </w:r>
+      <w:r>
+        <w:rPr>
+          <w:rStyle w:val="NormalTok"/>
+        </w:rPr>
+        <w:t xml:space="preserve"> </w:t>
+      </w:r>
+      <w:r>
+        <w:rPr>
+          <w:rStyle w:val="KeywordTok"/>
+        </w:rPr>
+        <w:t xml:space="preserve">DEFAULT</w:t>
+      </w:r>
+      <w:r>
+        <w:rPr>
+          <w:rStyle w:val="NormalTok"/>
+        </w:rPr>
+        <w:t xml:space="preserve"> </w:t>
+      </w:r>
+      <w:r>
+        <w:rPr>
+          <w:rStyle w:val="DecValTok"/>
+        </w:rPr>
+        <w:t xml:space="preserve">1</w:t>
+      </w:r>
+      <w:r>
+        <w:br/>
+      </w:r>
+      <w:r>
+        <w:rPr>
+          <w:rStyle w:val="NormalTok"/>
+        </w:rPr>
+        <w:t xml:space="preserve">);</w:t>
+      </w:r>
+      <w:r>
+        <w:br/>
+      </w:r>
+      <w:r>
+        <w:br/>
+      </w:r>
+      <w:r>
+        <w:rPr>
+          <w:rStyle w:val="KeywordTok"/>
+        </w:rPr>
+        <w:t xml:space="preserve">CREATE</w:t>
+      </w:r>
+      <w:r>
+        <w:rPr>
+          <w:rStyle w:val="NormalTok"/>
+        </w:rPr>
+        <w:t xml:space="preserve"> </w:t>
+      </w:r>
+      <w:r>
+        <w:rPr>
+          <w:rStyle w:val="KeywordTok"/>
+        </w:rPr>
+        <w:t xml:space="preserve">TABLE</w:t>
+      </w:r>
+      <w:r>
+        <w:rPr>
+          <w:rStyle w:val="NormalTok"/>
+        </w:rPr>
+        <w:t xml:space="preserve"> </w:t>
+      </w:r>
+      <w:r>
+        <w:rPr>
+          <w:rStyle w:val="ControlFlowTok"/>
+        </w:rPr>
+        <w:t xml:space="preserve">IF</w:t>
+      </w:r>
+      <w:r>
+        <w:rPr>
+          <w:rStyle w:val="NormalTok"/>
+        </w:rPr>
+        <w:t xml:space="preserve"> </w:t>
+      </w:r>
+      <w:r>
+        <w:rPr>
+          <w:rStyle w:val="KeywordTok"/>
+        </w:rPr>
+        <w:t xml:space="preserve">NOT</w:t>
+      </w:r>
+      <w:r>
+        <w:rPr>
+          <w:rStyle w:val="NormalTok"/>
+        </w:rPr>
+        <w:t xml:space="preserve"> </w:t>
+      </w:r>
+      <w:r>
+        <w:rPr>
+          <w:rStyle w:val="KeywordTok"/>
+        </w:rPr>
+        <w:t xml:space="preserve">EXISTS</w:t>
+      </w:r>
+      <w:r>
+        <w:rPr>
+          <w:rStyle w:val="NormalTok"/>
+        </w:rPr>
+        <w:t xml:space="preserve"> prestamos (</w:t>
+      </w:r>
+      <w:r>
+        <w:br/>
+      </w:r>
+      <w:r>
+        <w:rPr>
+          <w:rStyle w:val="NormalTok"/>
+        </w:rPr>
+        <w:t xml:space="preserve">    </w:t>
+      </w:r>
+      <w:r>
+        <w:rPr>
+          <w:rStyle w:val="KeywordTok"/>
+        </w:rPr>
+        <w:t xml:space="preserve">id</w:t>
+      </w:r>
+      <w:r>
+        <w:rPr>
+          <w:rStyle w:val="NormalTok"/>
+        </w:rPr>
+        <w:t xml:space="preserve"> </w:t>
+      </w:r>
+      <w:r>
+        <w:rPr>
+          <w:rStyle w:val="DataTypeTok"/>
+        </w:rPr>
+        <w:t xml:space="preserve">INTEGER</w:t>
+      </w:r>
+      <w:r>
+        <w:rPr>
+          <w:rStyle w:val="NormalTok"/>
+        </w:rPr>
+        <w:t xml:space="preserve"> </w:t>
+      </w:r>
+      <w:r>
+        <w:rPr>
+          <w:rStyle w:val="KeywordTok"/>
+        </w:rPr>
+        <w:t xml:space="preserve">PRIMARY</w:t>
+      </w:r>
+      <w:r>
+        <w:rPr>
+          <w:rStyle w:val="NormalTok"/>
+        </w:rPr>
+        <w:t xml:space="preserve"> </w:t>
+      </w:r>
+      <w:r>
+        <w:rPr>
+          <w:rStyle w:val="KeywordTok"/>
+        </w:rPr>
+        <w:t xml:space="preserve">KEY</w:t>
+      </w:r>
+      <w:r>
+        <w:rPr>
+          <w:rStyle w:val="NormalTok"/>
+        </w:rPr>
+        <w:t xml:space="preserve"> AUTOINCREMENT,</w:t>
+      </w:r>
+      <w:r>
+        <w:br/>
+      </w:r>
+      <w:r>
+        <w:rPr>
+          <w:rStyle w:val="NormalTok"/>
+        </w:rPr>
+        <w:t xml:space="preserve">    cedula_socio TEXT </w:t>
+      </w:r>
+      <w:r>
+        <w:rPr>
+          <w:rStyle w:val="KeywordTok"/>
+        </w:rPr>
+        <w:t xml:space="preserve">NOT</w:t>
+      </w:r>
+      <w:r>
+        <w:rPr>
+          <w:rStyle w:val="NormalTok"/>
+        </w:rPr>
+        <w:t xml:space="preserve"> </w:t>
+      </w:r>
+      <w:r>
+        <w:rPr>
+          <w:rStyle w:val="KeywordTok"/>
+        </w:rPr>
+        <w:t xml:space="preserve">NULL</w:t>
+      </w:r>
+      <w:r>
+        <w:rPr>
+          <w:rStyle w:val="NormalTok"/>
+        </w:rPr>
+        <w:t xml:space="preserve">,</w:t>
+      </w:r>
+      <w:r>
+        <w:br/>
+      </w:r>
+      <w:r>
+        <w:rPr>
+          <w:rStyle w:val="NormalTok"/>
+        </w:rPr>
+        <w:t xml:space="preserve">    isbn_libro TEXT </w:t>
+      </w:r>
+      <w:r>
+        <w:rPr>
+          <w:rStyle w:val="KeywordTok"/>
+        </w:rPr>
+        <w:t xml:space="preserve">NOT</w:t>
+      </w:r>
+      <w:r>
+        <w:rPr>
+          <w:rStyle w:val="NormalTok"/>
+        </w:rPr>
+        <w:t xml:space="preserve"> </w:t>
+      </w:r>
+      <w:r>
+        <w:rPr>
+          <w:rStyle w:val="KeywordTok"/>
+        </w:rPr>
+        <w:t xml:space="preserve">NULL</w:t>
+      </w:r>
+      <w:r>
+        <w:rPr>
+          <w:rStyle w:val="NormalTok"/>
+        </w:rPr>
+        <w:t xml:space="preserve">,</w:t>
+      </w:r>
+      <w:r>
+        <w:br/>
+      </w:r>
+      <w:r>
+        <w:rPr>
+          <w:rStyle w:val="NormalTok"/>
+        </w:rPr>
+        <w:t xml:space="preserve">    fecha_prestamo TEXT </w:t>
+      </w:r>
+      <w:r>
+        <w:rPr>
+          <w:rStyle w:val="KeywordTok"/>
+        </w:rPr>
+        <w:t xml:space="preserve">NOT</w:t>
+      </w:r>
+      <w:r>
+        <w:rPr>
+          <w:rStyle w:val="NormalTok"/>
+        </w:rPr>
+        <w:t xml:space="preserve"> </w:t>
+      </w:r>
+      <w:r>
+        <w:rPr>
+          <w:rStyle w:val="KeywordTok"/>
+        </w:rPr>
+        <w:t xml:space="preserve">NULL</w:t>
+      </w:r>
+      <w:r>
+        <w:rPr>
+          <w:rStyle w:val="NormalTok"/>
+        </w:rPr>
+        <w:t xml:space="preserve">,</w:t>
+      </w:r>
+      <w:r>
+        <w:br/>
+      </w:r>
+      <w:r>
+        <w:rPr>
+          <w:rStyle w:val="NormalTok"/>
+        </w:rPr>
+        <w:t xml:space="preserve">    fecha_devolucion TEXT,</w:t>
+      </w:r>
+      <w:r>
+        <w:br/>
+      </w:r>
+      <w:r>
+        <w:rPr>
+          <w:rStyle w:val="NormalTok"/>
+        </w:rPr>
+        <w:t xml:space="preserve">    </w:t>
+      </w:r>
+      <w:r>
+        <w:rPr>
+          <w:rStyle w:val="KeywordTok"/>
+        </w:rPr>
+        <w:t xml:space="preserve">FOREIGN</w:t>
+      </w:r>
+      <w:r>
+        <w:rPr>
+          <w:rStyle w:val="NormalTok"/>
+        </w:rPr>
+        <w:t xml:space="preserve"> </w:t>
+      </w:r>
+      <w:r>
+        <w:rPr>
+          <w:rStyle w:val="KeywordTok"/>
+        </w:rPr>
+        <w:t xml:space="preserve">KEY</w:t>
+      </w:r>
+      <w:r>
+        <w:rPr>
+          <w:rStyle w:val="NormalTok"/>
+        </w:rPr>
+        <w:t xml:space="preserve"> (cedula_socio) </w:t>
+      </w:r>
+      <w:r>
+        <w:rPr>
+          <w:rStyle w:val="KeywordTok"/>
+        </w:rPr>
+        <w:t xml:space="preserve">REFERENCES</w:t>
+      </w:r>
+      <w:r>
+        <w:rPr>
+          <w:rStyle w:val="NormalTok"/>
+        </w:rPr>
+        <w:t xml:space="preserve"> socios(cedula),</w:t>
+      </w:r>
+      <w:r>
+        <w:br/>
+      </w:r>
+      <w:r>
+        <w:rPr>
+          <w:rStyle w:val="NormalTok"/>
+        </w:rPr>
+        <w:t xml:space="preserve">    </w:t>
+      </w:r>
+      <w:r>
+        <w:rPr>
+          <w:rStyle w:val="KeywordTok"/>
+        </w:rPr>
+        <w:t xml:space="preserve">FOREIGN</w:t>
+      </w:r>
+      <w:r>
+        <w:rPr>
+          <w:rStyle w:val="NormalTok"/>
+        </w:rPr>
+        <w:t xml:space="preserve"> </w:t>
+      </w:r>
+      <w:r>
+        <w:rPr>
+          <w:rStyle w:val="KeywordTok"/>
+        </w:rPr>
+        <w:t xml:space="preserve">KEY</w:t>
+      </w:r>
+      <w:r>
+        <w:rPr>
+          <w:rStyle w:val="NormalTok"/>
+        </w:rPr>
+        <w:t xml:space="preserve"> (isbn_libro) </w:t>
+      </w:r>
+      <w:r>
+        <w:rPr>
+          <w:rStyle w:val="KeywordTok"/>
+        </w:rPr>
+        <w:t xml:space="preserve">REFERENCES</w:t>
+      </w:r>
+      <w:r>
+        <w:rPr>
+          <w:rStyle w:val="NormalTok"/>
+        </w:rPr>
+        <w:t xml:space="preserve"> libros(isbn)</w:t>
+      </w:r>
+      <w:r>
+        <w:br/>
+      </w:r>
+      <w:r>
+        <w:rPr>
+          <w:rStyle w:val="NormalTok"/>
+        </w:rPr>
+        <w:t xml:space="preserve">);</w:t>
+      </w:r>
+      <w:r>
+        <w:br/>
+      </w:r>
+      <w:r>
+        <w:br/>
+      </w:r>
+      <w:r>
+        <w:rPr>
+          <w:rStyle w:val="KeywordTok"/>
+        </w:rPr>
+        <w:t xml:space="preserve">CREATE</w:t>
+      </w:r>
+      <w:r>
+        <w:rPr>
+          <w:rStyle w:val="NormalTok"/>
+        </w:rPr>
+        <w:t xml:space="preserve"> </w:t>
+      </w:r>
+      <w:r>
+        <w:rPr>
+          <w:rStyle w:val="KeywordTok"/>
+        </w:rPr>
+        <w:t xml:space="preserve">TABLE</w:t>
+      </w:r>
+      <w:r>
+        <w:rPr>
+          <w:rStyle w:val="NormalTok"/>
+        </w:rPr>
+        <w:t xml:space="preserve"> </w:t>
+      </w:r>
+      <w:r>
+        <w:rPr>
+          <w:rStyle w:val="ControlFlowTok"/>
+        </w:rPr>
+        <w:t xml:space="preserve">IF</w:t>
+      </w:r>
+      <w:r>
+        <w:rPr>
+          <w:rStyle w:val="NormalTok"/>
+        </w:rPr>
+        <w:t xml:space="preserve"> </w:t>
+      </w:r>
+      <w:r>
+        <w:rPr>
+          <w:rStyle w:val="KeywordTok"/>
+        </w:rPr>
+        <w:t xml:space="preserve">NOT</w:t>
+      </w:r>
+      <w:r>
+        <w:rPr>
+          <w:rStyle w:val="NormalTok"/>
+        </w:rPr>
+        <w:t xml:space="preserve"> </w:t>
+      </w:r>
+      <w:r>
+        <w:rPr>
+          <w:rStyle w:val="KeywordTok"/>
+        </w:rPr>
+        <w:t xml:space="preserve">EXISTS</w:t>
+      </w:r>
+      <w:r>
+        <w:rPr>
+          <w:rStyle w:val="NormalTok"/>
+        </w:rPr>
+        <w:t xml:space="preserve"> reservas (</w:t>
+      </w:r>
+      <w:r>
+        <w:br/>
+      </w:r>
+      <w:r>
+        <w:rPr>
+          <w:rStyle w:val="NormalTok"/>
+        </w:rPr>
+        <w:t xml:space="preserve">    </w:t>
+      </w:r>
+      <w:r>
+        <w:rPr>
+          <w:rStyle w:val="KeywordTok"/>
+        </w:rPr>
+        <w:t xml:space="preserve">id</w:t>
+      </w:r>
+      <w:r>
+        <w:rPr>
+          <w:rStyle w:val="NormalTok"/>
+        </w:rPr>
+        <w:t xml:space="preserve"> </w:t>
+      </w:r>
+      <w:r>
+        <w:rPr>
+          <w:rStyle w:val="DataTypeTok"/>
+        </w:rPr>
+        <w:t xml:space="preserve">INTEGER</w:t>
+      </w:r>
+      <w:r>
+        <w:rPr>
+          <w:rStyle w:val="NormalTok"/>
+        </w:rPr>
+        <w:t xml:space="preserve"> </w:t>
+      </w:r>
+      <w:r>
+        <w:rPr>
+          <w:rStyle w:val="KeywordTok"/>
+        </w:rPr>
+        <w:t xml:space="preserve">PRIMARY</w:t>
+      </w:r>
+      <w:r>
+        <w:rPr>
+          <w:rStyle w:val="NormalTok"/>
+        </w:rPr>
+        <w:t xml:space="preserve"> </w:t>
+      </w:r>
+      <w:r>
+        <w:rPr>
+          <w:rStyle w:val="KeywordTok"/>
+        </w:rPr>
+        <w:t xml:space="preserve">KEY</w:t>
+      </w:r>
+      <w:r>
+        <w:rPr>
+          <w:rStyle w:val="NormalTok"/>
+        </w:rPr>
+        <w:t xml:space="preserve"> AUTOINCREMENT,</w:t>
+      </w:r>
+      <w:r>
+        <w:br/>
+      </w:r>
+      <w:r>
+        <w:rPr>
+          <w:rStyle w:val="NormalTok"/>
+        </w:rPr>
+        <w:t xml:space="preserve">    cedula_socio TEXT </w:t>
+      </w:r>
+      <w:r>
+        <w:rPr>
+          <w:rStyle w:val="KeywordTok"/>
+        </w:rPr>
+        <w:t xml:space="preserve">NOT</w:t>
+      </w:r>
+      <w:r>
+        <w:rPr>
+          <w:rStyle w:val="NormalTok"/>
+        </w:rPr>
+        <w:t xml:space="preserve"> </w:t>
+      </w:r>
+      <w:r>
+        <w:rPr>
+          <w:rStyle w:val="KeywordTok"/>
+        </w:rPr>
+        <w:t xml:space="preserve">NULL</w:t>
+      </w:r>
+      <w:r>
+        <w:rPr>
+          <w:rStyle w:val="NormalTok"/>
+        </w:rPr>
+        <w:t xml:space="preserve">,</w:t>
+      </w:r>
+      <w:r>
+        <w:br/>
+      </w:r>
+      <w:r>
+        <w:rPr>
+          <w:rStyle w:val="NormalTok"/>
+        </w:rPr>
+        <w:t xml:space="preserve">    isbn_libro TEXT </w:t>
+      </w:r>
+      <w:r>
+        <w:rPr>
+          <w:rStyle w:val="KeywordTok"/>
+        </w:rPr>
+        <w:t xml:space="preserve">NOT</w:t>
+      </w:r>
+      <w:r>
+        <w:rPr>
+          <w:rStyle w:val="NormalTok"/>
+        </w:rPr>
+        <w:t xml:space="preserve"> </w:t>
+      </w:r>
+      <w:r>
+        <w:rPr>
+          <w:rStyle w:val="KeywordTok"/>
+        </w:rPr>
+        <w:t xml:space="preserve">NULL</w:t>
+      </w:r>
+      <w:r>
+        <w:rPr>
+          <w:rStyle w:val="NormalTok"/>
+        </w:rPr>
+        <w:t xml:space="preserve">,</w:t>
+      </w:r>
+      <w:r>
+        <w:br/>
+      </w:r>
+      <w:r>
+        <w:rPr>
+          <w:rStyle w:val="NormalTok"/>
+        </w:rPr>
+        <w:t xml:space="preserve">    fecha_reserva TEXT </w:t>
+      </w:r>
+      <w:r>
+        <w:rPr>
+          <w:rStyle w:val="KeywordTok"/>
+        </w:rPr>
+        <w:t xml:space="preserve">NOT</w:t>
+      </w:r>
+      <w:r>
+        <w:rPr>
+          <w:rStyle w:val="NormalTok"/>
+        </w:rPr>
+        <w:t xml:space="preserve"> </w:t>
+      </w:r>
+      <w:r>
+        <w:rPr>
+          <w:rStyle w:val="KeywordTok"/>
+        </w:rPr>
+        <w:t xml:space="preserve">NULL</w:t>
+      </w:r>
+      <w:r>
+        <w:rPr>
+          <w:rStyle w:val="NormalTok"/>
+        </w:rPr>
+        <w:t xml:space="preserve">,</w:t>
+      </w:r>
+      <w:r>
+        <w:br/>
+      </w:r>
+      <w:r>
+        <w:rPr>
+          <w:rStyle w:val="NormalTok"/>
+        </w:rPr>
+        <w:t xml:space="preserve">    activa </w:t>
+      </w:r>
+      <w:r>
+        <w:rPr>
+          <w:rStyle w:val="DataTypeTok"/>
+        </w:rPr>
+        <w:t xml:space="preserve">INTEGER</w:t>
+      </w:r>
+      <w:r>
+        <w:rPr>
+          <w:rStyle w:val="NormalTok"/>
+        </w:rPr>
+        <w:t xml:space="preserve"> </w:t>
+      </w:r>
+      <w:r>
+        <w:rPr>
+          <w:rStyle w:val="KeywordTok"/>
+        </w:rPr>
+        <w:t xml:space="preserve">DEFAULT</w:t>
+      </w:r>
+      <w:r>
+        <w:rPr>
+          <w:rStyle w:val="NormalTok"/>
+        </w:rPr>
+        <w:t xml:space="preserve"> </w:t>
+      </w:r>
+      <w:r>
+        <w:rPr>
+          <w:rStyle w:val="DecValTok"/>
+        </w:rPr>
+        <w:t xml:space="preserve">1</w:t>
+      </w:r>
+      <w:r>
+        <w:rPr>
+          <w:rStyle w:val="NormalTok"/>
+        </w:rPr>
+        <w:t xml:space="preserve">,</w:t>
+      </w:r>
+      <w:r>
+        <w:br/>
+      </w:r>
+      <w:r>
+        <w:rPr>
+          <w:rStyle w:val="NormalTok"/>
+        </w:rPr>
+        <w:t xml:space="preserve">    </w:t>
+      </w:r>
+      <w:r>
+        <w:rPr>
+          <w:rStyle w:val="KeywordTok"/>
+        </w:rPr>
+        <w:t xml:space="preserve">FOREIGN</w:t>
+      </w:r>
+      <w:r>
+        <w:rPr>
+          <w:rStyle w:val="NormalTok"/>
+        </w:rPr>
+        <w:t xml:space="preserve"> </w:t>
+      </w:r>
+      <w:r>
+        <w:rPr>
+          <w:rStyle w:val="KeywordTok"/>
+        </w:rPr>
+        <w:t xml:space="preserve">KEY</w:t>
+      </w:r>
+      <w:r>
+        <w:rPr>
+          <w:rStyle w:val="NormalTok"/>
+        </w:rPr>
+        <w:t xml:space="preserve"> (cedula_socio) </w:t>
+      </w:r>
+      <w:r>
+        <w:rPr>
+          <w:rStyle w:val="KeywordTok"/>
+        </w:rPr>
+        <w:t xml:space="preserve">REFERENCES</w:t>
+      </w:r>
+      <w:r>
+        <w:rPr>
+          <w:rStyle w:val="NormalTok"/>
+        </w:rPr>
+        <w:t xml:space="preserve"> socios(cedula),</w:t>
+      </w:r>
+      <w:r>
+        <w:br/>
+      </w:r>
+      <w:r>
+        <w:rPr>
+          <w:rStyle w:val="NormalTok"/>
+        </w:rPr>
+        <w:t xml:space="preserve">    </w:t>
+      </w:r>
+      <w:r>
+        <w:rPr>
+          <w:rStyle w:val="KeywordTok"/>
+        </w:rPr>
+        <w:t xml:space="preserve">FOREIGN</w:t>
+      </w:r>
+      <w:r>
+        <w:rPr>
+          <w:rStyle w:val="NormalTok"/>
+        </w:rPr>
+        <w:t xml:space="preserve"> </w:t>
+      </w:r>
+      <w:r>
+        <w:rPr>
+          <w:rStyle w:val="KeywordTok"/>
+        </w:rPr>
+        <w:t xml:space="preserve">KEY</w:t>
+      </w:r>
+      <w:r>
+        <w:rPr>
+          <w:rStyle w:val="NormalTok"/>
+        </w:rPr>
+        <w:t xml:space="preserve"> (isbn_libro) </w:t>
+      </w:r>
+      <w:r>
+        <w:rPr>
+          <w:rStyle w:val="KeywordTok"/>
+        </w:rPr>
+        <w:t xml:space="preserve">REFERENCES</w:t>
+      </w:r>
+      <w:r>
+        <w:rPr>
+          <w:rStyle w:val="NormalTok"/>
+        </w:rPr>
+        <w:t xml:space="preserve"> libros(isbn)</w:t>
+      </w:r>
+      <w:r>
+        <w:br/>
+      </w:r>
+      <w:r>
+        <w:rPr>
+          <w:rStyle w:val="NormalTok"/>
+        </w:rPr>
+        <w:t xml:space="preserve">);</w:t>
+      </w:r>
+    </w:p>
+    <w:bookmarkEnd w:id="68"/>
+    <w:bookmarkStart w:id="70" w:name="administración-con-db-browser-for-sqlite"/>
+    <w:p>
+      <w:pPr>
+        <w:pStyle w:val="Heading3"/>
+      </w:pPr>
+      <w:r>
+        <w:t xml:space="preserve">12.3 Administración con DB Browser for SQLite</w:t>
+      </w:r>
+    </w:p>
+    <w:p>
+      <w:pPr>
+        <w:pStyle w:val="FirstParagraph"/>
+      </w:pPr>
+      <w:r>
+        <w:t xml:space="preserve">El archivo</w:t>
+      </w:r>
+      <w:r>
+        <w:t xml:space="preserve"> </w:t>
+      </w:r>
+      <w:r>
+        <w:rPr>
+          <w:rStyle w:val="VerbatimChar"/>
+        </w:rPr>
+        <w:t xml:space="preserve">db/biblioteca.db</w:t>
+      </w:r>
+      <w:r>
+        <w:t xml:space="preserve"> </w:t>
+      </w:r>
+      <w:r>
+        <w:t xml:space="preserve">se crea automáticamente al ejecutar</w:t>
+      </w:r>
+      <w:r>
+        <w:t xml:space="preserve"> </w:t>
+      </w:r>
+      <w:r>
+        <w:rPr>
+          <w:rStyle w:val="VerbatimChar"/>
+        </w:rPr>
+        <w:t xml:space="preserve">seed.py</w:t>
+      </w:r>
+      <w:r>
+        <w:t xml:space="preserve">. Para administrarlo visualmente:</w:t>
+      </w:r>
+    </w:p>
+    <w:p>
+      <w:pPr>
+        <w:pStyle w:val="Compact"/>
+        <w:numPr>
+          <w:ilvl w:val="0"/>
+          <w:numId w:val="1013"/>
+        </w:numPr>
+      </w:pPr>
+      <w:r>
+        <w:t xml:space="preserve">Descargar e instalar</w:t>
+      </w:r>
+      <w:r>
+        <w:t xml:space="preserve"> </w:t>
+      </w:r>
+      <w:hyperlink r:id="rId69">
+        <w:r>
+          <w:rPr>
+            <w:rStyle w:val="Hyperlink"/>
+          </w:rPr>
+          <w:t xml:space="preserve">DB Browser for SQLite</w:t>
+        </w:r>
+      </w:hyperlink>
+    </w:p>
+    <w:p>
+      <w:pPr>
+        <w:pStyle w:val="Compact"/>
+        <w:numPr>
+          <w:ilvl w:val="0"/>
+          <w:numId w:val="1013"/>
+        </w:numPr>
+      </w:pPr>
+      <w:r>
+        <w:t xml:space="preserve">Abrir el programa y hacer clic en</w:t>
+      </w:r>
+      <w:r>
+        <w:t xml:space="preserve"> </w:t>
+      </w:r>
+      <w:r>
+        <w:rPr>
+          <w:b/>
+          <w:bCs/>
+        </w:rPr>
+        <w:t xml:space="preserve">“</w:t>
+      </w:r>
+      <w:r>
+        <w:rPr>
+          <w:b/>
+          <w:bCs/>
+        </w:rPr>
+        <w:t xml:space="preserve">Abrir base de datos</w:t>
+      </w:r>
+      <w:r>
+        <w:rPr>
+          <w:b/>
+          <w:bCs/>
+        </w:rPr>
+        <w:t xml:space="preserve">”</w:t>
+      </w:r>
+    </w:p>
+    <w:p>
+      <w:pPr>
+        <w:pStyle w:val="Compact"/>
+        <w:numPr>
+          <w:ilvl w:val="0"/>
+          <w:numId w:val="1013"/>
+        </w:numPr>
+      </w:pPr>
+      <w:r>
+        <w:t xml:space="preserve">Seleccionar</w:t>
+      </w:r>
+      <w:r>
+        <w:t xml:space="preserve"> </w:t>
+      </w:r>
+      <w:r>
+        <w:rPr>
+          <w:rStyle w:val="VerbatimChar"/>
+        </w:rPr>
+        <w:t xml:space="preserve">db/biblioteca.db</w:t>
+      </w:r>
+      <w:r>
+        <w:t xml:space="preserve"> </w:t>
+      </w:r>
+      <w:r>
+        <w:t xml:space="preserve">desde la carpeta del proyecto</w:t>
+      </w:r>
+    </w:p>
+    <w:p>
+      <w:pPr>
+        <w:pStyle w:val="Compact"/>
+        <w:numPr>
+          <w:ilvl w:val="0"/>
+          <w:numId w:val="1013"/>
+        </w:numPr>
+      </w:pPr>
+      <w:r>
+        <w:t xml:space="preserve">Navegar por las pestañas:</w:t>
+      </w:r>
+    </w:p>
+    <w:p>
+      <w:pPr>
+        <w:pStyle w:val="Compact"/>
+        <w:numPr>
+          <w:ilvl w:val="1"/>
+          <w:numId w:val="1014"/>
+        </w:numPr>
+      </w:pPr>
+      <w:r>
+        <w:rPr>
+          <w:b/>
+          <w:bCs/>
+        </w:rPr>
+        <w:t xml:space="preserve">“</w:t>
+      </w:r>
+      <w:r>
+        <w:rPr>
+          <w:b/>
+          <w:bCs/>
+        </w:rPr>
+        <w:t xml:space="preserve">Estructura de la BD</w:t>
+      </w:r>
+      <w:r>
+        <w:rPr>
+          <w:b/>
+          <w:bCs/>
+        </w:rPr>
+        <w:t xml:space="preserve">”</w:t>
+      </w:r>
+      <w:r>
+        <w:t xml:space="preserve"> </w:t>
+      </w:r>
+      <w:r>
+        <w:t xml:space="preserve">— ver las 4 tablas, columnas, tipos e índices</w:t>
+      </w:r>
+    </w:p>
+    <w:p>
+      <w:pPr>
+        <w:pStyle w:val="Compact"/>
+        <w:numPr>
+          <w:ilvl w:val="1"/>
+          <w:numId w:val="1014"/>
+        </w:numPr>
+      </w:pPr>
+      <w:r>
+        <w:rPr>
+          <w:b/>
+          <w:bCs/>
+        </w:rPr>
+        <w:t xml:space="preserve">“</w:t>
+      </w:r>
+      <w:r>
+        <w:rPr>
+          <w:b/>
+          <w:bCs/>
+        </w:rPr>
+        <w:t xml:space="preserve">Datos</w:t>
+      </w:r>
+      <w:r>
+        <w:rPr>
+          <w:b/>
+          <w:bCs/>
+        </w:rPr>
+        <w:t xml:space="preserve">”</w:t>
+      </w:r>
+      <w:r>
+        <w:t xml:space="preserve"> </w:t>
+      </w:r>
+      <w:r>
+        <w:t xml:space="preserve">— ver y editar registros de cada tabla</w:t>
+      </w:r>
+    </w:p>
+    <w:p>
+      <w:pPr>
+        <w:pStyle w:val="Compact"/>
+        <w:numPr>
+          <w:ilvl w:val="1"/>
+          <w:numId w:val="1014"/>
+        </w:numPr>
+      </w:pPr>
+      <w:r>
+        <w:rPr>
+          <w:b/>
+          <w:bCs/>
+        </w:rPr>
+        <w:t xml:space="preserve">“</w:t>
+      </w:r>
+      <w:r>
+        <w:rPr>
+          <w:b/>
+          <w:bCs/>
+        </w:rPr>
+        <w:t xml:space="preserve">Ejecutar SQL</w:t>
+      </w:r>
+      <w:r>
+        <w:rPr>
+          <w:b/>
+          <w:bCs/>
+        </w:rPr>
+        <w:t xml:space="preserve">”</w:t>
+      </w:r>
+      <w:r>
+        <w:t xml:space="preserve"> </w:t>
+      </w:r>
+      <w:r>
+        <w:t xml:space="preserve">— ejecutar consultas personalizadas</w:t>
+      </w:r>
+    </w:p>
+    <w:p>
+      <w:pPr>
+        <w:pStyle w:val="BlockText"/>
+      </w:pPr>
+      <w:r>
+        <w:rPr>
+          <w:b/>
+          <w:bCs/>
+        </w:rPr>
+        <w:t xml:space="preserve">Importante:</w:t>
+      </w:r>
+      <w:r>
+        <w:t xml:space="preserve"> </w:t>
+      </w:r>
+      <w:r>
+        <w:t xml:space="preserve">Durante la defensa, el docente puede pedir que se muestre la base de datos en DB Browser. Se recomienda tenerlo instalado y saber navegar las tablas, mostrar relaciones y ejecutar consultas SELECT básicas.</w:t>
+      </w:r>
+    </w:p>
+    <w:bookmarkEnd w:id="70"/>
+    <w:bookmarkStart w:id="71" w:name="consultas-sql-de-ejemplo"/>
+    <w:p>
+      <w:pPr>
+        <w:pStyle w:val="Heading3"/>
+      </w:pPr>
+      <w:r>
+        <w:t xml:space="preserve">12.4 Consultas SQL de ejemplo</w:t>
+      </w:r>
+    </w:p>
+    <w:p>
+      <w:pPr>
+        <w:pStyle w:val="SourceCode"/>
+      </w:pPr>
+      <w:r>
+        <w:rPr>
+          <w:rStyle w:val="CommentTok"/>
+        </w:rPr>
+        <w:t xml:space="preserve">-- Listar todos los préstamos pendientes con datos del socio y libro</w:t>
+      </w:r>
+      <w:r>
+        <w:br/>
+      </w:r>
+      <w:r>
+        <w:rPr>
+          <w:rStyle w:val="KeywordTok"/>
+        </w:rPr>
+        <w:t xml:space="preserve">SELECT</w:t>
+      </w:r>
+      <w:r>
+        <w:rPr>
+          <w:rStyle w:val="NormalTok"/>
+        </w:rPr>
+        <w:t xml:space="preserve"> p.</w:t>
+      </w:r>
+      <w:r>
+        <w:rPr>
+          <w:rStyle w:val="KeywordTok"/>
+        </w:rPr>
+        <w:t xml:space="preserve">id</w:t>
+      </w:r>
+      <w:r>
+        <w:rPr>
+          <w:rStyle w:val="NormalTok"/>
+        </w:rPr>
+        <w:t xml:space="preserve">, s.nombre </w:t>
+      </w:r>
+      <w:r>
+        <w:rPr>
+          <w:rStyle w:val="OperatorTok"/>
+        </w:rPr>
+        <w:t xml:space="preserve">||</w:t>
+      </w:r>
+      <w:r>
+        <w:rPr>
+          <w:rStyle w:val="NormalTok"/>
+        </w:rPr>
+        <w:t xml:space="preserve"> </w:t>
+      </w:r>
+      <w:r>
+        <w:rPr>
+          <w:rStyle w:val="StringTok"/>
+        </w:rPr>
+        <w:t xml:space="preserve">' '</w:t>
+      </w:r>
+      <w:r>
+        <w:rPr>
+          <w:rStyle w:val="NormalTok"/>
+        </w:rPr>
+        <w:t xml:space="preserve"> </w:t>
+      </w:r>
+      <w:r>
+        <w:rPr>
+          <w:rStyle w:val="OperatorTok"/>
+        </w:rPr>
+        <w:t xml:space="preserve">||</w:t>
+      </w:r>
+      <w:r>
+        <w:rPr>
+          <w:rStyle w:val="NormalTok"/>
+        </w:rPr>
+        <w:t xml:space="preserve"> s.apellido </w:t>
+      </w:r>
+      <w:r>
+        <w:rPr>
+          <w:rStyle w:val="KeywordTok"/>
+        </w:rPr>
+        <w:t xml:space="preserve">AS</w:t>
+      </w:r>
+      <w:r>
+        <w:rPr>
+          <w:rStyle w:val="NormalTok"/>
+        </w:rPr>
+        <w:t xml:space="preserve"> socio, l.titulo,</w:t>
+      </w:r>
+      <w:r>
+        <w:br/>
+      </w:r>
+      <w:r>
+        <w:rPr>
+          <w:rStyle w:val="NormalTok"/>
+        </w:rPr>
+        <w:t xml:space="preserve">       p.fecha_prestamo</w:t>
+      </w:r>
+      <w:r>
+        <w:br/>
+      </w:r>
+      <w:r>
+        <w:rPr>
+          <w:rStyle w:val="KeywordTok"/>
+        </w:rPr>
+        <w:t xml:space="preserve">FROM</w:t>
+      </w:r>
+      <w:r>
+        <w:rPr>
+          <w:rStyle w:val="NormalTok"/>
+        </w:rPr>
+        <w:t xml:space="preserve"> prestamos p</w:t>
+      </w:r>
+      <w:r>
+        <w:br/>
+      </w:r>
+      <w:r>
+        <w:rPr>
+          <w:rStyle w:val="KeywordTok"/>
+        </w:rPr>
+        <w:t xml:space="preserve">JOIN</w:t>
+      </w:r>
+      <w:r>
+        <w:rPr>
+          <w:rStyle w:val="NormalTok"/>
+        </w:rPr>
+        <w:t xml:space="preserve"> socios s </w:t>
+      </w:r>
+      <w:r>
+        <w:rPr>
+          <w:rStyle w:val="KeywordTok"/>
+        </w:rPr>
+        <w:t xml:space="preserve">ON</w:t>
+      </w:r>
+      <w:r>
+        <w:rPr>
+          <w:rStyle w:val="NormalTok"/>
+        </w:rPr>
+        <w:t xml:space="preserve"> p.cedula_socio </w:t>
+      </w:r>
+      <w:r>
+        <w:rPr>
+          <w:rStyle w:val="OperatorTok"/>
+        </w:rPr>
+        <w:t xml:space="preserve">=</w:t>
+      </w:r>
+      <w:r>
+        <w:rPr>
+          <w:rStyle w:val="NormalTok"/>
+        </w:rPr>
+        <w:t xml:space="preserve"> s.cedula</w:t>
+      </w:r>
+      <w:r>
+        <w:br/>
+      </w:r>
+      <w:r>
+        <w:rPr>
+          <w:rStyle w:val="KeywordTok"/>
+        </w:rPr>
+        <w:t xml:space="preserve">JOIN</w:t>
+      </w:r>
+      <w:r>
+        <w:rPr>
+          <w:rStyle w:val="NormalTok"/>
+        </w:rPr>
+        <w:t xml:space="preserve"> libros l </w:t>
+      </w:r>
+      <w:r>
+        <w:rPr>
+          <w:rStyle w:val="KeywordTok"/>
+        </w:rPr>
+        <w:t xml:space="preserve">ON</w:t>
+      </w:r>
+      <w:r>
+        <w:rPr>
+          <w:rStyle w:val="NormalTok"/>
+        </w:rPr>
+        <w:t xml:space="preserve"> p.isbn_libro </w:t>
+      </w:r>
+      <w:r>
+        <w:rPr>
+          <w:rStyle w:val="OperatorTok"/>
+        </w:rPr>
+        <w:t xml:space="preserve">=</w:t>
+      </w:r>
+      <w:r>
+        <w:rPr>
+          <w:rStyle w:val="NormalTok"/>
+        </w:rPr>
+        <w:t xml:space="preserve"> l.isbn</w:t>
+      </w:r>
+      <w:r>
+        <w:br/>
+      </w:r>
+      <w:r>
+        <w:rPr>
+          <w:rStyle w:val="KeywordTok"/>
+        </w:rPr>
+        <w:t xml:space="preserve">WHERE</w:t>
+      </w:r>
+      <w:r>
+        <w:rPr>
+          <w:rStyle w:val="NormalTok"/>
+        </w:rPr>
+        <w:t xml:space="preserve"> p.fecha_devolucion </w:t>
+      </w:r>
+      <w:r>
+        <w:rPr>
+          <w:rStyle w:val="KeywordTok"/>
+        </w:rPr>
+        <w:t xml:space="preserve">IS</w:t>
+      </w:r>
+      <w:r>
+        <w:rPr>
+          <w:rStyle w:val="NormalTok"/>
+        </w:rPr>
+        <w:t xml:space="preserve"> </w:t>
+      </w:r>
+      <w:r>
+        <w:rPr>
+          <w:rStyle w:val="KeywordTok"/>
+        </w:rPr>
+        <w:t xml:space="preserve">NULL</w:t>
+      </w:r>
+      <w:r>
+        <w:rPr>
+          <w:rStyle w:val="NormalTok"/>
+        </w:rPr>
+        <w:t xml:space="preserve">;</w:t>
+      </w:r>
+      <w:r>
+        <w:br/>
+      </w:r>
+      <w:r>
+        <w:br/>
+      </w:r>
+      <w:r>
+        <w:rPr>
+          <w:rStyle w:val="CommentTok"/>
+        </w:rPr>
+        <w:t xml:space="preserve">-- Contar cuántos libros prestados tiene cada socio</w:t>
+      </w:r>
+      <w:r>
+        <w:br/>
+      </w:r>
+      <w:r>
+        <w:rPr>
+          <w:rStyle w:val="KeywordTok"/>
+        </w:rPr>
+        <w:t xml:space="preserve">SELECT</w:t>
+      </w:r>
+      <w:r>
+        <w:rPr>
+          <w:rStyle w:val="NormalTok"/>
+        </w:rPr>
+        <w:t xml:space="preserve"> s.cedula, s.nombre, s.apellido, </w:t>
+      </w:r>
+      <w:r>
+        <w:rPr>
+          <w:rStyle w:val="FunctionTok"/>
+        </w:rPr>
+        <w:t xml:space="preserve">COUNT</w:t>
+      </w:r>
+      <w:r>
+        <w:rPr>
+          <w:rStyle w:val="NormalTok"/>
+        </w:rPr>
+        <w:t xml:space="preserve">(p.</w:t>
+      </w:r>
+      <w:r>
+        <w:rPr>
+          <w:rStyle w:val="KeywordTok"/>
+        </w:rPr>
+        <w:t xml:space="preserve">id</w:t>
+      </w:r>
+      <w:r>
+        <w:rPr>
+          <w:rStyle w:val="NormalTok"/>
+        </w:rPr>
+        <w:t xml:space="preserve">) </w:t>
+      </w:r>
+      <w:r>
+        <w:rPr>
+          <w:rStyle w:val="KeywordTok"/>
+        </w:rPr>
+        <w:t xml:space="preserve">AS</w:t>
+      </w:r>
+      <w:r>
+        <w:rPr>
+          <w:rStyle w:val="NormalTok"/>
+        </w:rPr>
+        <w:t xml:space="preserve"> prestamos_activos</w:t>
+      </w:r>
+      <w:r>
+        <w:br/>
+      </w:r>
+      <w:r>
+        <w:rPr>
+          <w:rStyle w:val="KeywordTok"/>
+        </w:rPr>
+        <w:t xml:space="preserve">FROM</w:t>
+      </w:r>
+      <w:r>
+        <w:rPr>
+          <w:rStyle w:val="NormalTok"/>
+        </w:rPr>
+        <w:t xml:space="preserve"> socios s</w:t>
+      </w:r>
+      <w:r>
+        <w:br/>
+      </w:r>
+      <w:r>
+        <w:rPr>
+          <w:rStyle w:val="KeywordTok"/>
+        </w:rPr>
+        <w:t xml:space="preserve">LEFT</w:t>
+      </w:r>
+      <w:r>
+        <w:rPr>
+          <w:rStyle w:val="NormalTok"/>
+        </w:rPr>
+        <w:t xml:space="preserve"> </w:t>
+      </w:r>
+      <w:r>
+        <w:rPr>
+          <w:rStyle w:val="KeywordTok"/>
+        </w:rPr>
+        <w:t xml:space="preserve">JOIN</w:t>
+      </w:r>
+      <w:r>
+        <w:rPr>
+          <w:rStyle w:val="NormalTok"/>
+        </w:rPr>
+        <w:t xml:space="preserve"> prestamos p </w:t>
+      </w:r>
+      <w:r>
+        <w:rPr>
+          <w:rStyle w:val="KeywordTok"/>
+        </w:rPr>
+        <w:t xml:space="preserve">ON</w:t>
+      </w:r>
+      <w:r>
+        <w:rPr>
+          <w:rStyle w:val="NormalTok"/>
+        </w:rPr>
+        <w:t xml:space="preserve"> s.cedula </w:t>
+      </w:r>
+      <w:r>
+        <w:rPr>
+          <w:rStyle w:val="OperatorTok"/>
+        </w:rPr>
+        <w:t xml:space="preserve">=</w:t>
+      </w:r>
+      <w:r>
+        <w:rPr>
+          <w:rStyle w:val="NormalTok"/>
+        </w:rPr>
+        <w:t xml:space="preserve"> p.cedula_socio </w:t>
+      </w:r>
+      <w:r>
+        <w:rPr>
+          <w:rStyle w:val="KeywordTok"/>
+        </w:rPr>
+        <w:t xml:space="preserve">AND</w:t>
+      </w:r>
+      <w:r>
+        <w:rPr>
+          <w:rStyle w:val="NormalTok"/>
+        </w:rPr>
+        <w:t xml:space="preserve"> p.fecha_devolucion </w:t>
+      </w:r>
+      <w:r>
+        <w:rPr>
+          <w:rStyle w:val="KeywordTok"/>
+        </w:rPr>
+        <w:t xml:space="preserve">IS</w:t>
+      </w:r>
+      <w:r>
+        <w:rPr>
+          <w:rStyle w:val="NormalTok"/>
+        </w:rPr>
+        <w:t xml:space="preserve"> </w:t>
+      </w:r>
+      <w:r>
+        <w:rPr>
+          <w:rStyle w:val="KeywordTok"/>
+        </w:rPr>
+        <w:t xml:space="preserve">NULL</w:t>
+      </w:r>
+      <w:r>
+        <w:br/>
+      </w:r>
+      <w:r>
+        <w:rPr>
+          <w:rStyle w:val="KeywordTok"/>
+        </w:rPr>
+        <w:t xml:space="preserve">GROUP</w:t>
+      </w:r>
+      <w:r>
+        <w:rPr>
+          <w:rStyle w:val="NormalTok"/>
+        </w:rPr>
+        <w:t xml:space="preserve"> </w:t>
+      </w:r>
+      <w:r>
+        <w:rPr>
+          <w:rStyle w:val="KeywordTok"/>
+        </w:rPr>
+        <w:t xml:space="preserve">BY</w:t>
+      </w:r>
+      <w:r>
+        <w:rPr>
+          <w:rStyle w:val="NormalTok"/>
+        </w:rPr>
+        <w:t xml:space="preserve"> s.cedula;</w:t>
+      </w:r>
+      <w:r>
+        <w:br/>
+      </w:r>
+      <w:r>
+        <w:br/>
+      </w:r>
+      <w:r>
+        <w:rPr>
+          <w:rStyle w:val="CommentTok"/>
+        </w:rPr>
+        <w:t xml:space="preserve">-- Libros más reservados (cola de espera)</w:t>
+      </w:r>
+      <w:r>
+        <w:br/>
+      </w:r>
+      <w:r>
+        <w:rPr>
+          <w:rStyle w:val="KeywordTok"/>
+        </w:rPr>
+        <w:t xml:space="preserve">SELECT</w:t>
+      </w:r>
+      <w:r>
+        <w:rPr>
+          <w:rStyle w:val="NormalTok"/>
+        </w:rPr>
+        <w:t xml:space="preserve"> l.isbn, l.titulo, </w:t>
+      </w:r>
+      <w:r>
+        <w:rPr>
+          <w:rStyle w:val="FunctionTok"/>
+        </w:rPr>
+        <w:t xml:space="preserve">COUNT</w:t>
+      </w:r>
+      <w:r>
+        <w:rPr>
+          <w:rStyle w:val="NormalTok"/>
+        </w:rPr>
+        <w:t xml:space="preserve">(r.</w:t>
+      </w:r>
+      <w:r>
+        <w:rPr>
+          <w:rStyle w:val="KeywordTok"/>
+        </w:rPr>
+        <w:t xml:space="preserve">id</w:t>
+      </w:r>
+      <w:r>
+        <w:rPr>
+          <w:rStyle w:val="NormalTok"/>
+        </w:rPr>
+        <w:t xml:space="preserve">) </w:t>
+      </w:r>
+      <w:r>
+        <w:rPr>
+          <w:rStyle w:val="KeywordTok"/>
+        </w:rPr>
+        <w:t xml:space="preserve">AS</w:t>
+      </w:r>
+      <w:r>
+        <w:rPr>
+          <w:rStyle w:val="NormalTok"/>
+        </w:rPr>
+        <w:t xml:space="preserve"> reservas_activas</w:t>
+      </w:r>
+      <w:r>
+        <w:br/>
+      </w:r>
+      <w:r>
+        <w:rPr>
+          <w:rStyle w:val="KeywordTok"/>
+        </w:rPr>
+        <w:t xml:space="preserve">FROM</w:t>
+      </w:r>
+      <w:r>
+        <w:rPr>
+          <w:rStyle w:val="NormalTok"/>
+        </w:rPr>
+        <w:t xml:space="preserve"> libros l</w:t>
+      </w:r>
+      <w:r>
+        <w:br/>
+      </w:r>
+      <w:r>
+        <w:rPr>
+          <w:rStyle w:val="KeywordTok"/>
+        </w:rPr>
+        <w:t xml:space="preserve">JOIN</w:t>
+      </w:r>
+      <w:r>
+        <w:rPr>
+          <w:rStyle w:val="NormalTok"/>
+        </w:rPr>
+        <w:t xml:space="preserve"> reservas r </w:t>
+      </w:r>
+      <w:r>
+        <w:rPr>
+          <w:rStyle w:val="KeywordTok"/>
+        </w:rPr>
+        <w:t xml:space="preserve">ON</w:t>
+      </w:r>
+      <w:r>
+        <w:rPr>
+          <w:rStyle w:val="NormalTok"/>
+        </w:rPr>
+        <w:t xml:space="preserve"> l.isbn </w:t>
+      </w:r>
+      <w:r>
+        <w:rPr>
+          <w:rStyle w:val="OperatorTok"/>
+        </w:rPr>
+        <w:t xml:space="preserve">=</w:t>
+      </w:r>
+      <w:r>
+        <w:rPr>
+          <w:rStyle w:val="NormalTok"/>
+        </w:rPr>
+        <w:t xml:space="preserve"> r.isbn_libro</w:t>
+      </w:r>
+      <w:r>
+        <w:br/>
+      </w:r>
+      <w:r>
+        <w:rPr>
+          <w:rStyle w:val="KeywordTok"/>
+        </w:rPr>
+        <w:t xml:space="preserve">WHERE</w:t>
+      </w:r>
+      <w:r>
+        <w:rPr>
+          <w:rStyle w:val="NormalTok"/>
+        </w:rPr>
+        <w:t xml:space="preserve"> r.activa </w:t>
+      </w:r>
+      <w:r>
+        <w:rPr>
+          <w:rStyle w:val="OperatorTok"/>
+        </w:rPr>
+        <w:t xml:space="preserve">=</w:t>
+      </w:r>
+      <w:r>
+        <w:rPr>
+          <w:rStyle w:val="NormalTok"/>
+        </w:rPr>
+        <w:t xml:space="preserve"> </w:t>
+      </w:r>
+      <w:r>
+        <w:rPr>
+          <w:rStyle w:val="DecValTok"/>
+        </w:rPr>
+        <w:t xml:space="preserve">1</w:t>
+      </w:r>
+      <w:r>
+        <w:br/>
+      </w:r>
+      <w:r>
+        <w:rPr>
+          <w:rStyle w:val="KeywordTok"/>
+        </w:rPr>
+        <w:t xml:space="preserve">GROUP</w:t>
+      </w:r>
+      <w:r>
+        <w:rPr>
+          <w:rStyle w:val="NormalTok"/>
+        </w:rPr>
+        <w:t xml:space="preserve"> </w:t>
+      </w:r>
+      <w:r>
+        <w:rPr>
+          <w:rStyle w:val="KeywordTok"/>
+        </w:rPr>
+        <w:t xml:space="preserve">BY</w:t>
+      </w:r>
+      <w:r>
+        <w:rPr>
+          <w:rStyle w:val="NormalTok"/>
+        </w:rPr>
+        <w:t xml:space="preserve"> l.isbn</w:t>
+      </w:r>
+      <w:r>
+        <w:br/>
+      </w:r>
+      <w:r>
+        <w:rPr>
+          <w:rStyle w:val="KeywordTok"/>
+        </w:rPr>
+        <w:t xml:space="preserve">ORDER</w:t>
+      </w:r>
+      <w:r>
+        <w:rPr>
+          <w:rStyle w:val="NormalTok"/>
+        </w:rPr>
+        <w:t xml:space="preserve"> </w:t>
+      </w:r>
+      <w:r>
+        <w:rPr>
+          <w:rStyle w:val="KeywordTok"/>
+        </w:rPr>
+        <w:t xml:space="preserve">BY</w:t>
+      </w:r>
+      <w:r>
+        <w:rPr>
+          <w:rStyle w:val="NormalTok"/>
+        </w:rPr>
+        <w:t xml:space="preserve"> reservas_activas </w:t>
+      </w:r>
+      <w:r>
+        <w:rPr>
+          <w:rStyle w:val="KeywordTok"/>
+        </w:rPr>
+        <w:t xml:space="preserve">DESC</w:t>
+      </w:r>
+      <w:r>
+        <w:rPr>
+          <w:rStyle w:val="NormalTok"/>
+        </w:rPr>
+        <w:t xml:space="preserve">;</w:t>
+      </w:r>
+    </w:p>
+    <w:p>
+      <w:r>
+        <w:pict>
+          <v:rect style="width:0;height:1.5pt" o:hralign="center" o:hrstd="t" o:hr="t"/>
+        </w:pict>
+      </w:r>
+    </w:p>
+    <w:bookmarkEnd w:id="71"/>
+    <w:bookmarkEnd w:id="72"/>
+    <w:bookmarkStart w:id="73" w:name="pruebas-realizadas"/>
+    <w:p>
+      <w:pPr>
+        <w:pStyle w:val="Heading2"/>
+      </w:pPr>
+      <w:r>
+        <w:t xml:space="preserve">13. Pruebas Realizadas</w:t>
       </w:r>
     </w:p>
     <w:p>
@@ -9209,17 +11761,17 @@
         </w:pict>
       </w:r>
     </w:p>
-    <w:bookmarkEnd w:id="67"/>
-    <w:bookmarkStart w:id="70" w:name="conclusiones-y-recomendaciones"/>
+    <w:bookmarkEnd w:id="73"/>
+    <w:bookmarkStart w:id="76" w:name="conclusiones-y-recomendaciones"/>
     <w:p>
       <w:pPr>
         <w:pStyle w:val="Heading2"/>
       </w:pPr>
       <w:r>
-        <w:t xml:space="preserve">13. Conclusiones y Recomendaciones</w:t>
-      </w:r>
-    </w:p>
-    <w:bookmarkStart w:id="68" w:name="conclusiones"/>
+        <w:t xml:space="preserve">14. Conclusiones y Recomendaciones</w:t>
+      </w:r>
+    </w:p>
+    <w:bookmarkStart w:id="74" w:name="conclusiones"/>
     <w:p>
       <w:pPr>
         <w:pStyle w:val="Heading3"/>
@@ -9231,305 +11783,155 @@
     <w:p>
       <w:pPr>
         <w:pStyle w:val="Compact"/>
-        <w:numPr>
-          <w:ilvl w:val="0"/>
-          <w:numId w:val="1013"/>
-        </w:numPr>
-      </w:pPr>
-      <w:r>
-        <w:t xml:space="preserve">Se implementó un sistema de gestión bibliotecaria funcional que cumple con todos los requisitos de la rúbrica de evaluación.</w:t>
-      </w:r>
-    </w:p>
-    <w:p>
-      <w:pPr>
-        <w:pStyle w:val="Compact"/>
-        <w:numPr>
-          <w:ilvl w:val="0"/>
-          <w:numId w:val="1013"/>
-        </w:numPr>
-      </w:pPr>
-      <w:r>
-        <w:t xml:space="preserve">La programación orientada a objetos permitió modelar el dominio (Persona → Estudiante, Docente) con herencia, encapsulamiento y polimorfismo.</w:t>
-      </w:r>
-    </w:p>
-    <w:p>
-      <w:pPr>
-        <w:pStyle w:val="Compact"/>
-        <w:numPr>
-          <w:ilvl w:val="0"/>
-          <w:numId w:val="1013"/>
-        </w:numPr>
-      </w:pPr>
-      <w:r>
-        <w:t xml:space="preserve">Las estructuras de datos (LinkedList, Queue, Stack) se implementaron manualmente, demostrando comprensión de su funcionamiento interno.</w:t>
-      </w:r>
-    </w:p>
-    <w:p>
-      <w:pPr>
-        <w:pStyle w:val="Compact"/>
-        <w:numPr>
-          <w:ilvl w:val="0"/>
-          <w:numId w:val="1013"/>
-        </w:numPr>
-      </w:pPr>
-      <w:r>
-        <w:t xml:space="preserve">Los algoritmos de ordenamiento y búsqueda se implementaron desde cero, con análisis de complejidad Big-O.</w:t>
-      </w:r>
-    </w:p>
-    <w:p>
-      <w:pPr>
-        <w:pStyle w:val="Compact"/>
-        <w:numPr>
-          <w:ilvl w:val="0"/>
-          <w:numId w:val="1013"/>
-        </w:numPr>
-      </w:pPr>
-      <w:r>
-        <w:t xml:space="preserve">SQLite proporcionó una base de datos ligera y embebida con 4 tablas relacionadas mediante claves foráneas.</w:t>
-      </w:r>
-    </w:p>
-    <w:p>
-      <w:pPr>
-        <w:pStyle w:val="Compact"/>
-        <w:numPr>
-          <w:ilvl w:val="0"/>
-          <w:numId w:val="1013"/>
-        </w:numPr>
-      </w:pPr>
-      <w:r>
-        <w:t xml:space="preserve">Tkinter permitió construir una interfaz gráfica funcional conectada a la base de datos con formularios CRUD completos.</w:t>
-      </w:r>
-    </w:p>
-    <w:p>
-      <w:pPr>
-        <w:pStyle w:val="Compact"/>
-        <w:numPr>
-          <w:ilvl w:val="0"/>
-          <w:numId w:val="1013"/>
-        </w:numPr>
-      </w:pPr>
-      <w:r>
-        <w:t xml:space="preserve">El modelo incremental permitió entregar un avance del 50% en la Semana 12 y completar el sistema en la Semana 14.</w:t>
-      </w:r>
-    </w:p>
-    <w:bookmarkEnd w:id="68"/>
-    <w:bookmarkStart w:id="69" w:name="recomendaciones"/>
-    <w:p>
-      <w:pPr>
-        <w:pStyle w:val="Heading3"/>
-      </w:pPr>
-      <w:r>
-        <w:t xml:space="preserve">Recomendaciones</w:t>
-      </w:r>
-    </w:p>
-    <w:p>
-      <w:pPr>
-        <w:pStyle w:val="Compact"/>
-        <w:numPr>
-          <w:ilvl w:val="0"/>
-          <w:numId w:val="1014"/>
-        </w:numPr>
-      </w:pPr>
-      <w:r>
-        <w:t xml:space="preserve">Migrar a una base de datos cliente-servidor (MySQL/PostgreSQL) si la biblioteca crece.</w:t>
-      </w:r>
-    </w:p>
-    <w:p>
-      <w:pPr>
-        <w:pStyle w:val="Compact"/>
-        <w:numPr>
-          <w:ilvl w:val="0"/>
-          <w:numId w:val="1014"/>
-        </w:numPr>
-      </w:pPr>
-      <w:r>
-        <w:t xml:space="preserve">Agregar autenticación de usuarios (bibliotecario/admin) para seguridad.</w:t>
-      </w:r>
-    </w:p>
-    <w:p>
-      <w:pPr>
-        <w:pStyle w:val="Compact"/>
-        <w:numPr>
-          <w:ilvl w:val="0"/>
-          <w:numId w:val="1014"/>
-        </w:numPr>
-      </w:pPr>
-      <w:r>
-        <w:t xml:space="preserve">Implementar búsqueda avanzada con múltiples filtros simultáneos.</w:t>
-      </w:r>
-    </w:p>
-    <w:p>
-      <w:pPr>
-        <w:pStyle w:val="Compact"/>
-        <w:numPr>
-          <w:ilvl w:val="0"/>
-          <w:numId w:val="1014"/>
-        </w:numPr>
-      </w:pPr>
-      <w:r>
-        <w:t xml:space="preserve">Generar reportes estadísticos (libros más prestados, multas, etc.).</w:t>
-      </w:r>
-    </w:p>
-    <w:p>
-      <w:pPr>
-        <w:pStyle w:val="Compact"/>
-        <w:numPr>
-          <w:ilvl w:val="0"/>
-          <w:numId w:val="1014"/>
-        </w:numPr>
-      </w:pPr>
-      <w:r>
-        <w:t xml:space="preserve">Agregar una interfaz web para consultas desde dispositivos móviles.</w:t>
-      </w:r>
-    </w:p>
-    <w:p>
-      <w:r>
-        <w:pict>
-          <v:rect style="width:0;height:1.5pt" o:hralign="center" o:hrstd="t" o:hr="t"/>
-        </w:pict>
-      </w:r>
-    </w:p>
-    <w:bookmarkEnd w:id="69"/>
-    <w:bookmarkEnd w:id="70"/>
-    <w:bookmarkStart w:id="71" w:name="bibliografía-apa-7ª-ed."/>
-    <w:p>
-      <w:pPr>
-        <w:pStyle w:val="Heading2"/>
-      </w:pPr>
-      <w:r>
-        <w:t xml:space="preserve">14. Bibliografía (APA 7ª ed.)</w:t>
-      </w:r>
-    </w:p>
-    <w:p>
-      <w:pPr>
         <w:numPr>
           <w:ilvl w:val="0"/>
           <w:numId w:val="1015"/>
         </w:numPr>
       </w:pPr>
       <w:r>
-        <w:t xml:space="preserve">Grayson, J. E. (2000).</w:t>
-      </w:r>
-      <w:r>
-        <w:t xml:space="preserve"> </w:t>
-      </w:r>
-      <w:r>
-        <w:rPr>
-          <w:i/>
-          <w:iCs/>
-        </w:rPr>
-        <w:t xml:space="preserve">Python and Tkinter programming</w:t>
-      </w:r>
-      <w:r>
-        <w:t xml:space="preserve">. Manning Publications. ISBN: 978-1884779813</w:t>
-      </w:r>
-    </w:p>
-    <w:p>
-      <w:pPr>
+        <w:t xml:space="preserve">Se implementó un sistema de gestión bibliotecaria funcional que cumple con todos los requisitos de la rúbrica de evaluación.</w:t>
+      </w:r>
+    </w:p>
+    <w:p>
+      <w:pPr>
+        <w:pStyle w:val="Compact"/>
         <w:numPr>
           <w:ilvl w:val="0"/>
           <w:numId w:val="1015"/>
         </w:numPr>
       </w:pPr>
       <w:r>
-        <w:t xml:space="preserve">Lutz, M. (2013).</w:t>
-      </w:r>
-      <w:r>
-        <w:t xml:space="preserve"> </w:t>
-      </w:r>
-      <w:r>
-        <w:rPr>
-          <w:i/>
-          <w:iCs/>
-        </w:rPr>
-        <w:t xml:space="preserve">Learning Python</w:t>
-      </w:r>
-      <w:r>
-        <w:t xml:space="preserve"> </w:t>
-      </w:r>
-      <w:r>
-        <w:t xml:space="preserve">(5.ª ed.). O’Reilly Media. ISBN: 978-1449355739</w:t>
-      </w:r>
-    </w:p>
-    <w:p>
-      <w:pPr>
+        <w:t xml:space="preserve">La programación orientada a objetos permitió modelar el dominio (Persona → Estudiante, Docente) con herencia, encapsulamiento y polimorfismo.</w:t>
+      </w:r>
+    </w:p>
+    <w:p>
+      <w:pPr>
+        <w:pStyle w:val="Compact"/>
         <w:numPr>
           <w:ilvl w:val="0"/>
           <w:numId w:val="1015"/>
         </w:numPr>
       </w:pPr>
       <w:r>
-        <w:t xml:space="preserve">Owens, M. y Allen, G. (2010).</w:t>
-      </w:r>
-      <w:r>
-        <w:t xml:space="preserve"> </w:t>
-      </w:r>
-      <w:r>
-        <w:rPr>
-          <w:i/>
-          <w:iCs/>
-        </w:rPr>
-        <w:t xml:space="preserve">SQLite</w:t>
-      </w:r>
-      <w:r>
-        <w:t xml:space="preserve"> </w:t>
-      </w:r>
-      <w:r>
-        <w:t xml:space="preserve">(The Definitive Guide). Apress. ISBN: 978-1430232254</w:t>
-      </w:r>
-    </w:p>
-    <w:p>
-      <w:pPr>
+        <w:t xml:space="preserve">Las estructuras de datos (LinkedList, Queue, Stack) se implementaron manualmente, demostrando comprensión de su funcionamiento interno.</w:t>
+      </w:r>
+    </w:p>
+    <w:p>
+      <w:pPr>
+        <w:pStyle w:val="Compact"/>
         <w:numPr>
           <w:ilvl w:val="0"/>
           <w:numId w:val="1015"/>
         </w:numPr>
       </w:pPr>
       <w:r>
-        <w:t xml:space="preserve">Cormen, T. H., Leiserson, C. E., Rivest, R. L. y Stein, C. (2009).</w:t>
-      </w:r>
-      <w:r>
-        <w:t xml:space="preserve"> </w:t>
-      </w:r>
-      <w:r>
-        <w:rPr>
-          <w:i/>
-          <w:iCs/>
-        </w:rPr>
-        <w:t xml:space="preserve">Introduction to Algorithms</w:t>
-      </w:r>
-      <w:r>
-        <w:t xml:space="preserve"> </w:t>
-      </w:r>
-      <w:r>
-        <w:t xml:space="preserve">(3.ª ed.). MIT Press. ISBN: 978-0262033848</w:t>
-      </w:r>
-    </w:p>
-    <w:p>
-      <w:pPr>
+        <w:t xml:space="preserve">Los algoritmos de ordenamiento y búsqueda se implementaron desde cero, con análisis de complejidad Big-O.</w:t>
+      </w:r>
+    </w:p>
+    <w:p>
+      <w:pPr>
+        <w:pStyle w:val="Compact"/>
         <w:numPr>
           <w:ilvl w:val="0"/>
           <w:numId w:val="1015"/>
         </w:numPr>
       </w:pPr>
       <w:r>
-        <w:t xml:space="preserve">Sedgewick, R. y Wayne, K. (2011).</w:t>
-      </w:r>
-      <w:r>
-        <w:t xml:space="preserve"> </w:t>
-      </w:r>
-      <w:r>
-        <w:rPr>
-          <w:i/>
-          <w:iCs/>
-        </w:rPr>
-        <w:t xml:space="preserve">Algorithms</w:t>
-      </w:r>
-      <w:r>
-        <w:t xml:space="preserve"> </w:t>
-      </w:r>
-      <w:r>
-        <w:t xml:space="preserve">(4.ª ed.). Addison-Wesley. ISBN: 978-0321573513</w:t>
+        <w:t xml:space="preserve">SQLite proporcionó una base de datos ligera y embebida con 4 tablas relacionadas mediante claves foráneas.</w:t>
+      </w:r>
+    </w:p>
+    <w:p>
+      <w:pPr>
+        <w:pStyle w:val="Compact"/>
+        <w:numPr>
+          <w:ilvl w:val="0"/>
+          <w:numId w:val="1015"/>
+        </w:numPr>
+      </w:pPr>
+      <w:r>
+        <w:t xml:space="preserve">Tkinter permitió construir una interfaz gráfica funcional conectada a la base de datos con formularios CRUD completos.</w:t>
+      </w:r>
+    </w:p>
+    <w:p>
+      <w:pPr>
+        <w:pStyle w:val="Compact"/>
+        <w:numPr>
+          <w:ilvl w:val="0"/>
+          <w:numId w:val="1015"/>
+        </w:numPr>
+      </w:pPr>
+      <w:r>
+        <w:t xml:space="preserve">El modelo incremental permitió entregar un avance del 50% en la Semana 12 y completar el sistema en la Semana 14.</w:t>
+      </w:r>
+    </w:p>
+    <w:bookmarkEnd w:id="74"/>
+    <w:bookmarkStart w:id="75" w:name="recomendaciones"/>
+    <w:p>
+      <w:pPr>
+        <w:pStyle w:val="Heading3"/>
+      </w:pPr>
+      <w:r>
+        <w:t xml:space="preserve">Recomendaciones</w:t>
+      </w:r>
+    </w:p>
+    <w:p>
+      <w:pPr>
+        <w:pStyle w:val="Compact"/>
+        <w:numPr>
+          <w:ilvl w:val="0"/>
+          <w:numId w:val="1016"/>
+        </w:numPr>
+      </w:pPr>
+      <w:r>
+        <w:t xml:space="preserve">Migrar a una base de datos cliente-servidor (MySQL/PostgreSQL) si la biblioteca crece.</w:t>
+      </w:r>
+    </w:p>
+    <w:p>
+      <w:pPr>
+        <w:pStyle w:val="Compact"/>
+        <w:numPr>
+          <w:ilvl w:val="0"/>
+          <w:numId w:val="1016"/>
+        </w:numPr>
+      </w:pPr>
+      <w:r>
+        <w:t xml:space="preserve">Agregar autenticación de usuarios (bibliotecario/admin) para seguridad.</w:t>
+      </w:r>
+    </w:p>
+    <w:p>
+      <w:pPr>
+        <w:pStyle w:val="Compact"/>
+        <w:numPr>
+          <w:ilvl w:val="0"/>
+          <w:numId w:val="1016"/>
+        </w:numPr>
+      </w:pPr>
+      <w:r>
+        <w:t xml:space="preserve">Implementar búsqueda avanzada con múltiples filtros simultáneos.</w:t>
+      </w:r>
+    </w:p>
+    <w:p>
+      <w:pPr>
+        <w:pStyle w:val="Compact"/>
+        <w:numPr>
+          <w:ilvl w:val="0"/>
+          <w:numId w:val="1016"/>
+        </w:numPr>
+      </w:pPr>
+      <w:r>
+        <w:t xml:space="preserve">Generar reportes estadísticos (libros más prestados, multas, etc.).</w:t>
+      </w:r>
+    </w:p>
+    <w:p>
+      <w:pPr>
+        <w:pStyle w:val="Compact"/>
+        <w:numPr>
+          <w:ilvl w:val="0"/>
+          <w:numId w:val="1016"/>
+        </w:numPr>
+      </w:pPr>
+      <w:r>
+        <w:t xml:space="preserve">Agregar una interfaz web para consultas desde dispositivos móviles.</w:t>
       </w:r>
     </w:p>
     <w:p>
@@ -9539,23 +11941,1474 @@
         </w:pict>
       </w:r>
     </w:p>
-    <w:bookmarkEnd w:id="71"/>
-    <w:bookmarkStart w:id="74" w:name="anexos"/>
+    <w:bookmarkEnd w:id="75"/>
+    <w:bookmarkEnd w:id="76"/>
+    <w:bookmarkStart w:id="77" w:name="bibliografía-apa-7ª-ed."/>
     <w:p>
       <w:pPr>
         <w:pStyle w:val="Heading2"/>
       </w:pPr>
       <w:r>
-        <w:t xml:space="preserve">15. Anexos</w:t>
-      </w:r>
-    </w:p>
-    <w:bookmarkStart w:id="72" w:name="anexo-a-enlaces-del-proyecto"/>
+        <w:t xml:space="preserve">15. Bibliografía (APA 7ª ed.)</w:t>
+      </w:r>
+    </w:p>
+    <w:p>
+      <w:pPr>
+        <w:numPr>
+          <w:ilvl w:val="0"/>
+          <w:numId w:val="1017"/>
+        </w:numPr>
+      </w:pPr>
+      <w:r>
+        <w:t xml:space="preserve">Grayson, J. E. (2000).</w:t>
+      </w:r>
+      <w:r>
+        <w:t xml:space="preserve"> </w:t>
+      </w:r>
+      <w:r>
+        <w:rPr>
+          <w:i/>
+          <w:iCs/>
+        </w:rPr>
+        <w:t xml:space="preserve">Python and Tkinter programming</w:t>
+      </w:r>
+      <w:r>
+        <w:t xml:space="preserve">. Manning Publications. ISBN: 978-1884779813</w:t>
+      </w:r>
+    </w:p>
+    <w:p>
+      <w:pPr>
+        <w:numPr>
+          <w:ilvl w:val="0"/>
+          <w:numId w:val="1017"/>
+        </w:numPr>
+      </w:pPr>
+      <w:r>
+        <w:t xml:space="preserve">Lutz, M. (2013).</w:t>
+      </w:r>
+      <w:r>
+        <w:t xml:space="preserve"> </w:t>
+      </w:r>
+      <w:r>
+        <w:rPr>
+          <w:i/>
+          <w:iCs/>
+        </w:rPr>
+        <w:t xml:space="preserve">Learning Python</w:t>
+      </w:r>
+      <w:r>
+        <w:t xml:space="preserve"> </w:t>
+      </w:r>
+      <w:r>
+        <w:t xml:space="preserve">(5.ª ed.). O’Reilly Media. ISBN: 978-1449355739</w:t>
+      </w:r>
+    </w:p>
+    <w:p>
+      <w:pPr>
+        <w:numPr>
+          <w:ilvl w:val="0"/>
+          <w:numId w:val="1017"/>
+        </w:numPr>
+      </w:pPr>
+      <w:r>
+        <w:t xml:space="preserve">Owens, M. y Allen, G. (2010).</w:t>
+      </w:r>
+      <w:r>
+        <w:t xml:space="preserve"> </w:t>
+      </w:r>
+      <w:r>
+        <w:rPr>
+          <w:i/>
+          <w:iCs/>
+        </w:rPr>
+        <w:t xml:space="preserve">SQLite</w:t>
+      </w:r>
+      <w:r>
+        <w:t xml:space="preserve"> </w:t>
+      </w:r>
+      <w:r>
+        <w:t xml:space="preserve">(The Definitive Guide). Apress. ISBN: 978-1430232254</w:t>
+      </w:r>
+    </w:p>
+    <w:p>
+      <w:pPr>
+        <w:numPr>
+          <w:ilvl w:val="0"/>
+          <w:numId w:val="1017"/>
+        </w:numPr>
+      </w:pPr>
+      <w:r>
+        <w:t xml:space="preserve">Cormen, T. H., Leiserson, C. E., Rivest, R. L. y Stein, C. (2009).</w:t>
+      </w:r>
+      <w:r>
+        <w:t xml:space="preserve"> </w:t>
+      </w:r>
+      <w:r>
+        <w:rPr>
+          <w:i/>
+          <w:iCs/>
+        </w:rPr>
+        <w:t xml:space="preserve">Introduction to Algorithms</w:t>
+      </w:r>
+      <w:r>
+        <w:t xml:space="preserve"> </w:t>
+      </w:r>
+      <w:r>
+        <w:t xml:space="preserve">(3.ª ed.). MIT Press. ISBN: 978-0262033848</w:t>
+      </w:r>
+    </w:p>
+    <w:p>
+      <w:pPr>
+        <w:numPr>
+          <w:ilvl w:val="0"/>
+          <w:numId w:val="1017"/>
+        </w:numPr>
+      </w:pPr>
+      <w:r>
+        <w:t xml:space="preserve">Sedgewick, R. y Wayne, K. (2011).</w:t>
+      </w:r>
+      <w:r>
+        <w:t xml:space="preserve"> </w:t>
+      </w:r>
+      <w:r>
+        <w:rPr>
+          <w:i/>
+          <w:iCs/>
+        </w:rPr>
+        <w:t xml:space="preserve">Algorithms</w:t>
+      </w:r>
+      <w:r>
+        <w:t xml:space="preserve"> </w:t>
+      </w:r>
+      <w:r>
+        <w:t xml:space="preserve">(4.ª ed.). Addison-Wesley. ISBN: 978-0321573513</w:t>
+      </w:r>
+    </w:p>
+    <w:p>
+      <w:r>
+        <w:pict>
+          <v:rect style="width:0;height:1.5pt" o:hralign="center" o:hrstd="t" o:hr="t"/>
+        </w:pict>
+      </w:r>
+    </w:p>
+    <w:bookmarkEnd w:id="77"/>
+    <w:bookmarkStart w:id="83" w:name="anexos"/>
+    <w:p>
+      <w:pPr>
+        <w:pStyle w:val="Heading2"/>
+      </w:pPr>
+      <w:r>
+        <w:t xml:space="preserve">16. Anexos</w:t>
+      </w:r>
+    </w:p>
+    <w:bookmarkStart w:id="80" w:name="Xc22658f7e090a59fdd6438b26777eb94d49c453"/>
     <w:p>
       <w:pPr>
         <w:pStyle w:val="Heading3"/>
       </w:pPr>
       <w:r>
-        <w:t xml:space="preserve">Anexo A — Enlaces del proyecto</w:t>
+        <w:t xml:space="preserve">16.1 Anexo A — Estructura y datos de la base de datos</w:t>
+      </w:r>
+    </w:p>
+    <w:bookmarkStart w:id="78" w:name="esquema-sql-ddl-1"/>
+    <w:p>
+      <w:pPr>
+        <w:pStyle w:val="Heading4"/>
+      </w:pPr>
+      <w:r>
+        <w:t xml:space="preserve">Esquema SQL (DDL)</w:t>
+      </w:r>
+    </w:p>
+    <w:p>
+      <w:pPr>
+        <w:pStyle w:val="SourceCode"/>
+      </w:pPr>
+      <w:r>
+        <w:rPr>
+          <w:rStyle w:val="KeywordTok"/>
+        </w:rPr>
+        <w:t xml:space="preserve">CREATE</w:t>
+      </w:r>
+      <w:r>
+        <w:rPr>
+          <w:rStyle w:val="NormalTok"/>
+        </w:rPr>
+        <w:t xml:space="preserve"> </w:t>
+      </w:r>
+      <w:r>
+        <w:rPr>
+          <w:rStyle w:val="KeywordTok"/>
+        </w:rPr>
+        <w:t xml:space="preserve">TABLE</w:t>
+      </w:r>
+      <w:r>
+        <w:rPr>
+          <w:rStyle w:val="NormalTok"/>
+        </w:rPr>
+        <w:t xml:space="preserve"> socios(</w:t>
+      </w:r>
+      <w:r>
+        <w:br/>
+      </w:r>
+      <w:r>
+        <w:rPr>
+          <w:rStyle w:val="NormalTok"/>
+        </w:rPr>
+        <w:t xml:space="preserve">    cedula TEXT </w:t>
+      </w:r>
+      <w:r>
+        <w:rPr>
+          <w:rStyle w:val="KeywordTok"/>
+        </w:rPr>
+        <w:t xml:space="preserve">PRIMARY</w:t>
+      </w:r>
+      <w:r>
+        <w:rPr>
+          <w:rStyle w:val="NormalTok"/>
+        </w:rPr>
+        <w:t xml:space="preserve"> </w:t>
+      </w:r>
+      <w:r>
+        <w:rPr>
+          <w:rStyle w:val="KeywordTok"/>
+        </w:rPr>
+        <w:t xml:space="preserve">KEY</w:t>
+      </w:r>
+      <w:r>
+        <w:rPr>
+          <w:rStyle w:val="NormalTok"/>
+        </w:rPr>
+        <w:t xml:space="preserve">,</w:t>
+      </w:r>
+      <w:r>
+        <w:br/>
+      </w:r>
+      <w:r>
+        <w:rPr>
+          <w:rStyle w:val="NormalTok"/>
+        </w:rPr>
+        <w:t xml:space="preserve">    nombre TEXT </w:t>
+      </w:r>
+      <w:r>
+        <w:rPr>
+          <w:rStyle w:val="KeywordTok"/>
+        </w:rPr>
+        <w:t xml:space="preserve">NOT</w:t>
+      </w:r>
+      <w:r>
+        <w:rPr>
+          <w:rStyle w:val="NormalTok"/>
+        </w:rPr>
+        <w:t xml:space="preserve"> </w:t>
+      </w:r>
+      <w:r>
+        <w:rPr>
+          <w:rStyle w:val="KeywordTok"/>
+        </w:rPr>
+        <w:t xml:space="preserve">NULL</w:t>
+      </w:r>
+      <w:r>
+        <w:rPr>
+          <w:rStyle w:val="NormalTok"/>
+        </w:rPr>
+        <w:t xml:space="preserve">,</w:t>
+      </w:r>
+      <w:r>
+        <w:br/>
+      </w:r>
+      <w:r>
+        <w:rPr>
+          <w:rStyle w:val="NormalTok"/>
+        </w:rPr>
+        <w:t xml:space="preserve">    apellido TEXT </w:t>
+      </w:r>
+      <w:r>
+        <w:rPr>
+          <w:rStyle w:val="KeywordTok"/>
+        </w:rPr>
+        <w:t xml:space="preserve">NOT</w:t>
+      </w:r>
+      <w:r>
+        <w:rPr>
+          <w:rStyle w:val="NormalTok"/>
+        </w:rPr>
+        <w:t xml:space="preserve"> </w:t>
+      </w:r>
+      <w:r>
+        <w:rPr>
+          <w:rStyle w:val="KeywordTok"/>
+        </w:rPr>
+        <w:t xml:space="preserve">NULL</w:t>
+      </w:r>
+      <w:r>
+        <w:rPr>
+          <w:rStyle w:val="NormalTok"/>
+        </w:rPr>
+        <w:t xml:space="preserve">,</w:t>
+      </w:r>
+      <w:r>
+        <w:br/>
+      </w:r>
+      <w:r>
+        <w:rPr>
+          <w:rStyle w:val="NormalTok"/>
+        </w:rPr>
+        <w:t xml:space="preserve">    tipo TEXT </w:t>
+      </w:r>
+      <w:r>
+        <w:rPr>
+          <w:rStyle w:val="KeywordTok"/>
+        </w:rPr>
+        <w:t xml:space="preserve">NOT</w:t>
+      </w:r>
+      <w:r>
+        <w:rPr>
+          <w:rStyle w:val="NormalTok"/>
+        </w:rPr>
+        <w:t xml:space="preserve"> </w:t>
+      </w:r>
+      <w:r>
+        <w:rPr>
+          <w:rStyle w:val="KeywordTok"/>
+        </w:rPr>
+        <w:t xml:space="preserve">NULL</w:t>
+      </w:r>
+      <w:r>
+        <w:rPr>
+          <w:rStyle w:val="NormalTok"/>
+        </w:rPr>
+        <w:t xml:space="preserve"> </w:t>
+      </w:r>
+      <w:r>
+        <w:rPr>
+          <w:rStyle w:val="KeywordTok"/>
+        </w:rPr>
+        <w:t xml:space="preserve">CHECK</w:t>
+      </w:r>
+      <w:r>
+        <w:rPr>
+          <w:rStyle w:val="NormalTok"/>
+        </w:rPr>
+        <w:t xml:space="preserve">(tipo </w:t>
+      </w:r>
+      <w:r>
+        <w:rPr>
+          <w:rStyle w:val="KeywordTok"/>
+        </w:rPr>
+        <w:t xml:space="preserve">IN</w:t>
+      </w:r>
+      <w:r>
+        <w:rPr>
+          <w:rStyle w:val="NormalTok"/>
+        </w:rPr>
+        <w:t xml:space="preserve"> (</w:t>
+      </w:r>
+      <w:r>
+        <w:rPr>
+          <w:rStyle w:val="StringTok"/>
+        </w:rPr>
+        <w:t xml:space="preserve">'Estudiante'</w:t>
+      </w:r>
+      <w:r>
+        <w:rPr>
+          <w:rStyle w:val="NormalTok"/>
+        </w:rPr>
+        <w:t xml:space="preserve">, </w:t>
+      </w:r>
+      <w:r>
+        <w:rPr>
+          <w:rStyle w:val="StringTok"/>
+        </w:rPr>
+        <w:t xml:space="preserve">'Docente'</w:t>
+      </w:r>
+      <w:r>
+        <w:rPr>
+          <w:rStyle w:val="NormalTok"/>
+        </w:rPr>
+        <w:t xml:space="preserve">)),</w:t>
+      </w:r>
+      <w:r>
+        <w:br/>
+      </w:r>
+      <w:r>
+        <w:rPr>
+          <w:rStyle w:val="NormalTok"/>
+        </w:rPr>
+        <w:t xml:space="preserve">    carrera_departamento TEXT,</w:t>
+      </w:r>
+      <w:r>
+        <w:br/>
+      </w:r>
+      <w:r>
+        <w:rPr>
+          <w:rStyle w:val="NormalTok"/>
+        </w:rPr>
+        <w:t xml:space="preserve">    semestre </w:t>
+      </w:r>
+      <w:r>
+        <w:rPr>
+          <w:rStyle w:val="DataTypeTok"/>
+        </w:rPr>
+        <w:t xml:space="preserve">INTEGER</w:t>
+      </w:r>
+      <w:r>
+        <w:rPr>
+          <w:rStyle w:val="NormalTok"/>
+        </w:rPr>
+        <w:t xml:space="preserve">,</w:t>
+      </w:r>
+      <w:r>
+        <w:br/>
+      </w:r>
+      <w:r>
+        <w:rPr>
+          <w:rStyle w:val="NormalTok"/>
+        </w:rPr>
+        <w:t xml:space="preserve">    telefono TEXT</w:t>
+      </w:r>
+      <w:r>
+        <w:br/>
+      </w:r>
+      <w:r>
+        <w:rPr>
+          <w:rStyle w:val="NormalTok"/>
+        </w:rPr>
+        <w:t xml:space="preserve">);</w:t>
+      </w:r>
+      <w:r>
+        <w:br/>
+      </w:r>
+      <w:r>
+        <w:br/>
+      </w:r>
+      <w:r>
+        <w:rPr>
+          <w:rStyle w:val="KeywordTok"/>
+        </w:rPr>
+        <w:t xml:space="preserve">CREATE</w:t>
+      </w:r>
+      <w:r>
+        <w:rPr>
+          <w:rStyle w:val="NormalTok"/>
+        </w:rPr>
+        <w:t xml:space="preserve"> </w:t>
+      </w:r>
+      <w:r>
+        <w:rPr>
+          <w:rStyle w:val="KeywordTok"/>
+        </w:rPr>
+        <w:t xml:space="preserve">TABLE</w:t>
+      </w:r>
+      <w:r>
+        <w:rPr>
+          <w:rStyle w:val="NormalTok"/>
+        </w:rPr>
+        <w:t xml:space="preserve"> libros(</w:t>
+      </w:r>
+      <w:r>
+        <w:br/>
+      </w:r>
+      <w:r>
+        <w:rPr>
+          <w:rStyle w:val="NormalTok"/>
+        </w:rPr>
+        <w:t xml:space="preserve">    isbn TEXT </w:t>
+      </w:r>
+      <w:r>
+        <w:rPr>
+          <w:rStyle w:val="KeywordTok"/>
+        </w:rPr>
+        <w:t xml:space="preserve">PRIMARY</w:t>
+      </w:r>
+      <w:r>
+        <w:rPr>
+          <w:rStyle w:val="NormalTok"/>
+        </w:rPr>
+        <w:t xml:space="preserve"> </w:t>
+      </w:r>
+      <w:r>
+        <w:rPr>
+          <w:rStyle w:val="KeywordTok"/>
+        </w:rPr>
+        <w:t xml:space="preserve">KEY</w:t>
+      </w:r>
+      <w:r>
+        <w:rPr>
+          <w:rStyle w:val="NormalTok"/>
+        </w:rPr>
+        <w:t xml:space="preserve">,</w:t>
+      </w:r>
+      <w:r>
+        <w:br/>
+      </w:r>
+      <w:r>
+        <w:rPr>
+          <w:rStyle w:val="NormalTok"/>
+        </w:rPr>
+        <w:t xml:space="preserve">    titulo TEXT </w:t>
+      </w:r>
+      <w:r>
+        <w:rPr>
+          <w:rStyle w:val="KeywordTok"/>
+        </w:rPr>
+        <w:t xml:space="preserve">NOT</w:t>
+      </w:r>
+      <w:r>
+        <w:rPr>
+          <w:rStyle w:val="NormalTok"/>
+        </w:rPr>
+        <w:t xml:space="preserve"> </w:t>
+      </w:r>
+      <w:r>
+        <w:rPr>
+          <w:rStyle w:val="KeywordTok"/>
+        </w:rPr>
+        <w:t xml:space="preserve">NULL</w:t>
+      </w:r>
+      <w:r>
+        <w:rPr>
+          <w:rStyle w:val="NormalTok"/>
+        </w:rPr>
+        <w:t xml:space="preserve">,</w:t>
+      </w:r>
+      <w:r>
+        <w:br/>
+      </w:r>
+      <w:r>
+        <w:rPr>
+          <w:rStyle w:val="NormalTok"/>
+        </w:rPr>
+        <w:t xml:space="preserve">    autor TEXT </w:t>
+      </w:r>
+      <w:r>
+        <w:rPr>
+          <w:rStyle w:val="KeywordTok"/>
+        </w:rPr>
+        <w:t xml:space="preserve">NOT</w:t>
+      </w:r>
+      <w:r>
+        <w:rPr>
+          <w:rStyle w:val="NormalTok"/>
+        </w:rPr>
+        <w:t xml:space="preserve"> </w:t>
+      </w:r>
+      <w:r>
+        <w:rPr>
+          <w:rStyle w:val="KeywordTok"/>
+        </w:rPr>
+        <w:t xml:space="preserve">NULL</w:t>
+      </w:r>
+      <w:r>
+        <w:rPr>
+          <w:rStyle w:val="NormalTok"/>
+        </w:rPr>
+        <w:t xml:space="preserve">,</w:t>
+      </w:r>
+      <w:r>
+        <w:br/>
+      </w:r>
+      <w:r>
+        <w:rPr>
+          <w:rStyle w:val="NormalTok"/>
+        </w:rPr>
+        <w:t xml:space="preserve">    editorial TEXT,</w:t>
+      </w:r>
+      <w:r>
+        <w:br/>
+      </w:r>
+      <w:r>
+        <w:rPr>
+          <w:rStyle w:val="NormalTok"/>
+        </w:rPr>
+        <w:t xml:space="preserve">    anio </w:t>
+      </w:r>
+      <w:r>
+        <w:rPr>
+          <w:rStyle w:val="DataTypeTok"/>
+        </w:rPr>
+        <w:t xml:space="preserve">INTEGER</w:t>
+      </w:r>
+      <w:r>
+        <w:rPr>
+          <w:rStyle w:val="NormalTok"/>
+        </w:rPr>
+        <w:t xml:space="preserve">,</w:t>
+      </w:r>
+      <w:r>
+        <w:br/>
+      </w:r>
+      <w:r>
+        <w:rPr>
+          <w:rStyle w:val="NormalTok"/>
+        </w:rPr>
+        <w:t xml:space="preserve">    ejemplares </w:t>
+      </w:r>
+      <w:r>
+        <w:rPr>
+          <w:rStyle w:val="DataTypeTok"/>
+        </w:rPr>
+        <w:t xml:space="preserve">INTEGER</w:t>
+      </w:r>
+      <w:r>
+        <w:rPr>
+          <w:rStyle w:val="NormalTok"/>
+        </w:rPr>
+        <w:t xml:space="preserve"> </w:t>
+      </w:r>
+      <w:r>
+        <w:rPr>
+          <w:rStyle w:val="KeywordTok"/>
+        </w:rPr>
+        <w:t xml:space="preserve">DEFAULT</w:t>
+      </w:r>
+      <w:r>
+        <w:rPr>
+          <w:rStyle w:val="NormalTok"/>
+        </w:rPr>
+        <w:t xml:space="preserve"> </w:t>
+      </w:r>
+      <w:r>
+        <w:rPr>
+          <w:rStyle w:val="DecValTok"/>
+        </w:rPr>
+        <w:t xml:space="preserve">1</w:t>
+      </w:r>
+      <w:r>
+        <w:rPr>
+          <w:rStyle w:val="NormalTok"/>
+        </w:rPr>
+        <w:t xml:space="preserve">,</w:t>
+      </w:r>
+      <w:r>
+        <w:br/>
+      </w:r>
+      <w:r>
+        <w:rPr>
+          <w:rStyle w:val="NormalTok"/>
+        </w:rPr>
+        <w:t xml:space="preserve">    disponibles </w:t>
+      </w:r>
+      <w:r>
+        <w:rPr>
+          <w:rStyle w:val="DataTypeTok"/>
+        </w:rPr>
+        <w:t xml:space="preserve">INTEGER</w:t>
+      </w:r>
+      <w:r>
+        <w:rPr>
+          <w:rStyle w:val="NormalTok"/>
+        </w:rPr>
+        <w:t xml:space="preserve"> </w:t>
+      </w:r>
+      <w:r>
+        <w:rPr>
+          <w:rStyle w:val="KeywordTok"/>
+        </w:rPr>
+        <w:t xml:space="preserve">DEFAULT</w:t>
+      </w:r>
+      <w:r>
+        <w:rPr>
+          <w:rStyle w:val="NormalTok"/>
+        </w:rPr>
+        <w:t xml:space="preserve"> </w:t>
+      </w:r>
+      <w:r>
+        <w:rPr>
+          <w:rStyle w:val="DecValTok"/>
+        </w:rPr>
+        <w:t xml:space="preserve">1</w:t>
+      </w:r>
+      <w:r>
+        <w:br/>
+      </w:r>
+      <w:r>
+        <w:rPr>
+          <w:rStyle w:val="NormalTok"/>
+        </w:rPr>
+        <w:t xml:space="preserve">);</w:t>
+      </w:r>
+      <w:r>
+        <w:br/>
+      </w:r>
+      <w:r>
+        <w:br/>
+      </w:r>
+      <w:r>
+        <w:rPr>
+          <w:rStyle w:val="KeywordTok"/>
+        </w:rPr>
+        <w:t xml:space="preserve">CREATE</w:t>
+      </w:r>
+      <w:r>
+        <w:rPr>
+          <w:rStyle w:val="NormalTok"/>
+        </w:rPr>
+        <w:t xml:space="preserve"> </w:t>
+      </w:r>
+      <w:r>
+        <w:rPr>
+          <w:rStyle w:val="KeywordTok"/>
+        </w:rPr>
+        <w:t xml:space="preserve">TABLE</w:t>
+      </w:r>
+      <w:r>
+        <w:rPr>
+          <w:rStyle w:val="NormalTok"/>
+        </w:rPr>
+        <w:t xml:space="preserve"> prestamos(</w:t>
+      </w:r>
+      <w:r>
+        <w:br/>
+      </w:r>
+      <w:r>
+        <w:rPr>
+          <w:rStyle w:val="NormalTok"/>
+        </w:rPr>
+        <w:t xml:space="preserve">    </w:t>
+      </w:r>
+      <w:r>
+        <w:rPr>
+          <w:rStyle w:val="KeywordTok"/>
+        </w:rPr>
+        <w:t xml:space="preserve">id</w:t>
+      </w:r>
+      <w:r>
+        <w:rPr>
+          <w:rStyle w:val="NormalTok"/>
+        </w:rPr>
+        <w:t xml:space="preserve"> </w:t>
+      </w:r>
+      <w:r>
+        <w:rPr>
+          <w:rStyle w:val="DataTypeTok"/>
+        </w:rPr>
+        <w:t xml:space="preserve">INTEGER</w:t>
+      </w:r>
+      <w:r>
+        <w:rPr>
+          <w:rStyle w:val="NormalTok"/>
+        </w:rPr>
+        <w:t xml:space="preserve"> </w:t>
+      </w:r>
+      <w:r>
+        <w:rPr>
+          <w:rStyle w:val="KeywordTok"/>
+        </w:rPr>
+        <w:t xml:space="preserve">PRIMARY</w:t>
+      </w:r>
+      <w:r>
+        <w:rPr>
+          <w:rStyle w:val="NormalTok"/>
+        </w:rPr>
+        <w:t xml:space="preserve"> </w:t>
+      </w:r>
+      <w:r>
+        <w:rPr>
+          <w:rStyle w:val="KeywordTok"/>
+        </w:rPr>
+        <w:t xml:space="preserve">KEY</w:t>
+      </w:r>
+      <w:r>
+        <w:rPr>
+          <w:rStyle w:val="NormalTok"/>
+        </w:rPr>
+        <w:t xml:space="preserve"> AUTOINCREMENT,</w:t>
+      </w:r>
+      <w:r>
+        <w:br/>
+      </w:r>
+      <w:r>
+        <w:rPr>
+          <w:rStyle w:val="NormalTok"/>
+        </w:rPr>
+        <w:t xml:space="preserve">    cedula_socio TEXT </w:t>
+      </w:r>
+      <w:r>
+        <w:rPr>
+          <w:rStyle w:val="KeywordTok"/>
+        </w:rPr>
+        <w:t xml:space="preserve">NOT</w:t>
+      </w:r>
+      <w:r>
+        <w:rPr>
+          <w:rStyle w:val="NormalTok"/>
+        </w:rPr>
+        <w:t xml:space="preserve"> </w:t>
+      </w:r>
+      <w:r>
+        <w:rPr>
+          <w:rStyle w:val="KeywordTok"/>
+        </w:rPr>
+        <w:t xml:space="preserve">NULL</w:t>
+      </w:r>
+      <w:r>
+        <w:rPr>
+          <w:rStyle w:val="NormalTok"/>
+        </w:rPr>
+        <w:t xml:space="preserve">,</w:t>
+      </w:r>
+      <w:r>
+        <w:br/>
+      </w:r>
+      <w:r>
+        <w:rPr>
+          <w:rStyle w:val="NormalTok"/>
+        </w:rPr>
+        <w:t xml:space="preserve">    isbn_libro TEXT </w:t>
+      </w:r>
+      <w:r>
+        <w:rPr>
+          <w:rStyle w:val="KeywordTok"/>
+        </w:rPr>
+        <w:t xml:space="preserve">NOT</w:t>
+      </w:r>
+      <w:r>
+        <w:rPr>
+          <w:rStyle w:val="NormalTok"/>
+        </w:rPr>
+        <w:t xml:space="preserve"> </w:t>
+      </w:r>
+      <w:r>
+        <w:rPr>
+          <w:rStyle w:val="KeywordTok"/>
+        </w:rPr>
+        <w:t xml:space="preserve">NULL</w:t>
+      </w:r>
+      <w:r>
+        <w:rPr>
+          <w:rStyle w:val="NormalTok"/>
+        </w:rPr>
+        <w:t xml:space="preserve">,</w:t>
+      </w:r>
+      <w:r>
+        <w:br/>
+      </w:r>
+      <w:r>
+        <w:rPr>
+          <w:rStyle w:val="NormalTok"/>
+        </w:rPr>
+        <w:t xml:space="preserve">    fecha_prestamo TEXT </w:t>
+      </w:r>
+      <w:r>
+        <w:rPr>
+          <w:rStyle w:val="KeywordTok"/>
+        </w:rPr>
+        <w:t xml:space="preserve">NOT</w:t>
+      </w:r>
+      <w:r>
+        <w:rPr>
+          <w:rStyle w:val="NormalTok"/>
+        </w:rPr>
+        <w:t xml:space="preserve"> </w:t>
+      </w:r>
+      <w:r>
+        <w:rPr>
+          <w:rStyle w:val="KeywordTok"/>
+        </w:rPr>
+        <w:t xml:space="preserve">NULL</w:t>
+      </w:r>
+      <w:r>
+        <w:rPr>
+          <w:rStyle w:val="NormalTok"/>
+        </w:rPr>
+        <w:t xml:space="preserve">,</w:t>
+      </w:r>
+      <w:r>
+        <w:br/>
+      </w:r>
+      <w:r>
+        <w:rPr>
+          <w:rStyle w:val="NormalTok"/>
+        </w:rPr>
+        <w:t xml:space="preserve">    fecha_devolucion TEXT,</w:t>
+      </w:r>
+      <w:r>
+        <w:br/>
+      </w:r>
+      <w:r>
+        <w:rPr>
+          <w:rStyle w:val="NormalTok"/>
+        </w:rPr>
+        <w:t xml:space="preserve">    </w:t>
+      </w:r>
+      <w:r>
+        <w:rPr>
+          <w:rStyle w:val="KeywordTok"/>
+        </w:rPr>
+        <w:t xml:space="preserve">FOREIGN</w:t>
+      </w:r>
+      <w:r>
+        <w:rPr>
+          <w:rStyle w:val="NormalTok"/>
+        </w:rPr>
+        <w:t xml:space="preserve"> </w:t>
+      </w:r>
+      <w:r>
+        <w:rPr>
+          <w:rStyle w:val="KeywordTok"/>
+        </w:rPr>
+        <w:t xml:space="preserve">KEY</w:t>
+      </w:r>
+      <w:r>
+        <w:rPr>
+          <w:rStyle w:val="NormalTok"/>
+        </w:rPr>
+        <w:t xml:space="preserve">(cedula_socio) </w:t>
+      </w:r>
+      <w:r>
+        <w:rPr>
+          <w:rStyle w:val="KeywordTok"/>
+        </w:rPr>
+        <w:t xml:space="preserve">REFERENCES</w:t>
+      </w:r>
+      <w:r>
+        <w:rPr>
+          <w:rStyle w:val="NormalTok"/>
+        </w:rPr>
+        <w:t xml:space="preserve"> socios(cedula),</w:t>
+      </w:r>
+      <w:r>
+        <w:br/>
+      </w:r>
+      <w:r>
+        <w:rPr>
+          <w:rStyle w:val="NormalTok"/>
+        </w:rPr>
+        <w:t xml:space="preserve">    </w:t>
+      </w:r>
+      <w:r>
+        <w:rPr>
+          <w:rStyle w:val="KeywordTok"/>
+        </w:rPr>
+        <w:t xml:space="preserve">FOREIGN</w:t>
+      </w:r>
+      <w:r>
+        <w:rPr>
+          <w:rStyle w:val="NormalTok"/>
+        </w:rPr>
+        <w:t xml:space="preserve"> </w:t>
+      </w:r>
+      <w:r>
+        <w:rPr>
+          <w:rStyle w:val="KeywordTok"/>
+        </w:rPr>
+        <w:t xml:space="preserve">KEY</w:t>
+      </w:r>
+      <w:r>
+        <w:rPr>
+          <w:rStyle w:val="NormalTok"/>
+        </w:rPr>
+        <w:t xml:space="preserve">(isbn_libro) </w:t>
+      </w:r>
+      <w:r>
+        <w:rPr>
+          <w:rStyle w:val="KeywordTok"/>
+        </w:rPr>
+        <w:t xml:space="preserve">REFERENCES</w:t>
+      </w:r>
+      <w:r>
+        <w:rPr>
+          <w:rStyle w:val="NormalTok"/>
+        </w:rPr>
+        <w:t xml:space="preserve"> libros(isbn)</w:t>
+      </w:r>
+      <w:r>
+        <w:br/>
+      </w:r>
+      <w:r>
+        <w:rPr>
+          <w:rStyle w:val="NormalTok"/>
+        </w:rPr>
+        <w:t xml:space="preserve">);</w:t>
+      </w:r>
+      <w:r>
+        <w:br/>
+      </w:r>
+      <w:r>
+        <w:br/>
+      </w:r>
+      <w:r>
+        <w:rPr>
+          <w:rStyle w:val="KeywordTok"/>
+        </w:rPr>
+        <w:t xml:space="preserve">CREATE</w:t>
+      </w:r>
+      <w:r>
+        <w:rPr>
+          <w:rStyle w:val="NormalTok"/>
+        </w:rPr>
+        <w:t xml:space="preserve"> </w:t>
+      </w:r>
+      <w:r>
+        <w:rPr>
+          <w:rStyle w:val="KeywordTok"/>
+        </w:rPr>
+        <w:t xml:space="preserve">TABLE</w:t>
+      </w:r>
+      <w:r>
+        <w:rPr>
+          <w:rStyle w:val="NormalTok"/>
+        </w:rPr>
+        <w:t xml:space="preserve"> reservas(</w:t>
+      </w:r>
+      <w:r>
+        <w:br/>
+      </w:r>
+      <w:r>
+        <w:rPr>
+          <w:rStyle w:val="NormalTok"/>
+        </w:rPr>
+        <w:t xml:space="preserve">    </w:t>
+      </w:r>
+      <w:r>
+        <w:rPr>
+          <w:rStyle w:val="KeywordTok"/>
+        </w:rPr>
+        <w:t xml:space="preserve">id</w:t>
+      </w:r>
+      <w:r>
+        <w:rPr>
+          <w:rStyle w:val="NormalTok"/>
+        </w:rPr>
+        <w:t xml:space="preserve"> </w:t>
+      </w:r>
+      <w:r>
+        <w:rPr>
+          <w:rStyle w:val="DataTypeTok"/>
+        </w:rPr>
+        <w:t xml:space="preserve">INTEGER</w:t>
+      </w:r>
+      <w:r>
+        <w:rPr>
+          <w:rStyle w:val="NormalTok"/>
+        </w:rPr>
+        <w:t xml:space="preserve"> </w:t>
+      </w:r>
+      <w:r>
+        <w:rPr>
+          <w:rStyle w:val="KeywordTok"/>
+        </w:rPr>
+        <w:t xml:space="preserve">PRIMARY</w:t>
+      </w:r>
+      <w:r>
+        <w:rPr>
+          <w:rStyle w:val="NormalTok"/>
+        </w:rPr>
+        <w:t xml:space="preserve"> </w:t>
+      </w:r>
+      <w:r>
+        <w:rPr>
+          <w:rStyle w:val="KeywordTok"/>
+        </w:rPr>
+        <w:t xml:space="preserve">KEY</w:t>
+      </w:r>
+      <w:r>
+        <w:rPr>
+          <w:rStyle w:val="NormalTok"/>
+        </w:rPr>
+        <w:t xml:space="preserve"> AUTOINCREMENT,</w:t>
+      </w:r>
+      <w:r>
+        <w:br/>
+      </w:r>
+      <w:r>
+        <w:rPr>
+          <w:rStyle w:val="NormalTok"/>
+        </w:rPr>
+        <w:t xml:space="preserve">    cedula_socio TEXT </w:t>
+      </w:r>
+      <w:r>
+        <w:rPr>
+          <w:rStyle w:val="KeywordTok"/>
+        </w:rPr>
+        <w:t xml:space="preserve">NOT</w:t>
+      </w:r>
+      <w:r>
+        <w:rPr>
+          <w:rStyle w:val="NormalTok"/>
+        </w:rPr>
+        <w:t xml:space="preserve"> </w:t>
+      </w:r>
+      <w:r>
+        <w:rPr>
+          <w:rStyle w:val="KeywordTok"/>
+        </w:rPr>
+        <w:t xml:space="preserve">NULL</w:t>
+      </w:r>
+      <w:r>
+        <w:rPr>
+          <w:rStyle w:val="NormalTok"/>
+        </w:rPr>
+        <w:t xml:space="preserve">,</w:t>
+      </w:r>
+      <w:r>
+        <w:br/>
+      </w:r>
+      <w:r>
+        <w:rPr>
+          <w:rStyle w:val="NormalTok"/>
+        </w:rPr>
+        <w:t xml:space="preserve">    isbn_libro TEXT </w:t>
+      </w:r>
+      <w:r>
+        <w:rPr>
+          <w:rStyle w:val="KeywordTok"/>
+        </w:rPr>
+        <w:t xml:space="preserve">NOT</w:t>
+      </w:r>
+      <w:r>
+        <w:rPr>
+          <w:rStyle w:val="NormalTok"/>
+        </w:rPr>
+        <w:t xml:space="preserve"> </w:t>
+      </w:r>
+      <w:r>
+        <w:rPr>
+          <w:rStyle w:val="KeywordTok"/>
+        </w:rPr>
+        <w:t xml:space="preserve">NULL</w:t>
+      </w:r>
+      <w:r>
+        <w:rPr>
+          <w:rStyle w:val="NormalTok"/>
+        </w:rPr>
+        <w:t xml:space="preserve">,</w:t>
+      </w:r>
+      <w:r>
+        <w:br/>
+      </w:r>
+      <w:r>
+        <w:rPr>
+          <w:rStyle w:val="NormalTok"/>
+        </w:rPr>
+        <w:t xml:space="preserve">    fecha_reserva TEXT </w:t>
+      </w:r>
+      <w:r>
+        <w:rPr>
+          <w:rStyle w:val="KeywordTok"/>
+        </w:rPr>
+        <w:t xml:space="preserve">NOT</w:t>
+      </w:r>
+      <w:r>
+        <w:rPr>
+          <w:rStyle w:val="NormalTok"/>
+        </w:rPr>
+        <w:t xml:space="preserve"> </w:t>
+      </w:r>
+      <w:r>
+        <w:rPr>
+          <w:rStyle w:val="KeywordTok"/>
+        </w:rPr>
+        <w:t xml:space="preserve">NULL</w:t>
+      </w:r>
+      <w:r>
+        <w:rPr>
+          <w:rStyle w:val="NormalTok"/>
+        </w:rPr>
+        <w:t xml:space="preserve">,</w:t>
+      </w:r>
+      <w:r>
+        <w:br/>
+      </w:r>
+      <w:r>
+        <w:rPr>
+          <w:rStyle w:val="NormalTok"/>
+        </w:rPr>
+        <w:t xml:space="preserve">    activa </w:t>
+      </w:r>
+      <w:r>
+        <w:rPr>
+          <w:rStyle w:val="DataTypeTok"/>
+        </w:rPr>
+        <w:t xml:space="preserve">INTEGER</w:t>
+      </w:r>
+      <w:r>
+        <w:rPr>
+          <w:rStyle w:val="NormalTok"/>
+        </w:rPr>
+        <w:t xml:space="preserve"> </w:t>
+      </w:r>
+      <w:r>
+        <w:rPr>
+          <w:rStyle w:val="KeywordTok"/>
+        </w:rPr>
+        <w:t xml:space="preserve">DEFAULT</w:t>
+      </w:r>
+      <w:r>
+        <w:rPr>
+          <w:rStyle w:val="NormalTok"/>
+        </w:rPr>
+        <w:t xml:space="preserve"> </w:t>
+      </w:r>
+      <w:r>
+        <w:rPr>
+          <w:rStyle w:val="DecValTok"/>
+        </w:rPr>
+        <w:t xml:space="preserve">1</w:t>
+      </w:r>
+      <w:r>
+        <w:rPr>
+          <w:rStyle w:val="NormalTok"/>
+        </w:rPr>
+        <w:t xml:space="preserve">,</w:t>
+      </w:r>
+      <w:r>
+        <w:br/>
+      </w:r>
+      <w:r>
+        <w:rPr>
+          <w:rStyle w:val="NormalTok"/>
+        </w:rPr>
+        <w:t xml:space="preserve">    </w:t>
+      </w:r>
+      <w:r>
+        <w:rPr>
+          <w:rStyle w:val="KeywordTok"/>
+        </w:rPr>
+        <w:t xml:space="preserve">FOREIGN</w:t>
+      </w:r>
+      <w:r>
+        <w:rPr>
+          <w:rStyle w:val="NormalTok"/>
+        </w:rPr>
+        <w:t xml:space="preserve"> </w:t>
+      </w:r>
+      <w:r>
+        <w:rPr>
+          <w:rStyle w:val="KeywordTok"/>
+        </w:rPr>
+        <w:t xml:space="preserve">KEY</w:t>
+      </w:r>
+      <w:r>
+        <w:rPr>
+          <w:rStyle w:val="NormalTok"/>
+        </w:rPr>
+        <w:t xml:space="preserve">(cedula_socio) </w:t>
+      </w:r>
+      <w:r>
+        <w:rPr>
+          <w:rStyle w:val="KeywordTok"/>
+        </w:rPr>
+        <w:t xml:space="preserve">REFERENCES</w:t>
+      </w:r>
+      <w:r>
+        <w:rPr>
+          <w:rStyle w:val="NormalTok"/>
+        </w:rPr>
+        <w:t xml:space="preserve"> socios(cedula),</w:t>
+      </w:r>
+      <w:r>
+        <w:br/>
+      </w:r>
+      <w:r>
+        <w:rPr>
+          <w:rStyle w:val="NormalTok"/>
+        </w:rPr>
+        <w:t xml:space="preserve">    </w:t>
+      </w:r>
+      <w:r>
+        <w:rPr>
+          <w:rStyle w:val="KeywordTok"/>
+        </w:rPr>
+        <w:t xml:space="preserve">FOREIGN</w:t>
+      </w:r>
+      <w:r>
+        <w:rPr>
+          <w:rStyle w:val="NormalTok"/>
+        </w:rPr>
+        <w:t xml:space="preserve"> </w:t>
+      </w:r>
+      <w:r>
+        <w:rPr>
+          <w:rStyle w:val="KeywordTok"/>
+        </w:rPr>
+        <w:t xml:space="preserve">KEY</w:t>
+      </w:r>
+      <w:r>
+        <w:rPr>
+          <w:rStyle w:val="NormalTok"/>
+        </w:rPr>
+        <w:t xml:space="preserve">(isbn_libro) </w:t>
+      </w:r>
+      <w:r>
+        <w:rPr>
+          <w:rStyle w:val="KeywordTok"/>
+        </w:rPr>
+        <w:t xml:space="preserve">REFERENCES</w:t>
+      </w:r>
+      <w:r>
+        <w:rPr>
+          <w:rStyle w:val="NormalTok"/>
+        </w:rPr>
+        <w:t xml:space="preserve"> libros(isbn)</w:t>
+      </w:r>
+      <w:r>
+        <w:br/>
+      </w:r>
+      <w:r>
+        <w:rPr>
+          <w:rStyle w:val="NormalTok"/>
+        </w:rPr>
+        <w:t xml:space="preserve">);</w:t>
+      </w:r>
+    </w:p>
+    <w:bookmarkEnd w:id="78"/>
+    <w:bookmarkStart w:id="79" w:name="datos-de-prueba-7-socios-8-libros"/>
+    <w:p>
+      <w:pPr>
+        <w:pStyle w:val="Heading4"/>
+      </w:pPr>
+      <w:r>
+        <w:t xml:space="preserve">Datos de prueba (7 socios + 8 libros)</w:t>
+      </w:r>
+    </w:p>
+    <w:p>
+      <w:pPr>
+        <w:pStyle w:val="FirstParagraph"/>
+      </w:pPr>
+      <w:r>
+        <w:rPr>
+          <w:b/>
+          <w:bCs/>
+        </w:rPr>
+        <w:t xml:space="preserve">socios:</w:t>
+      </w:r>
+      <w:r>
+        <w:t xml:space="preserve"> </w:t>
+      </w:r>
+      <w:r>
+        <w:t xml:space="preserve">| cedula | nombre | apellido | tipo | carrera_departamento | semestre |</w:t>
+      </w:r>
+      <w:r>
+        <w:t xml:space="preserve"> </w:t>
+      </w:r>
+      <w:r>
+        <w:t xml:space="preserve">|——–|——–|———-|——|———————|:——–:|</w:t>
+      </w:r>
+      <w:r>
+        <w:t xml:space="preserve"> </w:t>
+      </w:r>
+      <w:r>
+        <w:t xml:space="preserve">| 0956789012 | Henry | Pazmino | Estudiante | Computacion | 3 |</w:t>
+      </w:r>
+      <w:r>
+        <w:t xml:space="preserve"> </w:t>
+      </w:r>
+      <w:r>
+        <w:t xml:space="preserve">| 0956789013 | Jodie | Parrales | Estudiante | Computacion | 3 |</w:t>
+      </w:r>
+      <w:r>
+        <w:t xml:space="preserve"> </w:t>
+      </w:r>
+      <w:r>
+        <w:t xml:space="preserve">| 0956789014 | Cindy | Ayovi | Estudiante | Computacion | 3 |</w:t>
+      </w:r>
+      <w:r>
+        <w:t xml:space="preserve"> </w:t>
+      </w:r>
+      <w:r>
+        <w:t xml:space="preserve">| 0956789015 | Cesar | Gonzales | Estudiante | Computacion | 3 |</w:t>
+      </w:r>
+      <w:r>
+        <w:t xml:space="preserve"> </w:t>
+      </w:r>
+      <w:r>
+        <w:t xml:space="preserve">| 0956789016 | Mayra | Vera | Estudiante | Computacion | 3 |</w:t>
+      </w:r>
+      <w:r>
+        <w:t xml:space="preserve"> </w:t>
+      </w:r>
+      <w:r>
+        <w:t xml:space="preserve">| 0912345678 | Miguel | Velez | Docente | Sistemas | — |</w:t>
+      </w:r>
+      <w:r>
+        <w:t xml:space="preserve"> </w:t>
+      </w:r>
+      <w:r>
+        <w:t xml:space="preserve">| 0912345679 | Bryan | Velez | Docente | Computacion | — |</w:t>
+      </w:r>
+    </w:p>
+    <w:p>
+      <w:pPr>
+        <w:pStyle w:val="BodyText"/>
+      </w:pPr>
+      <w:r>
+        <w:rPr>
+          <w:b/>
+          <w:bCs/>
+        </w:rPr>
+        <w:t xml:space="preserve">libros:</w:t>
+      </w:r>
+      <w:r>
+        <w:t xml:space="preserve"> </w:t>
+      </w:r>
+      <w:r>
+        <w:t xml:space="preserve">| isbn | titulo | autor | ejemplares | disponibles |</w:t>
+      </w:r>
+      <w:r>
+        <w:t xml:space="preserve"> </w:t>
+      </w:r>
+      <w:r>
+        <w:t xml:space="preserve">|——|——–|——-|:———-:|:———–:|</w:t>
+      </w:r>
+      <w:r>
+        <w:t xml:space="preserve"> </w:t>
+      </w:r>
+      <w:r>
+        <w:t xml:space="preserve">| 978-0307474728 | Cien Años de Soledad | G. García Márquez | 3 | 3 |</w:t>
+      </w:r>
+      <w:r>
+        <w:t xml:space="preserve"> </w:t>
+      </w:r>
+      <w:r>
+        <w:t xml:space="preserve">| 978-0156012195 | El Principito | A. de Saint-Exupéry | 5 | 5 |</w:t>
+      </w:r>
+      <w:r>
+        <w:t xml:space="preserve"> </w:t>
+      </w:r>
+      <w:r>
+        <w:t xml:space="preserve">| 978-8420412146 | Don Quijote de la Mancha | M. de Cervantes | 2 | 2 |</w:t>
+      </w:r>
+      <w:r>
+        <w:t xml:space="preserve"> </w:t>
+      </w:r>
+      <w:r>
+        <w:t xml:space="preserve">| 978-8415552024 | Introducción a la Programación con Python | L. Joyanes | 4 | 4 |</w:t>
+      </w:r>
+      <w:r>
+        <w:t xml:space="preserve"> </w:t>
+      </w:r>
+      <w:r>
+        <w:t xml:space="preserve">| 978-0201000238 | Estructuras de Datos y Algoritmos | A. V. Aho | 2 | 2 |</w:t>
+      </w:r>
+      <w:r>
+        <w:t xml:space="preserve"> </w:t>
+      </w:r>
+      <w:r>
+        <w:t xml:space="preserve">| 978-8478290855 | Base de Datos SQL | C. J. Date | 3 | 3 |</w:t>
+      </w:r>
+      <w:r>
+        <w:t xml:space="preserve"> </w:t>
+      </w:r>
+      <w:r>
+        <w:t xml:space="preserve">| 978-6073205337 | Redes de Computadoras | A. S. Tanenbaum | 2 | 2 |</w:t>
+      </w:r>
+      <w:r>
+        <w:t xml:space="preserve"> </w:t>
+      </w:r>
+      <w:r>
+        <w:t xml:space="preserve">| 978-6073206037 | Ingeniería del Software | I. Sommerville | 2 | 2 |</w:t>
+      </w:r>
+    </w:p>
+    <w:bookmarkEnd w:id="79"/>
+    <w:bookmarkEnd w:id="80"/>
+    <w:bookmarkStart w:id="81" w:name="anexo-b-enlaces-del-proyecto"/>
+    <w:p>
+      <w:pPr>
+        <w:pStyle w:val="Heading3"/>
+      </w:pPr>
+      <w:r>
+        <w:t xml:space="preserve">16.2 Anexo B — Enlaces del proyecto</w:t>
       </w:r>
     </w:p>
     <w:tbl>
@@ -9713,14 +13566,14 @@
         </w:tc>
       </w:tr>
     </w:tbl>
-    <w:bookmarkEnd w:id="72"/>
-    <w:bookmarkStart w:id="73" w:name="anexo-b-stack-tecnológico"/>
+    <w:bookmarkEnd w:id="81"/>
+    <w:bookmarkStart w:id="82" w:name="anexo-c-stack-tecnológico"/>
     <w:p>
       <w:pPr>
         <w:pStyle w:val="Heading3"/>
       </w:pPr>
       <w:r>
-        <w:t xml:space="preserve">Anexo B — Stack tecnológico</w:t>
+        <w:t xml:space="preserve">16.3 Anexo C — Stack tecnológico</w:t>
       </w:r>
     </w:p>
     <w:tbl>
@@ -10082,9 +13935,9 @@
         <w:t xml:space="preserve">20 de julio de 2026</w:t>
       </w:r>
     </w:p>
-    <w:bookmarkEnd w:id="73"/>
-    <w:bookmarkEnd w:id="74"/>
-    <w:bookmarkEnd w:id="75"/>
+    <w:bookmarkEnd w:id="82"/>
+    <w:bookmarkEnd w:id="83"/>
+    <w:bookmarkEnd w:id="84"/>
     <w:sectPr/>
   </w:body>
 </w:document>
@@ -10506,6 +14359,39 @@
     <w:abstractNumId w:val="991"/>
   </w:num>
   <w:num w:numId="1015">
+    <w:abstractNumId w:val="99411"/>
+    <w:lvlOverride w:ilvl="0">
+      <w:startOverride w:val="1"/>
+    </w:lvlOverride>
+    <w:lvlOverride w:ilvl="1">
+      <w:startOverride w:val="1"/>
+    </w:lvlOverride>
+    <w:lvlOverride w:ilvl="2">
+      <w:startOverride w:val="1"/>
+    </w:lvlOverride>
+    <w:lvlOverride w:ilvl="3">
+      <w:startOverride w:val="1"/>
+    </w:lvlOverride>
+    <w:lvlOverride w:ilvl="4">
+      <w:startOverride w:val="1"/>
+    </w:lvlOverride>
+    <w:lvlOverride w:ilvl="5">
+      <w:startOverride w:val="1"/>
+    </w:lvlOverride>
+    <w:lvlOverride w:ilvl="6">
+      <w:startOverride w:val="1"/>
+    </w:lvlOverride>
+    <w:lvlOverride w:ilvl="7">
+      <w:startOverride w:val="1"/>
+    </w:lvlOverride>
+    <w:lvlOverride w:ilvl="8">
+      <w:startOverride w:val="1"/>
+    </w:lvlOverride>
+  </w:num>
+  <w:num w:numId="1016">
+    <w:abstractNumId w:val="991"/>
+  </w:num>
+  <w:num w:numId="1017">
     <w:abstractNumId w:val="99411"/>
     <w:lvlOverride w:ilvl="0">
       <w:startOverride w:val="1"/>

</xml_diff>

<commit_message>
docs: actualizar Gantt con tareas completadas, tabla estado final, historial commits hasta #20, regenerar DOCX y PDF
</commit_message>
<xml_diff>
--- a/docs/especificacion-proyecto.docx
+++ b/docs/especificacion-proyecto.docx
@@ -109,7 +109,7 @@
           <w:color w:val="2980B9"/>
           <w:sz w:val="12"/>
         </w:rPr>
-        <w:t>──────────────────</w:t>
+        <w:t>------------------</w:t>
       </w:r>
     </w:p>
     <w:p>
@@ -174,7 +174,7 @@
           <w:color w:val="2980B9"/>
           <w:sz w:val="12"/>
         </w:rPr>
-        <w:t>──────────────</w:t>
+        <w:t>--------------</w:t>
       </w:r>
     </w:p>
     <w:tbl>
@@ -184,8 +184,8 @@
         <w:tblLook w:firstColumn="1" w:firstRow="1" w:lastColumn="0" w:lastRow="0" w:noHBand="0" w:noVBand="1" w:val="04A0"/>
       </w:tblPr>
       <w:tblGrid>
-        <w:gridCol w:w="4513"/>
-        <w:gridCol w:w="4513"/>
+        <w:gridCol w:w="4680"/>
+        <w:gridCol w:w="4680"/>
       </w:tblGrid>
       <w:tr>
         <w:tc>
@@ -197,12 +197,6 @@
               <w:bottom w:val="none" w:sz="0" w:space="0" w:color="auto"/>
               <w:right w:val="none" w:sz="0" w:space="0" w:color="auto"/>
             </w:tcBorders>
-            <w:tcMar>
-              <w:top w:w="30" w:type="dxa"/>
-              <w:left w:w="60" w:type="dxa"/>
-              <w:bottom w:w="30" w:type="dxa"/>
-              <w:right w:w="60" w:type="dxa"/>
-            </w:tcMar>
           </w:tcPr>
           <w:p>
             <w:pPr>
@@ -229,17 +223,10 @@
               <w:bottom w:val="none" w:sz="0" w:space="0" w:color="auto"/>
               <w:right w:val="none" w:sz="0" w:space="0" w:color="auto"/>
             </w:tcBorders>
-            <w:tcMar>
-              <w:top w:w="30" w:type="dxa"/>
-              <w:left w:w="60" w:type="dxa"/>
-              <w:bottom w:w="30" w:type="dxa"/>
-              <w:right w:w="60" w:type="dxa"/>
-            </w:tcMar>
           </w:tcPr>
           <w:p>
             <w:pPr>
               <w:spacing w:before="20" w:after="20" w:line="240" w:lineRule="auto"/>
-              <w:jc w:val="left"/>
             </w:pPr>
             <w:r>
               <w:rPr>
@@ -262,12 +249,6 @@
               <w:bottom w:val="none" w:sz="0" w:space="0" w:color="auto"/>
               <w:right w:val="none" w:sz="0" w:space="0" w:color="auto"/>
             </w:tcBorders>
-            <w:tcMar>
-              <w:top w:w="30" w:type="dxa"/>
-              <w:left w:w="60" w:type="dxa"/>
-              <w:bottom w:w="30" w:type="dxa"/>
-              <w:right w:w="60" w:type="dxa"/>
-            </w:tcMar>
           </w:tcPr>
           <w:p>
             <w:pPr>
@@ -294,17 +275,10 @@
               <w:bottom w:val="none" w:sz="0" w:space="0" w:color="auto"/>
               <w:right w:val="none" w:sz="0" w:space="0" w:color="auto"/>
             </w:tcBorders>
-            <w:tcMar>
-              <w:top w:w="30" w:type="dxa"/>
-              <w:left w:w="60" w:type="dxa"/>
-              <w:bottom w:w="30" w:type="dxa"/>
-              <w:right w:w="60" w:type="dxa"/>
-            </w:tcMar>
           </w:tcPr>
           <w:p>
             <w:pPr>
               <w:spacing w:before="20" w:after="20" w:line="240" w:lineRule="auto"/>
-              <w:jc w:val="left"/>
             </w:pPr>
             <w:r>
               <w:rPr>
@@ -327,12 +301,6 @@
               <w:bottom w:val="none" w:sz="0" w:space="0" w:color="auto"/>
               <w:right w:val="none" w:sz="0" w:space="0" w:color="auto"/>
             </w:tcBorders>
-            <w:tcMar>
-              <w:top w:w="30" w:type="dxa"/>
-              <w:left w:w="60" w:type="dxa"/>
-              <w:bottom w:w="30" w:type="dxa"/>
-              <w:right w:w="60" w:type="dxa"/>
-            </w:tcMar>
           </w:tcPr>
           <w:p>
             <w:pPr>
@@ -359,17 +327,10 @@
               <w:bottom w:val="none" w:sz="0" w:space="0" w:color="auto"/>
               <w:right w:val="none" w:sz="0" w:space="0" w:color="auto"/>
             </w:tcBorders>
-            <w:tcMar>
-              <w:top w:w="30" w:type="dxa"/>
-              <w:left w:w="60" w:type="dxa"/>
-              <w:bottom w:w="30" w:type="dxa"/>
-              <w:right w:w="60" w:type="dxa"/>
-            </w:tcMar>
           </w:tcPr>
           <w:p>
             <w:pPr>
               <w:spacing w:before="20" w:after="20" w:line="240" w:lineRule="auto"/>
-              <w:jc w:val="left"/>
             </w:pPr>
             <w:r>
               <w:rPr>
@@ -392,12 +353,6 @@
               <w:bottom w:val="none" w:sz="0" w:space="0" w:color="auto"/>
               <w:right w:val="none" w:sz="0" w:space="0" w:color="auto"/>
             </w:tcBorders>
-            <w:tcMar>
-              <w:top w:w="30" w:type="dxa"/>
-              <w:left w:w="60" w:type="dxa"/>
-              <w:bottom w:w="30" w:type="dxa"/>
-              <w:right w:w="60" w:type="dxa"/>
-            </w:tcMar>
           </w:tcPr>
           <w:p>
             <w:pPr>
@@ -424,17 +379,10 @@
               <w:bottom w:val="none" w:sz="0" w:space="0" w:color="auto"/>
               <w:right w:val="none" w:sz="0" w:space="0" w:color="auto"/>
             </w:tcBorders>
-            <w:tcMar>
-              <w:top w:w="30" w:type="dxa"/>
-              <w:left w:w="60" w:type="dxa"/>
-              <w:bottom w:w="30" w:type="dxa"/>
-              <w:right w:w="60" w:type="dxa"/>
-            </w:tcMar>
           </w:tcPr>
           <w:p>
             <w:pPr>
               <w:spacing w:before="20" w:after="20" w:line="240" w:lineRule="auto"/>
-              <w:jc w:val="left"/>
             </w:pPr>
             <w:r>
               <w:rPr>
@@ -457,12 +405,6 @@
               <w:bottom w:val="none" w:sz="0" w:space="0" w:color="auto"/>
               <w:right w:val="none" w:sz="0" w:space="0" w:color="auto"/>
             </w:tcBorders>
-            <w:tcMar>
-              <w:top w:w="30" w:type="dxa"/>
-              <w:left w:w="60" w:type="dxa"/>
-              <w:bottom w:w="30" w:type="dxa"/>
-              <w:right w:w="60" w:type="dxa"/>
-            </w:tcMar>
           </w:tcPr>
           <w:p>
             <w:pPr>
@@ -489,17 +431,10 @@
               <w:bottom w:val="none" w:sz="0" w:space="0" w:color="auto"/>
               <w:right w:val="none" w:sz="0" w:space="0" w:color="auto"/>
             </w:tcBorders>
-            <w:tcMar>
-              <w:top w:w="30" w:type="dxa"/>
-              <w:left w:w="60" w:type="dxa"/>
-              <w:bottom w:w="30" w:type="dxa"/>
-              <w:right w:w="60" w:type="dxa"/>
-            </w:tcMar>
           </w:tcPr>
           <w:p>
             <w:pPr>
               <w:spacing w:before="20" w:after="20" w:line="240" w:lineRule="auto"/>
-              <w:jc w:val="left"/>
             </w:pPr>
             <w:r>
               <w:rPr>
@@ -507,7 +442,7 @@
                 <w:color w:val="1E1E1E"/>
                 <w:sz w:val="18"/>
               </w:rPr>
-              <w:t>3SA — Computacion en Linea</w:t>
+              <w:t>3SA - Computacion en Linea</w:t>
             </w:r>
           </w:p>
         </w:tc>
@@ -522,12 +457,6 @@
               <w:bottom w:val="none" w:sz="0" w:space="0" w:color="auto"/>
               <w:right w:val="none" w:sz="0" w:space="0" w:color="auto"/>
             </w:tcBorders>
-            <w:tcMar>
-              <w:top w:w="30" w:type="dxa"/>
-              <w:left w:w="60" w:type="dxa"/>
-              <w:bottom w:w="30" w:type="dxa"/>
-              <w:right w:w="60" w:type="dxa"/>
-            </w:tcMar>
           </w:tcPr>
           <w:p>
             <w:pPr>
@@ -554,17 +483,10 @@
               <w:bottom w:val="none" w:sz="0" w:space="0" w:color="auto"/>
               <w:right w:val="none" w:sz="0" w:space="0" w:color="auto"/>
             </w:tcBorders>
-            <w:tcMar>
-              <w:top w:w="30" w:type="dxa"/>
-              <w:left w:w="60" w:type="dxa"/>
-              <w:bottom w:w="30" w:type="dxa"/>
-              <w:right w:w="60" w:type="dxa"/>
-            </w:tcMar>
           </w:tcPr>
           <w:p>
             <w:pPr>
               <w:spacing w:before="20" w:after="20" w:line="240" w:lineRule="auto"/>
-              <w:jc w:val="left"/>
             </w:pPr>
             <w:r>
               <w:rPr>
@@ -600,7 +522,7 @@
           <w:color w:val="828282"/>
           <w:sz w:val="16"/>
         </w:rPr>
-        <w:t>Guayaquil — Ecuador</w:t>
+        <w:t>Guayaquil - Ecuador</w:t>
       </w:r>
     </w:p>
     <w:p>
@@ -611,7 +533,7 @@
     <w:sectPr>
       <w:headerReference w:type="default" r:id="rId9"/>
       <w:footerReference w:type="default" r:id="rId10"/>
-      <w:pgSz w:w="11906" w:h="16838"/>
+      <w:pgSz w:w="12240" w:h="15840"/>
       <w:pgMar w:top="1440" w:right="1440" w:bottom="1440" w:left="1440" w:header="720" w:footer="720" w:gutter="0"/>
       <w:cols w:space="720"/>
       <w:docGrid w:linePitch="360"/>
@@ -5302,6 +5224,398 @@
           </w:p>
         </w:tc>
       </w:tr>
+      <w:tr>
+        <w:tc>
+          <w:tcPr/>
+          <w:p>
+            <w:pPr>
+              <w:pStyle w:val="Compact"/>
+            </w:pPr>
+          </w:p>
+        </w:tc>
+        <w:tc>
+          <w:tcPr/>
+          <w:p>
+            <w:pPr>
+              <w:pStyle w:val="Compact"/>
+              <w:jc w:val="center"/>
+            </w:pPr>
+            <w:r>
+              <w:t xml:space="preserve">13</w:t>
+            </w:r>
+          </w:p>
+        </w:tc>
+        <w:tc>
+          <w:tcPr/>
+          <w:p>
+            <w:pPr>
+              <w:pStyle w:val="Compact"/>
+              <w:jc w:val="center"/>
+            </w:pPr>
+            <w:r>
+              <w:t xml:space="preserve">20 jul</w:t>
+            </w:r>
+          </w:p>
+        </w:tc>
+        <w:tc>
+          <w:tcPr/>
+          <w:p>
+            <w:pPr>
+              <w:pStyle w:val="Compact"/>
+              <w:jc w:val="left"/>
+            </w:pPr>
+            <w:r>
+              <w:rPr>
+                <w:rStyle w:val="VerbatimChar"/>
+              </w:rPr>
+              <w:t xml:space="preserve">11cf096</w:t>
+            </w:r>
+          </w:p>
+        </w:tc>
+      </w:tr>
+      <w:tr>
+        <w:tc>
+          <w:tcPr/>
+          <w:p>
+            <w:pPr>
+              <w:pStyle w:val="Compact"/>
+            </w:pPr>
+          </w:p>
+        </w:tc>
+        <w:tc>
+          <w:tcPr/>
+          <w:p>
+            <w:pPr>
+              <w:pStyle w:val="Compact"/>
+              <w:jc w:val="center"/>
+            </w:pPr>
+            <w:r>
+              <w:t xml:space="preserve">14</w:t>
+            </w:r>
+          </w:p>
+        </w:tc>
+        <w:tc>
+          <w:tcPr/>
+          <w:p>
+            <w:pPr>
+              <w:pStyle w:val="Compact"/>
+              <w:jc w:val="center"/>
+            </w:pPr>
+            <w:r>
+              <w:t xml:space="preserve">20 jul</w:t>
+            </w:r>
+          </w:p>
+        </w:tc>
+        <w:tc>
+          <w:tcPr/>
+          <w:p>
+            <w:pPr>
+              <w:pStyle w:val="Compact"/>
+              <w:jc w:val="left"/>
+            </w:pPr>
+            <w:r>
+              <w:rPr>
+                <w:rStyle w:val="VerbatimChar"/>
+              </w:rPr>
+              <w:t xml:space="preserve">f5ee021</w:t>
+            </w:r>
+          </w:p>
+        </w:tc>
+      </w:tr>
+      <w:tr>
+        <w:tc>
+          <w:tcPr/>
+          <w:p>
+            <w:pPr>
+              <w:pStyle w:val="Compact"/>
+            </w:pPr>
+          </w:p>
+        </w:tc>
+        <w:tc>
+          <w:tcPr/>
+          <w:p>
+            <w:pPr>
+              <w:pStyle w:val="Compact"/>
+              <w:jc w:val="center"/>
+            </w:pPr>
+            <w:r>
+              <w:t xml:space="preserve">15</w:t>
+            </w:r>
+          </w:p>
+        </w:tc>
+        <w:tc>
+          <w:tcPr/>
+          <w:p>
+            <w:pPr>
+              <w:pStyle w:val="Compact"/>
+              <w:jc w:val="center"/>
+            </w:pPr>
+            <w:r>
+              <w:t xml:space="preserve">20 jul</w:t>
+            </w:r>
+          </w:p>
+        </w:tc>
+        <w:tc>
+          <w:tcPr/>
+          <w:p>
+            <w:pPr>
+              <w:pStyle w:val="Compact"/>
+              <w:jc w:val="left"/>
+            </w:pPr>
+            <w:r>
+              <w:rPr>
+                <w:rStyle w:val="VerbatimChar"/>
+              </w:rPr>
+              <w:t xml:space="preserve">bdbca88</w:t>
+            </w:r>
+          </w:p>
+        </w:tc>
+      </w:tr>
+      <w:tr>
+        <w:tc>
+          <w:tcPr/>
+          <w:p>
+            <w:pPr>
+              <w:pStyle w:val="Compact"/>
+            </w:pPr>
+          </w:p>
+        </w:tc>
+        <w:tc>
+          <w:tcPr/>
+          <w:p>
+            <w:pPr>
+              <w:pStyle w:val="Compact"/>
+              <w:jc w:val="center"/>
+            </w:pPr>
+            <w:r>
+              <w:t xml:space="preserve">16</w:t>
+            </w:r>
+          </w:p>
+        </w:tc>
+        <w:tc>
+          <w:tcPr/>
+          <w:p>
+            <w:pPr>
+              <w:pStyle w:val="Compact"/>
+              <w:jc w:val="center"/>
+            </w:pPr>
+            <w:r>
+              <w:t xml:space="preserve">20 jul</w:t>
+            </w:r>
+          </w:p>
+        </w:tc>
+        <w:tc>
+          <w:tcPr/>
+          <w:p>
+            <w:pPr>
+              <w:pStyle w:val="Compact"/>
+              <w:jc w:val="left"/>
+            </w:pPr>
+            <w:r>
+              <w:rPr>
+                <w:rStyle w:val="VerbatimChar"/>
+              </w:rPr>
+              <w:t xml:space="preserve">5b31576</w:t>
+            </w:r>
+          </w:p>
+        </w:tc>
+      </w:tr>
+      <w:tr>
+        <w:tc>
+          <w:tcPr/>
+          <w:p>
+            <w:pPr>
+              <w:pStyle w:val="Compact"/>
+            </w:pPr>
+          </w:p>
+        </w:tc>
+        <w:tc>
+          <w:tcPr/>
+          <w:p>
+            <w:pPr>
+              <w:pStyle w:val="Compact"/>
+              <w:jc w:val="center"/>
+            </w:pPr>
+            <w:r>
+              <w:t xml:space="preserve">17</w:t>
+            </w:r>
+          </w:p>
+        </w:tc>
+        <w:tc>
+          <w:tcPr/>
+          <w:p>
+            <w:pPr>
+              <w:pStyle w:val="Compact"/>
+              <w:jc w:val="center"/>
+            </w:pPr>
+            <w:r>
+              <w:t xml:space="preserve">20 jul</w:t>
+            </w:r>
+          </w:p>
+        </w:tc>
+        <w:tc>
+          <w:tcPr/>
+          <w:p>
+            <w:pPr>
+              <w:pStyle w:val="Compact"/>
+              <w:jc w:val="left"/>
+            </w:pPr>
+            <w:r>
+              <w:rPr>
+                <w:rStyle w:val="VerbatimChar"/>
+              </w:rPr>
+              <w:t xml:space="preserve">cd3f461</w:t>
+            </w:r>
+          </w:p>
+        </w:tc>
+      </w:tr>
+      <w:tr>
+        <w:tc>
+          <w:tcPr/>
+          <w:p>
+            <w:pPr>
+              <w:pStyle w:val="Compact"/>
+            </w:pPr>
+          </w:p>
+        </w:tc>
+        <w:tc>
+          <w:tcPr/>
+          <w:p>
+            <w:pPr>
+              <w:pStyle w:val="Compact"/>
+              <w:jc w:val="center"/>
+            </w:pPr>
+            <w:r>
+              <w:t xml:space="preserve">18</w:t>
+            </w:r>
+          </w:p>
+        </w:tc>
+        <w:tc>
+          <w:tcPr/>
+          <w:p>
+            <w:pPr>
+              <w:pStyle w:val="Compact"/>
+              <w:jc w:val="center"/>
+            </w:pPr>
+            <w:r>
+              <w:t xml:space="preserve">20 jul</w:t>
+            </w:r>
+          </w:p>
+        </w:tc>
+        <w:tc>
+          <w:tcPr/>
+          <w:p>
+            <w:pPr>
+              <w:pStyle w:val="Compact"/>
+              <w:jc w:val="left"/>
+            </w:pPr>
+            <w:r>
+              <w:rPr>
+                <w:rStyle w:val="VerbatimChar"/>
+              </w:rPr>
+              <w:t xml:space="preserve">b9799eb</w:t>
+            </w:r>
+          </w:p>
+        </w:tc>
+      </w:tr>
+      <w:tr>
+        <w:tc>
+          <w:tcPr/>
+          <w:p>
+            <w:pPr>
+              <w:pStyle w:val="Compact"/>
+            </w:pPr>
+          </w:p>
+        </w:tc>
+        <w:tc>
+          <w:tcPr/>
+          <w:p>
+            <w:pPr>
+              <w:pStyle w:val="Compact"/>
+              <w:jc w:val="center"/>
+            </w:pPr>
+            <w:r>
+              <w:t xml:space="preserve">19</w:t>
+            </w:r>
+          </w:p>
+        </w:tc>
+        <w:tc>
+          <w:tcPr/>
+          <w:p>
+            <w:pPr>
+              <w:pStyle w:val="Compact"/>
+              <w:jc w:val="center"/>
+            </w:pPr>
+            <w:r>
+              <w:t xml:space="preserve">20 jul</w:t>
+            </w:r>
+          </w:p>
+        </w:tc>
+        <w:tc>
+          <w:tcPr/>
+          <w:p>
+            <w:pPr>
+              <w:pStyle w:val="Compact"/>
+              <w:jc w:val="left"/>
+            </w:pPr>
+            <w:r>
+              <w:rPr>
+                <w:rStyle w:val="VerbatimChar"/>
+              </w:rPr>
+              <w:t xml:space="preserve">782f1a5</w:t>
+            </w:r>
+          </w:p>
+        </w:tc>
+      </w:tr>
+      <w:tr>
+        <w:tc>
+          <w:tcPr/>
+          <w:p>
+            <w:pPr>
+              <w:pStyle w:val="Compact"/>
+            </w:pPr>
+          </w:p>
+        </w:tc>
+        <w:tc>
+          <w:tcPr/>
+          <w:p>
+            <w:pPr>
+              <w:pStyle w:val="Compact"/>
+              <w:jc w:val="center"/>
+            </w:pPr>
+            <w:r>
+              <w:t xml:space="preserve">20</w:t>
+            </w:r>
+          </w:p>
+        </w:tc>
+        <w:tc>
+          <w:tcPr/>
+          <w:p>
+            <w:pPr>
+              <w:pStyle w:val="Compact"/>
+              <w:jc w:val="center"/>
+            </w:pPr>
+            <w:r>
+              <w:t xml:space="preserve">20 jul</w:t>
+            </w:r>
+          </w:p>
+        </w:tc>
+        <w:tc>
+          <w:tcPr/>
+          <w:p>
+            <w:pPr>
+              <w:pStyle w:val="Compact"/>
+              <w:jc w:val="left"/>
+            </w:pPr>
+            <w:r>
+              <w:rPr>
+                <w:rStyle w:val="VerbatimChar"/>
+              </w:rPr>
+              <w:t xml:space="preserve">782f1a5</w:t>
+            </w:r>
+          </w:p>
+        </w:tc>
+      </w:tr>
     </w:tbl>
     <w:bookmarkEnd xmlns:a="http://schemas.openxmlformats.org/drawingml/2006/main" xmlns:pic="http://schemas.openxmlformats.org/drawingml/2006/picture" w:id="52"/>
     <w:p xmlns:a="http://schemas.openxmlformats.org/drawingml/2006/main" xmlns:pic="http://schemas.openxmlformats.org/drawingml/2006/picture">
@@ -5486,7 +5800,7 @@
         <w:rPr>
           <w:rStyle w:val="VerbatimChar"/>
         </w:rPr>
-        <w:t xml:space="preserve">───────────────────────────────────────────────────────</w:t>
+        <w:t xml:space="preserve">────────────────────────────────────────────────────────────</w:t>
       </w:r>
       <w:r>
         <w:br/>
@@ -5504,7 +5818,7 @@
         <w:rPr>
           <w:rStyle w:val="VerbatimChar"/>
         </w:rPr>
-        <w:t xml:space="preserve">                       | a jue 10| 10 jul| 13-17  | 20 jul</w:t>
+        <w:t xml:space="preserve">                       | a jue | 10 jul | 13-17  | 20 jul</w:t>
       </w:r>
       <w:r>
         <w:br/>
@@ -5513,7 +5827,7 @@
         <w:rPr>
           <w:rStyle w:val="VerbatimChar"/>
         </w:rPr>
-        <w:t xml:space="preserve">───────────────────────────────────────────────────────</w:t>
+        <w:t xml:space="preserve">                       | 10    |        |        |</w:t>
       </w:r>
       <w:r>
         <w:br/>
@@ -5522,7 +5836,7 @@
         <w:rPr>
           <w:rStyle w:val="VerbatimChar"/>
         </w:rPr>
-        <w:t xml:space="preserve">Inicio del proyecto    | ████  |        |        |</w:t>
+        <w:t xml:space="preserve">────────────────────────────────────────────────────────────</w:t>
       </w:r>
       <w:r>
         <w:br/>
@@ -5531,6 +5845,15 @@
         <w:rPr>
           <w:rStyle w:val="VerbatimChar"/>
         </w:rPr>
+        <w:t xml:space="preserve">Inicio del proyecto    | █████ |  ████  |        |</w:t>
+      </w:r>
+      <w:r>
+        <w:br/>
+      </w:r>
+      <w:r>
+        <w:rPr>
+          <w:rStyle w:val="VerbatimChar"/>
+        </w:rPr>
         <w:t xml:space="preserve">(planificación, repo)  |       |        |        |</w:t>
       </w:r>
       <w:r>
@@ -5549,7 +5872,7 @@
         <w:rPr>
           <w:rStyle w:val="VerbatimChar"/>
         </w:rPr>
-        <w:t xml:space="preserve">Modelos POO            |  ████ |        |        |</w:t>
+        <w:t xml:space="preserve">Modelos POO            | █████ |  ████  |        |</w:t>
       </w:r>
       <w:r>
         <w:br/>
@@ -5585,7 +5908,7 @@
         <w:rPr>
           <w:rStyle w:val="VerbatimChar"/>
         </w:rPr>
-        <w:t xml:space="preserve">Estructuras de datos   |   ████|        |        |</w:t>
+        <w:t xml:space="preserve">Estructuras de datos   | █████ |  ████  |        |</w:t>
       </w:r>
       <w:r>
         <w:br/>
@@ -5612,7 +5935,7 @@
         <w:rPr>
           <w:rStyle w:val="VerbatimChar"/>
         </w:rPr>
-        <w:t xml:space="preserve">Algoritmos             |    ███|        |        |</w:t>
+        <w:t xml:space="preserve">Algoritmos             | █████ |  ████  |        |</w:t>
       </w:r>
       <w:r>
         <w:br/>
@@ -5639,7 +5962,7 @@
         <w:rPr>
           <w:rStyle w:val="VerbatimChar"/>
         </w:rPr>
-        <w:t xml:space="preserve">Base de datos SQLite   |     ██|        |        |</w:t>
+        <w:t xml:space="preserve">Base de datos SQLite   | █████ |  ████  |        |</w:t>
       </w:r>
       <w:r>
         <w:br/>
@@ -5666,7 +5989,7 @@
         <w:rPr>
           <w:rStyle w:val="VerbatimChar"/>
         </w:rPr>
-        <w:t xml:space="preserve">GUI Tkinter (stubs)    |      █|        |        |</w:t>
+        <w:t xml:space="preserve">GUI Tkinter (stubs)    | █████ |  ████  |        |</w:t>
       </w:r>
       <w:r>
         <w:br/>
@@ -5684,7 +6007,7 @@
         <w:rPr>
           <w:rStyle w:val="VerbatimChar"/>
         </w:rPr>
-        <w:t xml:space="preserve">Documento Especificación|      █|   █    |        |</w:t>
+        <w:t xml:space="preserve">Documento Especificación| █████|  ████  | ██████ |</w:t>
       </w:r>
       <w:r>
         <w:br/>
@@ -5693,7 +6016,7 @@
         <w:rPr>
           <w:rStyle w:val="VerbatimChar"/>
         </w:rPr>
-        <w:t xml:space="preserve">(50%)                  |       |        |        |</w:t>
+        <w:t xml:space="preserve">(100%)                 |       |        |        |</w:t>
       </w:r>
       <w:r>
         <w:br/>
@@ -5738,7 +6061,7 @@
         <w:rPr>
           <w:rStyle w:val="VerbatimChar"/>
         </w:rPr>
-        <w:t xml:space="preserve">GUI funcional completa |       |        | ██████ |</w:t>
+        <w:t xml:space="preserve">GUI funcional completa |       |        | ██████ | ███</w:t>
       </w:r>
       <w:r>
         <w:br/>
@@ -5765,7 +6088,7 @@
         <w:rPr>
           <w:rStyle w:val="VerbatimChar"/>
         </w:rPr>
-        <w:t xml:space="preserve">BD poblada + reports   |       |        |  ████  |</w:t>
+        <w:t xml:space="preserve">BD poblada + reports   |       |        | ██████ | ███</w:t>
       </w:r>
       <w:r>
         <w:br/>
@@ -5792,7 +6115,7 @@
         <w:rPr>
           <w:rStyle w:val="VerbatimChar"/>
         </w:rPr>
-        <w:t xml:space="preserve">Pruebas unitarias      |       |        |   ███  |</w:t>
+        <w:t xml:space="preserve">Pruebas unitarias      |       |        | ██████ | ███</w:t>
       </w:r>
       <w:r>
         <w:br/>
@@ -5801,6 +6124,15 @@
         <w:rPr>
           <w:rStyle w:val="VerbatimChar"/>
         </w:rPr>
+        <w:t xml:space="preserve">(11 tests)             |       |        |        |</w:t>
+      </w:r>
+      <w:r>
+        <w:br/>
+      </w:r>
+      <w:r>
+        <w:rPr>
+          <w:rStyle w:val="VerbatimChar"/>
+        </w:rPr>
         <w:t xml:space="preserve">                       |       |        |        |</w:t>
       </w:r>
       <w:r>
@@ -5810,7 +6142,7 @@
         <w:rPr>
           <w:rStyle w:val="VerbatimChar"/>
         </w:rPr>
-        <w:t xml:space="preserve">Manual de usuario      |       |        |    ██  |</w:t>
+        <w:t xml:space="preserve">Manual de usuario      |       |        | ██████ | ███</w:t>
       </w:r>
       <w:r>
         <w:br/>
@@ -5819,7 +6151,7 @@
         <w:rPr>
           <w:rStyle w:val="VerbatimChar"/>
         </w:rPr>
-        <w:t xml:space="preserve">(capturas de pantalla) |       |        |        |</w:t>
+        <w:t xml:space="preserve">(8 capturas pantalla)  |       |        |        |</w:t>
       </w:r>
       <w:r>
         <w:br/>
@@ -5837,6 +6169,33 @@
         <w:rPr>
           <w:rStyle w:val="VerbatimChar"/>
         </w:rPr>
+        <w:t xml:space="preserve">Formato PDF académico  |       |        |        | ████</w:t>
+      </w:r>
+      <w:r>
+        <w:br/>
+      </w:r>
+      <w:r>
+        <w:rPr>
+          <w:rStyle w:val="VerbatimChar"/>
+        </w:rPr>
+        <w:t xml:space="preserve">(documento final)      |       |        |        |</w:t>
+      </w:r>
+      <w:r>
+        <w:br/>
+      </w:r>
+      <w:r>
+        <w:rPr>
+          <w:rStyle w:val="VerbatimChar"/>
+        </w:rPr>
+        <w:t xml:space="preserve">                       |       |        |        |</w:t>
+      </w:r>
+      <w:r>
+        <w:br/>
+      </w:r>
+      <w:r>
+        <w:rPr>
+          <w:rStyle w:val="VerbatimChar"/>
+        </w:rPr>
         <w:t xml:space="preserve">─── ENTREGA FINAL ──── |       |        |        |   ●</w:t>
       </w:r>
       <w:r>
@@ -5864,7 +6223,7 @@
         <w:rPr>
           <w:rStyle w:val="VerbatimChar"/>
         </w:rPr>
-        <w:t xml:space="preserve">Defensa oral           |       |        |        |   ●</w:t>
+        <w:t xml:space="preserve">Defensa oral           |       |        |        |   →</w:t>
       </w:r>
       <w:r>
         <w:br/>
@@ -5882,7 +6241,7 @@
         <w:rPr>
           <w:rStyle w:val="VerbatimChar"/>
         </w:rPr>
-        <w:t xml:space="preserve">───────────────────────────────────────────────────────</w:t>
+        <w:t xml:space="preserve">────────────────────────────────────────────────────────────</w:t>
       </w:r>
     </w:p>
     <w:bookmarkEnd xmlns:a="http://schemas.openxmlformats.org/drawingml/2006/main" xmlns:pic="http://schemas.openxmlformats.org/drawingml/2006/picture" w:id="55"/>
@@ -5891,7 +6250,7 @@
         <w:pStyle w:val="Heading3"/>
       </w:pPr>
       <w:r>
-        <w:t xml:space="preserve">9.1.2 Prioridades para la Semana 13 (13-17 julio)</w:t>
+        <w:t xml:space="preserve">9.1.2 Estado Final del Proyecto</w:t>
       </w:r>
     </w:p>
     <w:tbl xmlns:a="http://schemas.openxmlformats.org/drawingml/2006/main" xmlns:pic="http://schemas.openxmlformats.org/drawingml/2006/picture">
@@ -5903,9 +6262,10 @@
         <w:tblLook w:firstRow="1" w:lastRow="0" w:firstColumn="0" w:lastColumn="0" w:noHBand="0" w:noVBand="0" w:val="0020"/>
       </w:tblPr>
       <w:tblGrid>
-        <w:gridCol w:w="2810"/>
-        <w:gridCol w:w="1788"/>
-        <w:gridCol w:w="3321"/>
+        <w:gridCol w:w="1195"/>
+        <w:gridCol w:w="1195"/>
+        <w:gridCol w:w="3436"/>
+        <w:gridCol w:w="2092"/>
       </w:tblGrid>
       <w:tr>
         <w:trPr>
@@ -5919,7 +6279,31 @@
               <w:jc w:val="center"/>
             </w:pPr>
             <w:r>
-              <w:t xml:space="preserve">Prioridad</w:t>
+              <w:t xml:space="preserve">Módulo</w:t>
+            </w:r>
+          </w:p>
+        </w:tc>
+        <w:tc>
+          <w:tcPr/>
+          <w:p>
+            <w:pPr>
+              <w:pStyle w:val="Compact"/>
+              <w:jc w:val="center"/>
+            </w:pPr>
+            <w:r>
+              <w:t xml:space="preserve">Estado</w:t>
+            </w:r>
+          </w:p>
+        </w:tc>
+        <w:tc>
+          <w:tcPr/>
+          <w:p>
+            <w:pPr>
+              <w:pStyle w:val="Compact"/>
+              <w:jc w:val="center"/>
+            </w:pPr>
+            <w:r>
+              <w:t xml:space="preserve">Fecha de finalización</w:t>
             </w:r>
           </w:p>
         </w:tc>
@@ -5931,19 +6315,7 @@
               <w:jc w:val="left"/>
             </w:pPr>
             <w:r>
-              <w:t xml:space="preserve">Tarea</w:t>
-            </w:r>
-          </w:p>
-        </w:tc>
-        <w:tc>
-          <w:tcPr/>
-          <w:p>
-            <w:pPr>
-              <w:pStyle w:val="Compact"/>
-              <w:jc w:val="left"/>
-            </w:pPr>
-            <w:r>
-              <w:t xml:space="preserve">Responsable</w:t>
+              <w:t xml:space="preserve">Observaciones</w:t>
             </w:r>
           </w:p>
         </w:tc>
@@ -5957,36 +6329,10 @@
               <w:jc w:val="center"/>
             </w:pPr>
             <w:r>
-              <w:t xml:space="preserve">🔴 Alta</w:t>
+              <w:t xml:space="preserve">Modelos POO (7 clases)</w:t>
             </w:r>
           </w:p>
         </w:tc>
-        <w:tc>
-          <w:tcPr/>
-          <w:p>
-            <w:pPr>
-              <w:pStyle w:val="Compact"/>
-              <w:jc w:val="left"/>
-            </w:pPr>
-            <w:r>
-              <w:t xml:space="preserve">Implementar formularios CRUD en GUI (Registrar Socio, Agregar Libro)</w:t>
-            </w:r>
-          </w:p>
-        </w:tc>
-        <w:tc>
-          <w:tcPr/>
-          <w:p>
-            <w:pPr>
-              <w:pStyle w:val="Compact"/>
-              <w:jc w:val="left"/>
-            </w:pPr>
-            <w:r>
-              <w:t xml:space="preserve">Jodie Parrales</w:t>
-            </w:r>
-          </w:p>
-        </w:tc>
-      </w:tr>
-      <w:tr>
         <w:tc>
           <w:tcPr/>
           <w:p>
@@ -6004,10 +6350,10 @@
           <w:p>
             <w:pPr>
               <w:pStyle w:val="Compact"/>
-              <w:jc w:val="left"/>
+              <w:jc w:val="center"/>
             </w:pPr>
             <w:r>
-              <w:t xml:space="preserve">Poblar la base de datos con datos de prueba (seed.py — 7 socios + 8 libros)</w:t>
+              <w:t xml:space="preserve">10-jul</w:t>
             </w:r>
           </w:p>
         </w:tc>
@@ -6019,7 +6365,7 @@
               <w:jc w:val="left"/>
             </w:pPr>
             <w:r>
-              <w:t xml:space="preserve">Cindy Ayoví</w:t>
+              <w:t xml:space="preserve">Herencia, encapsulamiento, polimorfismo</w:t>
             </w:r>
           </w:p>
         </w:tc>
@@ -6033,7 +6379,31 @@
               <w:jc w:val="center"/>
             </w:pPr>
             <w:r>
-              <w:t xml:space="preserve">🟡 Media</w:t>
+              <w:t xml:space="preserve">Estructuras de datos (3)</w:t>
+            </w:r>
+          </w:p>
+        </w:tc>
+        <w:tc>
+          <w:tcPr/>
+          <w:p>
+            <w:pPr>
+              <w:pStyle w:val="Compact"/>
+              <w:jc w:val="center"/>
+            </w:pPr>
+            <w:r>
+              <w:t xml:space="preserve">✅ Completado</w:t>
+            </w:r>
+          </w:p>
+        </w:tc>
+        <w:tc>
+          <w:tcPr/>
+          <w:p>
+            <w:pPr>
+              <w:pStyle w:val="Compact"/>
+              <w:jc w:val="center"/>
+            </w:pPr>
+            <w:r>
+              <w:t xml:space="preserve">10-jul</w:t>
             </w:r>
           </w:p>
         </w:tc>
@@ -6045,19 +6415,7 @@
               <w:jc w:val="left"/>
             </w:pPr>
             <w:r>
-              <w:t xml:space="preserve">Completar lógica de préstamos y devoluciones en GUI</w:t>
-            </w:r>
-          </w:p>
-        </w:tc>
-        <w:tc>
-          <w:tcPr/>
-          <w:p>
-            <w:pPr>
-              <w:pStyle w:val="Compact"/>
-              <w:jc w:val="left"/>
-            </w:pPr>
-            <w:r>
-              <w:t xml:space="preserve">Jodie + Cesar</w:t>
+              <w:t xml:space="preserve">LinkedList, Queue, Stack</w:t>
             </w:r>
           </w:p>
         </w:tc>
@@ -6071,7 +6429,31 @@
               <w:jc w:val="center"/>
             </w:pPr>
             <w:r>
-              <w:t xml:space="preserve">🟡 Media</w:t>
+              <w:t xml:space="preserve">Algoritmos (6)</w:t>
+            </w:r>
+          </w:p>
+        </w:tc>
+        <w:tc>
+          <w:tcPr/>
+          <w:p>
+            <w:pPr>
+              <w:pStyle w:val="Compact"/>
+              <w:jc w:val="center"/>
+            </w:pPr>
+            <w:r>
+              <w:t xml:space="preserve">✅ Completado</w:t>
+            </w:r>
+          </w:p>
+        </w:tc>
+        <w:tc>
+          <w:tcPr/>
+          <w:p>
+            <w:pPr>
+              <w:pStyle w:val="Compact"/>
+              <w:jc w:val="center"/>
+            </w:pPr>
+            <w:r>
+              <w:t xml:space="preserve">10-jul</w:t>
             </w:r>
           </w:p>
         </w:tc>
@@ -6083,19 +6465,7 @@
               <w:jc w:val="left"/>
             </w:pPr>
             <w:r>
-              <w:t xml:space="preserve">Pruebas de integración módulo BD + GUI</w:t>
-            </w:r>
-          </w:p>
-        </w:tc>
-        <w:tc>
-          <w:tcPr/>
-          <w:p>
-            <w:pPr>
-              <w:pStyle w:val="Compact"/>
-              <w:jc w:val="left"/>
-            </w:pPr>
-            <w:r>
-              <w:t xml:space="preserve">Mayra Vera</w:t>
+              <w:t xml:space="preserve">Bubble, Insertion, Merge, Quick, Lineal, Binaria</w:t>
             </w:r>
           </w:p>
         </w:tc>
@@ -6109,7 +6479,31 @@
               <w:jc w:val="center"/>
             </w:pPr>
             <w:r>
-              <w:t xml:space="preserve">🟢 Baja</w:t>
+              <w:t xml:space="preserve">Base de datos SQLite (4 tablas)</w:t>
+            </w:r>
+          </w:p>
+        </w:tc>
+        <w:tc>
+          <w:tcPr/>
+          <w:p>
+            <w:pPr>
+              <w:pStyle w:val="Compact"/>
+              <w:jc w:val="center"/>
+            </w:pPr>
+            <w:r>
+              <w:t xml:space="preserve">✅ Completado</w:t>
+            </w:r>
+          </w:p>
+        </w:tc>
+        <w:tc>
+          <w:tcPr/>
+          <w:p>
+            <w:pPr>
+              <w:pStyle w:val="Compact"/>
+              <w:jc w:val="center"/>
+            </w:pPr>
+            <w:r>
+              <w:t xml:space="preserve">11-jul</w:t>
             </w:r>
           </w:p>
         </w:tc>
@@ -6121,7 +6515,45 @@
               <w:jc w:val="left"/>
             </w:pPr>
             <w:r>
-              <w:t xml:space="preserve">Manual de usuario con capturas de pantalla</w:t>
+              <w:t xml:space="preserve">socios, libros, prestamos, reservas</w:t>
+            </w:r>
+          </w:p>
+        </w:tc>
+      </w:tr>
+      <w:tr>
+        <w:tc>
+          <w:tcPr/>
+          <w:p>
+            <w:pPr>
+              <w:pStyle w:val="Compact"/>
+              <w:jc w:val="center"/>
+            </w:pPr>
+            <w:r>
+              <w:t xml:space="preserve">Repositorios CRUD (4)</w:t>
+            </w:r>
+          </w:p>
+        </w:tc>
+        <w:tc>
+          <w:tcPr/>
+          <w:p>
+            <w:pPr>
+              <w:pStyle w:val="Compact"/>
+              <w:jc w:val="center"/>
+            </w:pPr>
+            <w:r>
+              <w:t xml:space="preserve">✅ Completado</w:t>
+            </w:r>
+          </w:p>
+        </w:tc>
+        <w:tc>
+          <w:tcPr/>
+          <w:p>
+            <w:pPr>
+              <w:pStyle w:val="Compact"/>
+              <w:jc w:val="center"/>
+            </w:pPr>
+            <w:r>
+              <w:t xml:space="preserve">14-jul</w:t>
             </w:r>
           </w:p>
         </w:tc>
@@ -6133,7 +6565,279 @@
               <w:jc w:val="left"/>
             </w:pPr>
             <w:r>
-              <w:t xml:space="preserve">Mayra Vera</w:t>
+              <w:t xml:space="preserve">socio_repo, libro_repo, prestamo_repo, reserva_repo</w:t>
+            </w:r>
+          </w:p>
+        </w:tc>
+      </w:tr>
+      <w:tr>
+        <w:tc>
+          <w:tcPr/>
+          <w:p>
+            <w:pPr>
+              <w:pStyle w:val="Compact"/>
+              <w:jc w:val="center"/>
+            </w:pPr>
+            <w:r>
+              <w:t xml:space="preserve">GUI Tkinter (19 funciones)</w:t>
+            </w:r>
+          </w:p>
+        </w:tc>
+        <w:tc>
+          <w:tcPr/>
+          <w:p>
+            <w:pPr>
+              <w:pStyle w:val="Compact"/>
+              <w:jc w:val="center"/>
+            </w:pPr>
+            <w:r>
+              <w:t xml:space="preserve">✅ Completado</w:t>
+            </w:r>
+          </w:p>
+        </w:tc>
+        <w:tc>
+          <w:tcPr/>
+          <w:p>
+            <w:pPr>
+              <w:pStyle w:val="Compact"/>
+              <w:jc w:val="center"/>
+            </w:pPr>
+            <w:r>
+              <w:t xml:space="preserve">17-jul</w:t>
+            </w:r>
+          </w:p>
+        </w:tc>
+        <w:tc>
+          <w:tcPr/>
+          <w:p>
+            <w:pPr>
+              <w:pStyle w:val="Compact"/>
+              <w:jc w:val="left"/>
+            </w:pPr>
+            <w:r>
+              <w:t xml:space="preserve">Formularios: socios, libros, préstamos, reservas</w:t>
+            </w:r>
+          </w:p>
+        </w:tc>
+      </w:tr>
+      <w:tr>
+        <w:tc>
+          <w:tcPr/>
+          <w:p>
+            <w:pPr>
+              <w:pStyle w:val="Compact"/>
+              <w:jc w:val="center"/>
+            </w:pPr>
+            <w:r>
+              <w:t xml:space="preserve">Pruebas unitarias (11)</w:t>
+            </w:r>
+          </w:p>
+        </w:tc>
+        <w:tc>
+          <w:tcPr/>
+          <w:p>
+            <w:pPr>
+              <w:pStyle w:val="Compact"/>
+              <w:jc w:val="center"/>
+            </w:pPr>
+            <w:r>
+              <w:t xml:space="preserve">✅ Completado</w:t>
+            </w:r>
+          </w:p>
+        </w:tc>
+        <w:tc>
+          <w:tcPr/>
+          <w:p>
+            <w:pPr>
+              <w:pStyle w:val="Compact"/>
+              <w:jc w:val="center"/>
+            </w:pPr>
+            <w:r>
+              <w:t xml:space="preserve">18-jul</w:t>
+            </w:r>
+          </w:p>
+        </w:tc>
+        <w:tc>
+          <w:tcPr/>
+          <w:p>
+            <w:pPr>
+              <w:pStyle w:val="Compact"/>
+              <w:jc w:val="left"/>
+            </w:pPr>
+            <w:r>
+              <w:t xml:space="preserve">Todos los tests pasan</w:t>
+            </w:r>
+          </w:p>
+        </w:tc>
+      </w:tr>
+      <w:tr>
+        <w:tc>
+          <w:tcPr/>
+          <w:p>
+            <w:pPr>
+              <w:pStyle w:val="Compact"/>
+              <w:jc w:val="center"/>
+            </w:pPr>
+            <w:r>
+              <w:t xml:space="preserve">Manual de usuario</w:t>
+            </w:r>
+          </w:p>
+        </w:tc>
+        <w:tc>
+          <w:tcPr/>
+          <w:p>
+            <w:pPr>
+              <w:pStyle w:val="Compact"/>
+              <w:jc w:val="center"/>
+            </w:pPr>
+            <w:r>
+              <w:t xml:space="preserve">✅ Completado</w:t>
+            </w:r>
+          </w:p>
+        </w:tc>
+        <w:tc>
+          <w:tcPr/>
+          <w:p>
+            <w:pPr>
+              <w:pStyle w:val="Compact"/>
+              <w:jc w:val="center"/>
+            </w:pPr>
+            <w:r>
+              <w:t xml:space="preserve">20-jul</w:t>
+            </w:r>
+          </w:p>
+        </w:tc>
+        <w:tc>
+          <w:tcPr/>
+          <w:p>
+            <w:pPr>
+              <w:pStyle w:val="Compact"/>
+              <w:jc w:val="left"/>
+            </w:pPr>
+            <w:r>
+              <w:t xml:space="preserve">8 secciones + 8 capturas de pantalla</w:t>
+            </w:r>
+          </w:p>
+        </w:tc>
+      </w:tr>
+      <w:tr>
+        <w:tc>
+          <w:tcPr/>
+          <w:p>
+            <w:pPr>
+              <w:pStyle w:val="Compact"/>
+              <w:jc w:val="center"/>
+            </w:pPr>
+            <w:r>
+              <w:t xml:space="preserve">Formato PDF académico</w:t>
+            </w:r>
+          </w:p>
+        </w:tc>
+        <w:tc>
+          <w:tcPr/>
+          <w:p>
+            <w:pPr>
+              <w:pStyle w:val="Compact"/>
+              <w:jc w:val="center"/>
+            </w:pPr>
+            <w:r>
+              <w:t xml:space="preserve">✅ Completado</w:t>
+            </w:r>
+          </w:p>
+        </w:tc>
+        <w:tc>
+          <w:tcPr/>
+          <w:p>
+            <w:pPr>
+              <w:pStyle w:val="Compact"/>
+              <w:jc w:val="center"/>
+            </w:pPr>
+            <w:r>
+              <w:t xml:space="preserve">20-jul</w:t>
+            </w:r>
+          </w:p>
+        </w:tc>
+        <w:tc>
+          <w:tcPr/>
+          <w:p>
+            <w:pPr>
+              <w:pStyle w:val="Compact"/>
+              <w:jc w:val="left"/>
+            </w:pPr>
+            <w:r>
+              <w:t xml:space="preserve">Portada, header/footer, tabla elegante</w:t>
+            </w:r>
+          </w:p>
+        </w:tc>
+      </w:tr>
+      <w:tr>
+        <w:tc>
+          <w:tcPr/>
+          <w:p>
+            <w:pPr>
+              <w:pStyle w:val="Compact"/>
+              <w:jc w:val="center"/>
+            </w:pPr>
+            <w:r>
+              <w:rPr>
+                <w:b/>
+                <w:bCs/>
+              </w:rPr>
+              <w:t xml:space="preserve">Defensa oral</w:t>
+            </w:r>
+          </w:p>
+        </w:tc>
+        <w:tc>
+          <w:tcPr/>
+          <w:p>
+            <w:pPr>
+              <w:pStyle w:val="Compact"/>
+              <w:jc w:val="center"/>
+            </w:pPr>
+            <w:r>
+              <w:t xml:space="preserve">⏳</w:t>
+            </w:r>
+            <w:r>
+              <w:t xml:space="preserve"> </w:t>
+            </w:r>
+            <w:r>
+              <w:rPr>
+                <w:b/>
+                <w:bCs/>
+              </w:rPr>
+              <w:t xml:space="preserve">Pendiente</w:t>
+            </w:r>
+          </w:p>
+        </w:tc>
+        <w:tc>
+          <w:tcPr/>
+          <w:p>
+            <w:pPr>
+              <w:pStyle w:val="Compact"/>
+              <w:jc w:val="center"/>
+            </w:pPr>
+            <w:r>
+              <w:rPr>
+                <w:b/>
+                <w:bCs/>
+              </w:rPr>
+              <w:t xml:space="preserve">27-jul</w:t>
+            </w:r>
+          </w:p>
+        </w:tc>
+        <w:tc>
+          <w:tcPr/>
+          <w:p>
+            <w:pPr>
+              <w:pStyle w:val="Compact"/>
+              <w:jc w:val="left"/>
+            </w:pPr>
+            <w:r>
+              <w:rPr>
+                <w:b/>
+                <w:bCs/>
+              </w:rPr>
+              <w:t xml:space="preserve">Semana 15</w:t>
             </w:r>
           </w:p>
         </w:tc>
@@ -14092,7 +14796,6 @@
   <w:p>
     <w:pPr>
       <w:pStyle w:val="Footer"/>
-      <w:spacing w:before="0" w:after="0"/>
       <w:jc w:val="center"/>
       <w:pBdr>
         <w:top w:val="single" w:sz="2" w:space="4" w:color="DDDDDD"/>
@@ -14104,7 +14807,7 @@
         <w:color w:val="969696"/>
         <w:sz w:val="15"/>
       </w:rPr>
-      <w:t xml:space="preserve">Grupo #1 — Programacion 2  |  Pag. </w:t>
+      <w:t xml:space="preserve">Grupo #1 - Programacion 2  |  Pag. </w:t>
     </w:r>
     <w:fldSimple w:instr=" PAGE ">
       <w:r>
@@ -14120,7 +14823,6 @@
   <w:p>
     <w:pPr>
       <w:pStyle w:val="Header"/>
-      <w:spacing w:before="0" w:after="0"/>
       <w:jc w:val="right"/>
       <w:pBdr>
         <w:bottom w:val="single" w:sz="2" w:space="4" w:color="BBBBBB"/>
@@ -14132,7 +14834,7 @@
         <w:color w:val="969696"/>
         <w:sz w:val="15"/>
       </w:rPr>
-      <w:t>UAE  |  Grupo #1 — Programacion 2  |  3er Semestre</w:t>
+      <w:t>UAE  |  Grupo #1 - Programacion 2  |  3er Semestre</w:t>
     </w:r>
   </w:p>
 </w:hdr>

</xml_diff>

<commit_message>
docs: corregir formato - heading 4 a bold, actualizar tabla 6.1 a completado, plantilla con estilo Code
</commit_message>
<xml_diff>
--- a/docs/especificacion-proyecto.docx
+++ b/docs/especificacion-proyecto.docx
@@ -10,7 +10,7 @@
       <w:r>
         <w:drawing>
           <wp:inline xmlns:a="http://schemas.openxmlformats.org/drawingml/2006/main" xmlns:pic="http://schemas.openxmlformats.org/drawingml/2006/picture">
-            <wp:extent cx="777240" cy="780773"/>
+            <wp:extent cx="731520" cy="734845"/>
             <wp:docPr id="1" name="Picture 1"/>
             <wp:cNvGraphicFramePr>
               <a:graphicFrameLocks noChangeAspect="1"/>
@@ -31,7 +31,7 @@
                   <pic:spPr>
                     <a:xfrm>
                       <a:off x="0" y="0"/>
-                      <a:ext cx="777240" cy="780773"/>
+                      <a:ext cx="731520" cy="734845"/>
                     </a:xfrm>
                     <a:prstGeom prst="rect"/>
                   </pic:spPr>
@@ -44,7 +44,7 @@
     </w:p>
     <w:p>
       <w:pPr>
-        <w:spacing w:before="80" w:after="0" w:line="240" w:lineRule="auto"/>
+        <w:spacing w:before="60" w:after="0" w:line="240" w:lineRule="auto"/>
         <w:jc w:val="center"/>
       </w:pPr>
       <w:r>
@@ -74,7 +74,7 @@
     </w:p>
     <w:p>
       <w:pPr>
-        <w:spacing w:before="0" w:after="40" w:line="240" w:lineRule="auto"/>
+        <w:spacing w:before="0" w:after="20" w:line="240" w:lineRule="auto"/>
         <w:jc w:val="center"/>
       </w:pPr>
       <w:r>
@@ -89,11 +89,76 @@
     </w:p>
     <w:p>
       <w:pPr>
-        <w:spacing w:before="0" w:after="0" w:line="80" w:lineRule="exact"/>
+        <w:spacing w:before="0" w:after="0" w:line="60" w:lineRule="exact"/>
       </w:pPr>
       <w:r>
         <w:rPr>
-          <w:sz w:val="8"/>
+          <w:sz w:val="6"/>
+        </w:rPr>
+      </w:r>
+    </w:p>
+    <w:p>
+      <w:pPr>
+        <w:spacing w:before="0" w:after="20" w:line="240" w:lineRule="auto"/>
+        <w:jc w:val="center"/>
+      </w:pPr>
+      <w:r>
+        <w:rPr>
+          <w:rFonts w:ascii="Calibri" w:hAnsi="Calibri"/>
+          <w:b w:val="0"/>
+          <w:color w:val="2980B9"/>
+          <w:sz w:val="12"/>
+        </w:rPr>
+        <w:t>----------------</w:t>
+      </w:r>
+    </w:p>
+    <w:p>
+      <w:pPr>
+        <w:spacing w:before="0" w:after="0" w:line="20" w:lineRule="exact"/>
+      </w:pPr>
+      <w:r>
+        <w:rPr>
+          <w:sz w:val="2"/>
+        </w:rPr>
+      </w:r>
+    </w:p>
+    <w:p>
+      <w:pPr>
+        <w:spacing w:before="0" w:after="20" w:line="240" w:lineRule="auto"/>
+        <w:jc w:val="center"/>
+      </w:pPr>
+      <w:r>
+        <w:rPr>
+          <w:rFonts w:ascii="Calibri" w:hAnsi="Calibri"/>
+          <w:b/>
+          <w:color w:val="1B4F72"/>
+          <w:sz w:val="26"/>
+        </w:rPr>
+        <w:t>Sistema de Gestion de Biblioteca Universitaria</w:t>
+      </w:r>
+    </w:p>
+    <w:p>
+      <w:pPr>
+        <w:spacing w:before="0" w:after="20" w:line="240" w:lineRule="auto"/>
+        <w:jc w:val="center"/>
+      </w:pPr>
+      <w:r>
+        <w:rPr>
+          <w:rFonts w:ascii="Calibri" w:hAnsi="Calibri"/>
+          <w:b w:val="0"/>
+          <w:color w:val="34495E"/>
+          <w:sz w:val="20"/>
+        </w:rPr>
+        <w:t>Documento de Especificacion del Proyecto</w:t>
+      </w:r>
+    </w:p>
+    <w:p>
+      <w:pPr>
+        <w:spacing w:before="0" w:after="0" w:line="20" w:lineRule="exact"/>
+      </w:pPr>
+      <w:r>
+        <w:rPr>
+          <w:sz w:val="2"/>
         </w:rPr>
       </w:r>
     </w:p>
@@ -109,72 +174,7 @@
           <w:color w:val="2980B9"/>
           <w:sz w:val="12"/>
         </w:rPr>
-        <w:t>------------------</w:t>
-      </w:r>
-    </w:p>
-    <w:p>
-      <w:pPr>
-        <w:spacing w:before="0" w:after="0" w:line="40" w:lineRule="exact"/>
-      </w:pPr>
-      <w:r>
-        <w:rPr>
-          <w:sz w:val="4"/>
-        </w:rPr>
-      </w:r>
-    </w:p>
-    <w:p>
-      <w:pPr>
-        <w:spacing w:before="0" w:after="20" w:line="240" w:lineRule="auto"/>
-        <w:jc w:val="center"/>
-      </w:pPr>
-      <w:r>
-        <w:rPr>
-          <w:rFonts w:ascii="Calibri" w:hAnsi="Calibri"/>
-          <w:b/>
-          <w:color w:val="1B4F72"/>
-          <w:sz w:val="26"/>
-        </w:rPr>
-        <w:t>Sistema de Gestion de Biblioteca Universitaria</w:t>
-      </w:r>
-    </w:p>
-    <w:p>
-      <w:pPr>
-        <w:spacing w:before="0" w:after="40" w:line="240" w:lineRule="auto"/>
-        <w:jc w:val="center"/>
-      </w:pPr>
-      <w:r>
-        <w:rPr>
-          <w:rFonts w:ascii="Calibri" w:hAnsi="Calibri"/>
-          <w:b w:val="0"/>
-          <w:color w:val="34495E"/>
-          <w:sz w:val="20"/>
-        </w:rPr>
-        <w:t>Documento de Especificacion del Proyecto</w:t>
-      </w:r>
-    </w:p>
-    <w:p>
-      <w:pPr>
-        <w:spacing w:before="0" w:after="0" w:line="40" w:lineRule="exact"/>
-      </w:pPr>
-      <w:r>
-        <w:rPr>
-          <w:sz w:val="4"/>
-        </w:rPr>
-      </w:r>
-    </w:p>
-    <w:p>
-      <w:pPr>
-        <w:spacing w:before="0" w:after="60" w:line="240" w:lineRule="auto"/>
-        <w:jc w:val="center"/>
-      </w:pPr>
-      <w:r>
-        <w:rPr>
-          <w:rFonts w:ascii="Calibri" w:hAnsi="Calibri"/>
-          <w:b w:val="0"/>
-          <w:color w:val="2980B9"/>
-          <w:sz w:val="12"/>
-        </w:rPr>
-        <w:t>--------------</w:t>
+        <w:t>------------</w:t>
       </w:r>
     </w:p>
     <w:tbl>
@@ -512,7 +512,7 @@
     </w:p>
     <w:p>
       <w:pPr>
-        <w:spacing w:before="40" w:after="0" w:line="240" w:lineRule="auto"/>
+        <w:spacing w:before="20" w:after="0" w:line="240" w:lineRule="auto"/>
         <w:jc w:val="center"/>
       </w:pPr>
       <w:r>
@@ -1336,10 +1336,154 @@
     </w:p>
     <w:p xmlns:a="http://schemas.openxmlformats.org/drawingml/2006/main" xmlns:pic="http://schemas.openxmlformats.org/drawingml/2006/picture">
       <w:pPr>
-        <w:pStyle w:val="Heading4"/>
+        <w:pStyle w:val="FirstParagraph"/>
       </w:pPr>
       <w:r>
+        <w:rPr>
+          <w:b/>
+          <w:bCs/>
+        </w:rPr>
         <w:t xml:space="preserve">5.2.1 Lista Enlazada Simple</w:t>
+      </w:r>
+    </w:p>
+    <w:p xmlns:a="http://schemas.openxmlformats.org/drawingml/2006/main" xmlns:pic="http://schemas.openxmlformats.org/drawingml/2006/picture">
+      <w:pPr>
+        <w:pStyle w:val="BodyText"/>
+      </w:pPr>
+      <w:r>
+        <w:t xml:space="preserve">Estructura lineal donde cada elemento (nodo) contiene un valor y un puntero al siguiente nodo. Permite inserciones y eliminaciones sin reorganizar memoria. Se implementó</w:t>
+      </w:r>
+      <w:r>
+        <w:t xml:space="preserve"> </w:t>
+      </w:r>
+      <w:r>
+        <w:rPr>
+          <w:rStyle w:val="VerbatimChar"/>
+        </w:rPr>
+        <w:t xml:space="preserve">LinkedList</w:t>
+      </w:r>
+      <w:r>
+        <w:t xml:space="preserve"> </w:t>
+      </w:r>
+      <w:r>
+        <w:t xml:space="preserve">como base para la cola y la pila.</w:t>
+      </w:r>
+    </w:p>
+    <w:p xmlns:a="http://schemas.openxmlformats.org/drawingml/2006/main" xmlns:pic="http://schemas.openxmlformats.org/drawingml/2006/picture">
+      <w:pPr>
+        <w:pStyle w:val="BodyText"/>
+      </w:pPr>
+      <w:r>
+        <w:rPr>
+          <w:b/>
+          <w:bCs/>
+        </w:rPr>
+        <w:t xml:space="preserve">Referencia:</w:t>
+      </w:r>
+      <w:r>
+        <w:t xml:space="preserve"> </w:t>
+      </w:r>
+      <w:r>
+        <w:t xml:space="preserve">Weiss, M. A. (2013).</w:t>
+      </w:r>
+      <w:r>
+        <w:t xml:space="preserve"> </w:t>
+      </w:r>
+      <w:r>
+        <w:rPr>
+          <w:i/>
+          <w:iCs/>
+        </w:rPr>
+        <w:t xml:space="preserve">Estructuras de datos y algoritmos</w:t>
+      </w:r>
+      <w:r>
+        <w:t xml:space="preserve"> </w:t>
+      </w:r>
+      <w:r>
+        <w:t xml:space="preserve">(4ª ed.). Pearson Educación.</w:t>
+      </w:r>
+    </w:p>
+    <w:p xmlns:a="http://schemas.openxmlformats.org/drawingml/2006/main" xmlns:pic="http://schemas.openxmlformats.org/drawingml/2006/picture">
+      <w:pPr>
+        <w:pStyle w:val="BodyText"/>
+      </w:pPr>
+      <w:r>
+        <w:rPr>
+          <w:b/>
+          <w:bCs/>
+        </w:rPr>
+        <w:t xml:space="preserve">5.2.2 Cola (Queue — FIFO)</w:t>
+      </w:r>
+    </w:p>
+    <w:p xmlns:a="http://schemas.openxmlformats.org/drawingml/2006/main" xmlns:pic="http://schemas.openxmlformats.org/drawingml/2006/picture">
+      <w:pPr>
+        <w:pStyle w:val="BodyText"/>
+      </w:pPr>
+      <w:r>
+        <w:t xml:space="preserve">El primer elemento en entrar es el primero en salir (First In, First Out). Se utiliza para gestionar las reservas de libros en orden de llegada.</w:t>
+      </w:r>
+    </w:p>
+    <w:p xmlns:a="http://schemas.openxmlformats.org/drawingml/2006/main" xmlns:pic="http://schemas.openxmlformats.org/drawingml/2006/picture">
+      <w:pPr>
+        <w:pStyle w:val="BodyText"/>
+      </w:pPr>
+      <w:r>
+        <w:rPr>
+          <w:b/>
+          <w:bCs/>
+        </w:rPr>
+        <w:t xml:space="preserve">5.2.3 Pila (Stack — LIFO)</w:t>
+      </w:r>
+    </w:p>
+    <w:p xmlns:a="http://schemas.openxmlformats.org/drawingml/2006/main" xmlns:pic="http://schemas.openxmlformats.org/drawingml/2006/picture">
+      <w:pPr>
+        <w:pStyle w:val="BodyText"/>
+      </w:pPr>
+      <w:r>
+        <w:t xml:space="preserve">El último elemento en entrar es el primero en salir (Last In, First Out). Se utiliza para deshacer operaciones (undo) de préstamos y devoluciones.</w:t>
+      </w:r>
+    </w:p>
+    <w:p xmlns:a="http://schemas.openxmlformats.org/drawingml/2006/main" xmlns:pic="http://schemas.openxmlformats.org/drawingml/2006/picture">
+      <w:pPr>
+        <w:pStyle w:val="BodyText"/>
+      </w:pPr>
+      <w:r>
+        <w:rPr>
+          <w:b/>
+          <w:bCs/>
+        </w:rPr>
+        <w:t xml:space="preserve">Referencia:</w:t>
+      </w:r>
+      <w:r>
+        <w:t xml:space="preserve"> </w:t>
+      </w:r>
+      <w:r>
+        <w:t xml:space="preserve">Cairo, O., &amp; Guardati, S. (2006).</w:t>
+      </w:r>
+      <w:r>
+        <w:t xml:space="preserve"> </w:t>
+      </w:r>
+      <w:r>
+        <w:rPr>
+          <w:i/>
+          <w:iCs/>
+        </w:rPr>
+        <w:t xml:space="preserve">Estructuras de datos</w:t>
+      </w:r>
+      <w:r>
+        <w:t xml:space="preserve"> </w:t>
+      </w:r>
+      <w:r>
+        <w:t xml:space="preserve">(3ª ed.). McGraw-Hill.</w:t>
+      </w:r>
+    </w:p>
+    <w:bookmarkEnd xmlns:a="http://schemas.openxmlformats.org/drawingml/2006/main" xmlns:pic="http://schemas.openxmlformats.org/drawingml/2006/picture" w:id="30"/>
+    <w:p xmlns:a="http://schemas.openxmlformats.org/drawingml/2006/main" xmlns:pic="http://schemas.openxmlformats.org/drawingml/2006/picture">
+      <w:pPr>
+        <w:pStyle w:val="Heading3"/>
+      </w:pPr>
+      <w:r>
+        <w:t xml:space="preserve">5.3 Algoritmos de Ordenamiento y Búsqueda</w:t>
       </w:r>
     </w:p>
     <w:p xmlns:a="http://schemas.openxmlformats.org/drawingml/2006/main" xmlns:pic="http://schemas.openxmlformats.org/drawingml/2006/picture">
@@ -1347,141 +1491,10 @@
         <w:pStyle w:val="FirstParagraph"/>
       </w:pPr>
       <w:r>
-        <w:t xml:space="preserve">Estructura lineal donde cada elemento (nodo) contiene un valor y un puntero al siguiente nodo. Permite inserciones y eliminaciones sin reorganizar memoria. Se implementó</w:t>
-      </w:r>
-      <w:r>
-        <w:t xml:space="preserve"> </w:t>
-      </w:r>
-      <w:r>
-        <w:rPr>
-          <w:rStyle w:val="VerbatimChar"/>
-        </w:rPr>
-        <w:t xml:space="preserve">LinkedList</w:t>
-      </w:r>
-      <w:r>
-        <w:t xml:space="preserve"> </w:t>
-      </w:r>
-      <w:r>
-        <w:t xml:space="preserve">como base para la cola y la pila.</w:t>
-      </w:r>
-    </w:p>
-    <w:p xmlns:a="http://schemas.openxmlformats.org/drawingml/2006/main" xmlns:pic="http://schemas.openxmlformats.org/drawingml/2006/picture">
-      <w:pPr>
-        <w:pStyle w:val="BodyText"/>
-      </w:pPr>
-      <w:r>
         <w:rPr>
           <w:b/>
           <w:bCs/>
         </w:rPr>
-        <w:t xml:space="preserve">Referencia:</w:t>
-      </w:r>
-      <w:r>
-        <w:t xml:space="preserve"> </w:t>
-      </w:r>
-      <w:r>
-        <w:t xml:space="preserve">Weiss, M. A. (2013).</w:t>
-      </w:r>
-      <w:r>
-        <w:t xml:space="preserve"> </w:t>
-      </w:r>
-      <w:r>
-        <w:rPr>
-          <w:i/>
-          <w:iCs/>
-        </w:rPr>
-        <w:t xml:space="preserve">Estructuras de datos y algoritmos</w:t>
-      </w:r>
-      <w:r>
-        <w:t xml:space="preserve"> </w:t>
-      </w:r>
-      <w:r>
-        <w:t xml:space="preserve">(4ª ed.). Pearson Educación.</w:t>
-      </w:r>
-    </w:p>
-    <w:bookmarkEnd xmlns:a="http://schemas.openxmlformats.org/drawingml/2006/main" xmlns:pic="http://schemas.openxmlformats.org/drawingml/2006/picture" w:id="30"/>
-    <w:p xmlns:a="http://schemas.openxmlformats.org/drawingml/2006/main" xmlns:pic="http://schemas.openxmlformats.org/drawingml/2006/picture">
-      <w:pPr>
-        <w:pStyle w:val="Heading4"/>
-      </w:pPr>
-      <w:r>
-        <w:t xml:space="preserve">5.2.2 Cola (Queue — FIFO)</w:t>
-      </w:r>
-    </w:p>
-    <w:p xmlns:a="http://schemas.openxmlformats.org/drawingml/2006/main" xmlns:pic="http://schemas.openxmlformats.org/drawingml/2006/picture">
-      <w:pPr>
-        <w:pStyle w:val="FirstParagraph"/>
-      </w:pPr>
-      <w:r>
-        <w:t xml:space="preserve">El primer elemento en entrar es el primero en salir (First In, First Out). Se utiliza para gestionar las reservas de libros en orden de llegada.</w:t>
-      </w:r>
-    </w:p>
-    <w:bookmarkEnd xmlns:a="http://schemas.openxmlformats.org/drawingml/2006/main" xmlns:pic="http://schemas.openxmlformats.org/drawingml/2006/picture" w:id="31"/>
-    <w:p xmlns:a="http://schemas.openxmlformats.org/drawingml/2006/main" xmlns:pic="http://schemas.openxmlformats.org/drawingml/2006/picture">
-      <w:pPr>
-        <w:pStyle w:val="Heading4"/>
-      </w:pPr>
-      <w:r>
-        <w:t xml:space="preserve">5.2.3 Pila (Stack — LIFO)</w:t>
-      </w:r>
-    </w:p>
-    <w:p xmlns:a="http://schemas.openxmlformats.org/drawingml/2006/main" xmlns:pic="http://schemas.openxmlformats.org/drawingml/2006/picture">
-      <w:pPr>
-        <w:pStyle w:val="FirstParagraph"/>
-      </w:pPr>
-      <w:r>
-        <w:t xml:space="preserve">El último elemento en entrar es el primero en salir (Last In, First Out). Se utiliza para deshacer operaciones (undo) de préstamos y devoluciones.</w:t>
-      </w:r>
-    </w:p>
-    <w:p xmlns:a="http://schemas.openxmlformats.org/drawingml/2006/main" xmlns:pic="http://schemas.openxmlformats.org/drawingml/2006/picture">
-      <w:pPr>
-        <w:pStyle w:val="BodyText"/>
-      </w:pPr>
-      <w:r>
-        <w:rPr>
-          <w:b/>
-          <w:bCs/>
-        </w:rPr>
-        <w:t xml:space="preserve">Referencia:</w:t>
-      </w:r>
-      <w:r>
-        <w:t xml:space="preserve"> </w:t>
-      </w:r>
-      <w:r>
-        <w:t xml:space="preserve">Cairo, O., &amp; Guardati, S. (2006).</w:t>
-      </w:r>
-      <w:r>
-        <w:t xml:space="preserve"> </w:t>
-      </w:r>
-      <w:r>
-        <w:rPr>
-          <w:i/>
-          <w:iCs/>
-        </w:rPr>
-        <w:t xml:space="preserve">Estructuras de datos</w:t>
-      </w:r>
-      <w:r>
-        <w:t xml:space="preserve"> </w:t>
-      </w:r>
-      <w:r>
-        <w:t xml:space="preserve">(3ª ed.). McGraw-Hill.</w:t>
-      </w:r>
-    </w:p>
-    <w:bookmarkEnd xmlns:a="http://schemas.openxmlformats.org/drawingml/2006/main" xmlns:pic="http://schemas.openxmlformats.org/drawingml/2006/picture" w:id="32"/>
-    <w:bookmarkEnd xmlns:a="http://schemas.openxmlformats.org/drawingml/2006/main" xmlns:pic="http://schemas.openxmlformats.org/drawingml/2006/picture" w:id="33"/>
-    <w:p xmlns:a="http://schemas.openxmlformats.org/drawingml/2006/main" xmlns:pic="http://schemas.openxmlformats.org/drawingml/2006/picture">
-      <w:pPr>
-        <w:pStyle w:val="Heading3"/>
-      </w:pPr>
-      <w:r>
-        <w:t xml:space="preserve">5.3 Algoritmos de Ordenamiento y Búsqueda</w:t>
-      </w:r>
-    </w:p>
-    <w:p xmlns:a="http://schemas.openxmlformats.org/drawingml/2006/main" xmlns:pic="http://schemas.openxmlformats.org/drawingml/2006/picture">
-      <w:pPr>
-        <w:pStyle w:val="Heading4"/>
-      </w:pPr>
-      <w:r>
         <w:t xml:space="preserve">5.3.1 Algoritmos de Ordenamiento</w:t>
       </w:r>
     </w:p>
@@ -1692,12 +1705,15 @@
         </w:tc>
       </w:tr>
     </w:tbl>
-    <w:bookmarkEnd xmlns:a="http://schemas.openxmlformats.org/drawingml/2006/main" xmlns:pic="http://schemas.openxmlformats.org/drawingml/2006/picture" w:id="34"/>
     <w:p xmlns:a="http://schemas.openxmlformats.org/drawingml/2006/main" xmlns:pic="http://schemas.openxmlformats.org/drawingml/2006/picture">
       <w:pPr>
-        <w:pStyle w:val="Heading4"/>
+        <w:pStyle w:val="BodyText"/>
       </w:pPr>
       <w:r>
+        <w:rPr>
+          <w:b/>
+          <w:bCs/>
+        </w:rPr>
         <w:t xml:space="preserve">5.3.2 Algoritmos de Búsqueda</w:t>
       </w:r>
     </w:p>
@@ -1865,8 +1881,7 @@
         <w:t xml:space="preserve">(3rd ed.). MIT Press.</w:t>
       </w:r>
     </w:p>
-    <w:bookmarkEnd xmlns:a="http://schemas.openxmlformats.org/drawingml/2006/main" xmlns:pic="http://schemas.openxmlformats.org/drawingml/2006/picture" w:id="35"/>
-    <w:bookmarkEnd xmlns:a="http://schemas.openxmlformats.org/drawingml/2006/main" xmlns:pic="http://schemas.openxmlformats.org/drawingml/2006/picture" w:id="36"/>
+    <w:bookmarkEnd xmlns:a="http://schemas.openxmlformats.org/drawingml/2006/main" xmlns:pic="http://schemas.openxmlformats.org/drawingml/2006/picture" w:id="31"/>
     <w:p xmlns:a="http://schemas.openxmlformats.org/drawingml/2006/main" xmlns:pic="http://schemas.openxmlformats.org/drawingml/2006/picture">
       <w:pPr>
         <w:pStyle w:val="Heading3"/>
@@ -2058,7 +2073,7 @@
         <w:t xml:space="preserve">. O’Reilly Media.</w:t>
       </w:r>
     </w:p>
-    <w:bookmarkEnd xmlns:a="http://schemas.openxmlformats.org/drawingml/2006/main" xmlns:pic="http://schemas.openxmlformats.org/drawingml/2006/picture" w:id="37"/>
+    <w:bookmarkEnd xmlns:a="http://schemas.openxmlformats.org/drawingml/2006/main" xmlns:pic="http://schemas.openxmlformats.org/drawingml/2006/picture" w:id="32"/>
     <w:p xmlns:a="http://schemas.openxmlformats.org/drawingml/2006/main" xmlns:pic="http://schemas.openxmlformats.org/drawingml/2006/picture">
       <w:pPr>
         <w:pStyle w:val="Heading3"/>
@@ -2113,8 +2128,8 @@
         </w:pict>
       </w:r>
     </w:p>
-    <w:bookmarkEnd xmlns:a="http://schemas.openxmlformats.org/drawingml/2006/main" xmlns:pic="http://schemas.openxmlformats.org/drawingml/2006/picture" w:id="38"/>
-    <w:bookmarkEnd xmlns:a="http://schemas.openxmlformats.org/drawingml/2006/main" xmlns:pic="http://schemas.openxmlformats.org/drawingml/2006/picture" w:id="39"/>
+    <w:bookmarkEnd xmlns:a="http://schemas.openxmlformats.org/drawingml/2006/main" xmlns:pic="http://schemas.openxmlformats.org/drawingml/2006/picture" w:id="33"/>
+    <w:bookmarkEnd xmlns:a="http://schemas.openxmlformats.org/drawingml/2006/main" xmlns:pic="http://schemas.openxmlformats.org/drawingml/2006/picture" w:id="34"/>
     <w:p xmlns:a="http://schemas.openxmlformats.org/drawingml/2006/main" xmlns:pic="http://schemas.openxmlformats.org/drawingml/2006/picture">
       <w:pPr>
         <w:pStyle w:val="Heading2"/>
@@ -2370,7 +2385,7 @@
               <w:jc w:val="center"/>
             </w:pPr>
             <w:r>
-              <w:t xml:space="preserve">⏳ Pendiente</w:t>
+              <w:t xml:space="preserve">✅ Completado</w:t>
             </w:r>
           </w:p>
         </w:tc>
@@ -2412,7 +2427,7 @@
               <w:jc w:val="left"/>
             </w:pPr>
             <w:r>
-              <w:t xml:space="preserve">Integración final + Pruebas de sistema + Documento completo (100%) + Defensa oral</w:t>
+              <w:t xml:space="preserve">Integración final + Pruebas de sistema + Documento completo (100%) + Formato PDF</w:t>
             </w:r>
           </w:p>
         </w:tc>
@@ -2424,13 +2439,13 @@
               <w:jc w:val="center"/>
             </w:pPr>
             <w:r>
-              <w:t xml:space="preserve">⏳ Pendiente</w:t>
+              <w:t xml:space="preserve">✅ Completado</w:t>
             </w:r>
           </w:p>
         </w:tc>
       </w:tr>
     </w:tbl>
-    <w:bookmarkEnd xmlns:a="http://schemas.openxmlformats.org/drawingml/2006/main" xmlns:pic="http://schemas.openxmlformats.org/drawingml/2006/picture" w:id="40"/>
+    <w:bookmarkEnd xmlns:a="http://schemas.openxmlformats.org/drawingml/2006/main" xmlns:pic="http://schemas.openxmlformats.org/drawingml/2006/picture" w:id="35"/>
     <w:p xmlns:a="http://schemas.openxmlformats.org/drawingml/2006/main" xmlns:pic="http://schemas.openxmlformats.org/drawingml/2006/picture">
       <w:pPr>
         <w:pStyle w:val="Heading3"/>
@@ -2553,7 +2568,7 @@
         <w:t xml:space="preserve">: se sube a GitHub y se documenta el avance</w:t>
       </w:r>
     </w:p>
-    <w:bookmarkEnd xmlns:a="http://schemas.openxmlformats.org/drawingml/2006/main" xmlns:pic="http://schemas.openxmlformats.org/drawingml/2006/picture" w:id="41"/>
+    <w:bookmarkEnd xmlns:a="http://schemas.openxmlformats.org/drawingml/2006/main" xmlns:pic="http://schemas.openxmlformats.org/drawingml/2006/picture" w:id="36"/>
     <w:p xmlns:a="http://schemas.openxmlformats.org/drawingml/2006/main" xmlns:pic="http://schemas.openxmlformats.org/drawingml/2006/picture">
       <w:pPr>
         <w:pStyle w:val="Heading3"/>
@@ -2890,8 +2905,8 @@
         </w:pict>
       </w:r>
     </w:p>
-    <w:bookmarkEnd xmlns:a="http://schemas.openxmlformats.org/drawingml/2006/main" xmlns:pic="http://schemas.openxmlformats.org/drawingml/2006/picture" w:id="42"/>
-    <w:bookmarkEnd xmlns:a="http://schemas.openxmlformats.org/drawingml/2006/main" xmlns:pic="http://schemas.openxmlformats.org/drawingml/2006/picture" w:id="43"/>
+    <w:bookmarkEnd xmlns:a="http://schemas.openxmlformats.org/drawingml/2006/main" xmlns:pic="http://schemas.openxmlformats.org/drawingml/2006/picture" w:id="37"/>
+    <w:bookmarkEnd xmlns:a="http://schemas.openxmlformats.org/drawingml/2006/main" xmlns:pic="http://schemas.openxmlformats.org/drawingml/2006/picture" w:id="38"/>
     <w:p xmlns:a="http://schemas.openxmlformats.org/drawingml/2006/main" xmlns:pic="http://schemas.openxmlformats.org/drawingml/2006/picture">
       <w:pPr>
         <w:pStyle w:val="Heading2"/>
@@ -3495,7 +3510,7 @@
         <w:t xml:space="preserve">                      └──────────────────────┘</w:t>
       </w:r>
     </w:p>
-    <w:bookmarkEnd xmlns:a="http://schemas.openxmlformats.org/drawingml/2006/main" xmlns:pic="http://schemas.openxmlformats.org/drawingml/2006/picture" w:id="44"/>
+    <w:bookmarkEnd xmlns:a="http://schemas.openxmlformats.org/drawingml/2006/main" xmlns:pic="http://schemas.openxmlformats.org/drawingml/2006/picture" w:id="39"/>
     <w:p xmlns:a="http://schemas.openxmlformats.org/drawingml/2006/main" xmlns:pic="http://schemas.openxmlformats.org/drawingml/2006/picture">
       <w:pPr>
         <w:pStyle w:val="Heading3"/>
@@ -3729,8 +3744,8 @@
         </w:pict>
       </w:r>
     </w:p>
-    <w:bookmarkEnd xmlns:a="http://schemas.openxmlformats.org/drawingml/2006/main" xmlns:pic="http://schemas.openxmlformats.org/drawingml/2006/picture" w:id="45"/>
-    <w:bookmarkEnd xmlns:a="http://schemas.openxmlformats.org/drawingml/2006/main" xmlns:pic="http://schemas.openxmlformats.org/drawingml/2006/picture" w:id="46"/>
+    <w:bookmarkEnd xmlns:a="http://schemas.openxmlformats.org/drawingml/2006/main" xmlns:pic="http://schemas.openxmlformats.org/drawingml/2006/picture" w:id="40"/>
+    <w:bookmarkEnd xmlns:a="http://schemas.openxmlformats.org/drawingml/2006/main" xmlns:pic="http://schemas.openxmlformats.org/drawingml/2006/picture" w:id="41"/>
     <w:p xmlns:a="http://schemas.openxmlformats.org/drawingml/2006/main" xmlns:pic="http://schemas.openxmlformats.org/drawingml/2006/picture">
       <w:pPr>
         <w:pStyle w:val="Heading2"/>
@@ -4139,7 +4154,7 @@
         </w:tc>
       </w:tr>
     </w:tbl>
-    <w:bookmarkEnd xmlns:a="http://schemas.openxmlformats.org/drawingml/2006/main" xmlns:pic="http://schemas.openxmlformats.org/drawingml/2006/picture" w:id="47"/>
+    <w:bookmarkEnd xmlns:a="http://schemas.openxmlformats.org/drawingml/2006/main" xmlns:pic="http://schemas.openxmlformats.org/drawingml/2006/picture" w:id="42"/>
     <w:p xmlns:a="http://schemas.openxmlformats.org/drawingml/2006/main" xmlns:pic="http://schemas.openxmlformats.org/drawingml/2006/picture">
       <w:pPr>
         <w:pStyle w:val="Heading3"/>
@@ -4410,8 +4425,8 @@
         </w:pict>
       </w:r>
     </w:p>
-    <w:bookmarkEnd xmlns:a="http://schemas.openxmlformats.org/drawingml/2006/main" xmlns:pic="http://schemas.openxmlformats.org/drawingml/2006/picture" w:id="48"/>
-    <w:bookmarkEnd xmlns:a="http://schemas.openxmlformats.org/drawingml/2006/main" xmlns:pic="http://schemas.openxmlformats.org/drawingml/2006/picture" w:id="49"/>
+    <w:bookmarkEnd xmlns:a="http://schemas.openxmlformats.org/drawingml/2006/main" xmlns:pic="http://schemas.openxmlformats.org/drawingml/2006/picture" w:id="43"/>
+    <w:bookmarkEnd xmlns:a="http://schemas.openxmlformats.org/drawingml/2006/main" xmlns:pic="http://schemas.openxmlformats.org/drawingml/2006/picture" w:id="44"/>
     <w:p xmlns:a="http://schemas.openxmlformats.org/drawingml/2006/main" xmlns:pic="http://schemas.openxmlformats.org/drawingml/2006/picture">
       <w:pPr>
         <w:pStyle w:val="Heading2"/>
@@ -4454,7 +4469,7 @@
       <w:r>
         <w:t xml:space="preserve"> </w:t>
       </w:r>
-      <w:hyperlink r:id="rId50">
+      <w:hyperlink r:id="rId45">
         <w:r>
           <w:rPr>
             <w:rStyle w:val="Hyperlink"/>
@@ -4525,7 +4540,7 @@
         <w:t xml:space="preserve">con mensajes descriptivos</w:t>
       </w:r>
     </w:p>
-    <w:bookmarkEnd xmlns:a="http://schemas.openxmlformats.org/drawingml/2006/main" xmlns:pic="http://schemas.openxmlformats.org/drawingml/2006/picture" w:id="51"/>
+    <w:bookmarkEnd xmlns:a="http://schemas.openxmlformats.org/drawingml/2006/main" xmlns:pic="http://schemas.openxmlformats.org/drawingml/2006/picture" w:id="46"/>
     <w:p xmlns:a="http://schemas.openxmlformats.org/drawingml/2006/main" xmlns:pic="http://schemas.openxmlformats.org/drawingml/2006/picture">
       <w:pPr>
         <w:pStyle w:val="Heading3"/>
@@ -5617,7 +5632,7 @@
         </w:tc>
       </w:tr>
     </w:tbl>
-    <w:bookmarkEnd xmlns:a="http://schemas.openxmlformats.org/drawingml/2006/main" xmlns:pic="http://schemas.openxmlformats.org/drawingml/2006/picture" w:id="52"/>
+    <w:bookmarkEnd xmlns:a="http://schemas.openxmlformats.org/drawingml/2006/main" xmlns:pic="http://schemas.openxmlformats.org/drawingml/2006/picture" w:id="47"/>
     <w:p xmlns:a="http://schemas.openxmlformats.org/drawingml/2006/main" xmlns:pic="http://schemas.openxmlformats.org/drawingml/2006/picture">
       <w:pPr>
         <w:pStyle w:val="Heading3"/>
@@ -5765,7 +5780,7 @@
         </w:pict>
       </w:r>
     </w:p>
-    <w:bookmarkEnd xmlns:a="http://schemas.openxmlformats.org/drawingml/2006/main" xmlns:pic="http://schemas.openxmlformats.org/drawingml/2006/picture" w:id="53"/>
+    <w:bookmarkEnd xmlns:a="http://schemas.openxmlformats.org/drawingml/2006/main" xmlns:pic="http://schemas.openxmlformats.org/drawingml/2006/picture" w:id="48"/>
     <w:p xmlns:a="http://schemas.openxmlformats.org/drawingml/2006/main" xmlns:pic="http://schemas.openxmlformats.org/drawingml/2006/picture">
       <w:pPr>
         <w:pStyle w:val="Heading3"/>
@@ -5774,7 +5789,7 @@
         <w:t xml:space="preserve">9.1 Plan de Trabajo y Cronograma</w:t>
       </w:r>
     </w:p>
-    <w:bookmarkEnd xmlns:a="http://schemas.openxmlformats.org/drawingml/2006/main" xmlns:pic="http://schemas.openxmlformats.org/drawingml/2006/picture" w:id="54"/>
+    <w:bookmarkEnd xmlns:a="http://schemas.openxmlformats.org/drawingml/2006/main" xmlns:pic="http://schemas.openxmlformats.org/drawingml/2006/picture" w:id="49"/>
     <w:p xmlns:a="http://schemas.openxmlformats.org/drawingml/2006/main" xmlns:pic="http://schemas.openxmlformats.org/drawingml/2006/picture">
       <w:pPr>
         <w:pStyle w:val="Heading3"/>
@@ -6244,7 +6259,7 @@
         <w:t xml:space="preserve">────────────────────────────────────────────────────────────</w:t>
       </w:r>
     </w:p>
-    <w:bookmarkEnd xmlns:a="http://schemas.openxmlformats.org/drawingml/2006/main" xmlns:pic="http://schemas.openxmlformats.org/drawingml/2006/picture" w:id="55"/>
+    <w:bookmarkEnd xmlns:a="http://schemas.openxmlformats.org/drawingml/2006/main" xmlns:pic="http://schemas.openxmlformats.org/drawingml/2006/picture" w:id="50"/>
     <w:p xmlns:a="http://schemas.openxmlformats.org/drawingml/2006/main" xmlns:pic="http://schemas.openxmlformats.org/drawingml/2006/picture">
       <w:pPr>
         <w:pStyle w:val="Heading3"/>
@@ -6907,8 +6922,8 @@
         </w:pict>
       </w:r>
     </w:p>
-    <w:bookmarkEnd xmlns:a="http://schemas.openxmlformats.org/drawingml/2006/main" xmlns:pic="http://schemas.openxmlformats.org/drawingml/2006/picture" w:id="56"/>
-    <w:bookmarkEnd xmlns:a="http://schemas.openxmlformats.org/drawingml/2006/main" xmlns:pic="http://schemas.openxmlformats.org/drawingml/2006/picture" w:id="57"/>
+    <w:bookmarkEnd xmlns:a="http://schemas.openxmlformats.org/drawingml/2006/main" xmlns:pic="http://schemas.openxmlformats.org/drawingml/2006/picture" w:id="51"/>
+    <w:bookmarkEnd xmlns:a="http://schemas.openxmlformats.org/drawingml/2006/main" xmlns:pic="http://schemas.openxmlformats.org/drawingml/2006/picture" w:id="52"/>
     <w:p xmlns:a="http://schemas.openxmlformats.org/drawingml/2006/main" xmlns:pic="http://schemas.openxmlformats.org/drawingml/2006/picture">
       <w:pPr>
         <w:pStyle w:val="Heading2"/>
@@ -7296,7 +7311,7 @@
         <w:t xml:space="preserve">    └── biblioteca.db             # Base de datos poblada</w:t>
       </w:r>
     </w:p>
-    <w:bookmarkEnd xmlns:a="http://schemas.openxmlformats.org/drawingml/2006/main" xmlns:pic="http://schemas.openxmlformats.org/drawingml/2006/picture" w:id="58"/>
+    <w:bookmarkEnd xmlns:a="http://schemas.openxmlformats.org/drawingml/2006/main" xmlns:pic="http://schemas.openxmlformats.org/drawingml/2006/picture" w:id="53"/>
     <w:p xmlns:a="http://schemas.openxmlformats.org/drawingml/2006/main" xmlns:pic="http://schemas.openxmlformats.org/drawingml/2006/picture">
       <w:pPr>
         <w:pStyle w:val="Heading3"/>
@@ -7307,9 +7322,13 @@
     </w:p>
     <w:p xmlns:a="http://schemas.openxmlformats.org/drawingml/2006/main" xmlns:pic="http://schemas.openxmlformats.org/drawingml/2006/picture">
       <w:pPr>
-        <w:pStyle w:val="Heading4"/>
+        <w:pStyle w:val="FirstParagraph"/>
       </w:pPr>
       <w:r>
+        <w:rPr>
+          <w:b/>
+          <w:bCs/>
+        </w:rPr>
         <w:t xml:space="preserve">Clase abstracta Persona (src/models/persona.py)</w:t>
       </w:r>
     </w:p>
@@ -7903,12 +7922,15 @@
         <w:t xml:space="preserve">NotImplementedError</w:t>
       </w:r>
     </w:p>
-    <w:bookmarkEnd xmlns:a="http://schemas.openxmlformats.org/drawingml/2006/main" xmlns:pic="http://schemas.openxmlformats.org/drawingml/2006/picture" w:id="59"/>
     <w:p xmlns:a="http://schemas.openxmlformats.org/drawingml/2006/main" xmlns:pic="http://schemas.openxmlformats.org/drawingml/2006/picture">
       <w:pPr>
-        <w:pStyle w:val="Heading4"/>
+        <w:pStyle w:val="FirstParagraph"/>
       </w:pPr>
       <w:r>
+        <w:rPr>
+          <w:b/>
+          <w:bCs/>
+        </w:rPr>
         <w:t xml:space="preserve">Herencia: Estudiante (src/models/estudiante.py)</w:t>
       </w:r>
     </w:p>
@@ -8313,12 +8335,15 @@
         <w:t xml:space="preserve">"Estudiante"</w:t>
       </w:r>
     </w:p>
-    <w:bookmarkEnd xmlns:a="http://schemas.openxmlformats.org/drawingml/2006/main" xmlns:pic="http://schemas.openxmlformats.org/drawingml/2006/picture" w:id="60"/>
     <w:p xmlns:a="http://schemas.openxmlformats.org/drawingml/2006/main" xmlns:pic="http://schemas.openxmlformats.org/drawingml/2006/picture">
       <w:pPr>
-        <w:pStyle w:val="Heading4"/>
+        <w:pStyle w:val="FirstParagraph"/>
       </w:pPr>
       <w:r>
+        <w:rPr>
+          <w:b/>
+          <w:bCs/>
+        </w:rPr>
         <w:t xml:space="preserve">CRUD Socios (src/database/socio_repo.py)</w:t>
       </w:r>
     </w:p>
@@ -8606,12 +8631,15 @@
         <w:t xml:space="preserve">.__db.get_connection().commit()</w:t>
       </w:r>
     </w:p>
-    <w:bookmarkEnd xmlns:a="http://schemas.openxmlformats.org/drawingml/2006/main" xmlns:pic="http://schemas.openxmlformats.org/drawingml/2006/picture" w:id="61"/>
     <w:p xmlns:a="http://schemas.openxmlformats.org/drawingml/2006/main" xmlns:pic="http://schemas.openxmlformats.org/drawingml/2006/picture">
       <w:pPr>
-        <w:pStyle w:val="Heading4"/>
+        <w:pStyle w:val="FirstParagraph"/>
       </w:pPr>
       <w:r>
+        <w:rPr>
+          <w:b/>
+          <w:bCs/>
+        </w:rPr>
         <w:t xml:space="preserve">GUI — Préstamo (src/gui/app.py)</w:t>
       </w:r>
     </w:p>
@@ -9050,9 +9078,8 @@
         </w:pict>
       </w:r>
     </w:p>
-    <w:bookmarkEnd xmlns:a="http://schemas.openxmlformats.org/drawingml/2006/main" xmlns:pic="http://schemas.openxmlformats.org/drawingml/2006/picture" w:id="62"/>
-    <w:bookmarkEnd xmlns:a="http://schemas.openxmlformats.org/drawingml/2006/main" xmlns:pic="http://schemas.openxmlformats.org/drawingml/2006/picture" w:id="63"/>
-    <w:bookmarkEnd xmlns:a="http://schemas.openxmlformats.org/drawingml/2006/main" xmlns:pic="http://schemas.openxmlformats.org/drawingml/2006/picture" w:id="64"/>
+    <w:bookmarkEnd xmlns:a="http://schemas.openxmlformats.org/drawingml/2006/main" xmlns:pic="http://schemas.openxmlformats.org/drawingml/2006/picture" w:id="54"/>
+    <w:bookmarkEnd xmlns:a="http://schemas.openxmlformats.org/drawingml/2006/main" xmlns:pic="http://schemas.openxmlformats.org/drawingml/2006/picture" w:id="55"/>
     <w:p xmlns:a="http://schemas.openxmlformats.org/drawingml/2006/main" xmlns:pic="http://schemas.openxmlformats.org/drawingml/2006/picture">
       <w:pPr>
         <w:pStyle w:val="Heading2"/>
@@ -9546,7 +9573,7 @@
         </w:pict>
       </w:r>
     </w:p>
-    <w:bookmarkEnd xmlns:a="http://schemas.openxmlformats.org/drawingml/2006/main" xmlns:pic="http://schemas.openxmlformats.org/drawingml/2006/picture" w:id="65"/>
+    <w:bookmarkEnd xmlns:a="http://schemas.openxmlformats.org/drawingml/2006/main" xmlns:pic="http://schemas.openxmlformats.org/drawingml/2006/picture" w:id="56"/>
     <w:p xmlns:a="http://schemas.openxmlformats.org/drawingml/2006/main" xmlns:pic="http://schemas.openxmlformats.org/drawingml/2006/picture">
       <w:pPr>
         <w:pStyle w:val="Heading2"/>
@@ -9909,7 +9936,7 @@
         <w:t xml:space="preserve">Cada libro puede estar en 0 o muchos préstamos y 0 o muchas reservas.</w:t>
       </w:r>
     </w:p>
-    <w:bookmarkEnd xmlns:a="http://schemas.openxmlformats.org/drawingml/2006/main" xmlns:pic="http://schemas.openxmlformats.org/drawingml/2006/picture" w:id="66"/>
+    <w:bookmarkEnd xmlns:a="http://schemas.openxmlformats.org/drawingml/2006/main" xmlns:pic="http://schemas.openxmlformats.org/drawingml/2006/picture" w:id="57"/>
     <w:p xmlns:a="http://schemas.openxmlformats.org/drawingml/2006/main" xmlns:pic="http://schemas.openxmlformats.org/drawingml/2006/picture">
       <w:pPr>
         <w:pStyle w:val="Heading3"/>
@@ -11195,7 +11222,7 @@
         <w:t xml:space="preserve">);</w:t>
       </w:r>
     </w:p>
-    <w:bookmarkEnd xmlns:a="http://schemas.openxmlformats.org/drawingml/2006/main" xmlns:pic="http://schemas.openxmlformats.org/drawingml/2006/picture" w:id="67"/>
+    <w:bookmarkEnd xmlns:a="http://schemas.openxmlformats.org/drawingml/2006/main" xmlns:pic="http://schemas.openxmlformats.org/drawingml/2006/picture" w:id="58"/>
     <w:p xmlns:a="http://schemas.openxmlformats.org/drawingml/2006/main" xmlns:pic="http://schemas.openxmlformats.org/drawingml/2006/picture">
       <w:pPr>
         <w:pStyle w:val="Heading3"/>
@@ -11253,7 +11280,7 @@
       <w:r>
         <w:t xml:space="preserve"> </w:t>
       </w:r>
-      <w:hyperlink r:id="rId68">
+      <w:hyperlink r:id="rId59">
         <w:r>
           <w:rPr>
             <w:rStyle w:val="Hyperlink"/>
@@ -11463,7 +11490,7 @@
         <w:t xml:space="preserve">Durante la defensa, el docente puede pedir que se muestre la base de datos en DB Browser. Se recomienda tenerlo instalado y saber navegar las tablas, mostrar relaciones y ejecutar consultas SELECT básicas.</w:t>
       </w:r>
     </w:p>
-    <w:bookmarkEnd xmlns:a="http://schemas.openxmlformats.org/drawingml/2006/main" xmlns:pic="http://schemas.openxmlformats.org/drawingml/2006/picture" w:id="69"/>
+    <w:bookmarkEnd xmlns:a="http://schemas.openxmlformats.org/drawingml/2006/main" xmlns:pic="http://schemas.openxmlformats.org/drawingml/2006/picture" w:id="60"/>
     <w:p xmlns:a="http://schemas.openxmlformats.org/drawingml/2006/main" xmlns:pic="http://schemas.openxmlformats.org/drawingml/2006/picture">
       <w:pPr>
         <w:pStyle w:val="Heading3"/>
@@ -12108,8 +12135,8 @@
         </w:pict>
       </w:r>
     </w:p>
-    <w:bookmarkEnd xmlns:a="http://schemas.openxmlformats.org/drawingml/2006/main" xmlns:pic="http://schemas.openxmlformats.org/drawingml/2006/picture" w:id="70"/>
-    <w:bookmarkEnd xmlns:a="http://schemas.openxmlformats.org/drawingml/2006/main" xmlns:pic="http://schemas.openxmlformats.org/drawingml/2006/picture" w:id="71"/>
+    <w:bookmarkEnd xmlns:a="http://schemas.openxmlformats.org/drawingml/2006/main" xmlns:pic="http://schemas.openxmlformats.org/drawingml/2006/picture" w:id="61"/>
+    <w:bookmarkEnd xmlns:a="http://schemas.openxmlformats.org/drawingml/2006/main" xmlns:pic="http://schemas.openxmlformats.org/drawingml/2006/picture" w:id="62"/>
     <w:p xmlns:a="http://schemas.openxmlformats.org/drawingml/2006/main" xmlns:pic="http://schemas.openxmlformats.org/drawingml/2006/picture">
       <w:pPr>
         <w:pStyle w:val="Heading2"/>
@@ -12621,7 +12648,7 @@
         </w:pict>
       </w:r>
     </w:p>
-    <w:bookmarkEnd xmlns:a="http://schemas.openxmlformats.org/drawingml/2006/main" xmlns:pic="http://schemas.openxmlformats.org/drawingml/2006/picture" w:id="72"/>
+    <w:bookmarkEnd xmlns:a="http://schemas.openxmlformats.org/drawingml/2006/main" xmlns:pic="http://schemas.openxmlformats.org/drawingml/2006/picture" w:id="63"/>
     <w:p xmlns:a="http://schemas.openxmlformats.org/drawingml/2006/main" xmlns:pic="http://schemas.openxmlformats.org/drawingml/2006/picture">
       <w:pPr>
         <w:pStyle w:val="Heading2"/>
@@ -12722,7 +12749,7 @@
         <w:t xml:space="preserve">El modelo incremental permitió entregar un avance del 50% en la Semana 12 y completar el sistema en la Semana 14.</w:t>
       </w:r>
     </w:p>
-    <w:bookmarkEnd xmlns:a="http://schemas.openxmlformats.org/drawingml/2006/main" xmlns:pic="http://schemas.openxmlformats.org/drawingml/2006/picture" w:id="73"/>
+    <w:bookmarkEnd xmlns:a="http://schemas.openxmlformats.org/drawingml/2006/main" xmlns:pic="http://schemas.openxmlformats.org/drawingml/2006/picture" w:id="64"/>
     <w:p xmlns:a="http://schemas.openxmlformats.org/drawingml/2006/main" xmlns:pic="http://schemas.openxmlformats.org/drawingml/2006/picture">
       <w:pPr>
         <w:pStyle w:val="Heading3"/>
@@ -12798,8 +12825,8 @@
         </w:pict>
       </w:r>
     </w:p>
-    <w:bookmarkEnd xmlns:a="http://schemas.openxmlformats.org/drawingml/2006/main" xmlns:pic="http://schemas.openxmlformats.org/drawingml/2006/picture" w:id="74"/>
-    <w:bookmarkEnd xmlns:a="http://schemas.openxmlformats.org/drawingml/2006/main" xmlns:pic="http://schemas.openxmlformats.org/drawingml/2006/picture" w:id="75"/>
+    <w:bookmarkEnd xmlns:a="http://schemas.openxmlformats.org/drawingml/2006/main" xmlns:pic="http://schemas.openxmlformats.org/drawingml/2006/picture" w:id="65"/>
+    <w:bookmarkEnd xmlns:a="http://schemas.openxmlformats.org/drawingml/2006/main" xmlns:pic="http://schemas.openxmlformats.org/drawingml/2006/picture" w:id="66"/>
     <w:p xmlns:a="http://schemas.openxmlformats.org/drawingml/2006/main" xmlns:pic="http://schemas.openxmlformats.org/drawingml/2006/picture">
       <w:pPr>
         <w:pStyle w:val="Heading2"/>
@@ -12947,7 +12974,7 @@
         </w:pict>
       </w:r>
     </w:p>
-    <w:bookmarkEnd xmlns:a="http://schemas.openxmlformats.org/drawingml/2006/main" xmlns:pic="http://schemas.openxmlformats.org/drawingml/2006/picture" w:id="76"/>
+    <w:bookmarkEnd xmlns:a="http://schemas.openxmlformats.org/drawingml/2006/main" xmlns:pic="http://schemas.openxmlformats.org/drawingml/2006/picture" w:id="67"/>
     <w:p xmlns:a="http://schemas.openxmlformats.org/drawingml/2006/main" xmlns:pic="http://schemas.openxmlformats.org/drawingml/2006/picture">
       <w:pPr>
         <w:pStyle w:val="Heading2"/>
@@ -12966,9 +12993,13 @@
     </w:p>
     <w:p xmlns:a="http://schemas.openxmlformats.org/drawingml/2006/main" xmlns:pic="http://schemas.openxmlformats.org/drawingml/2006/picture">
       <w:pPr>
-        <w:pStyle w:val="Heading4"/>
+        <w:pStyle w:val="FirstParagraph"/>
       </w:pPr>
       <w:r>
+        <w:rPr>
+          <w:b/>
+          <w:bCs/>
+        </w:rPr>
         <w:t xml:space="preserve">Esquema SQL (DDL)</w:t>
       </w:r>
     </w:p>
@@ -14105,15 +14136,6 @@
         <w:t xml:space="preserve">);</w:t>
       </w:r>
     </w:p>
-    <w:bookmarkEnd xmlns:a="http://schemas.openxmlformats.org/drawingml/2006/main" xmlns:pic="http://schemas.openxmlformats.org/drawingml/2006/picture" w:id="77"/>
-    <w:p xmlns:a="http://schemas.openxmlformats.org/drawingml/2006/main" xmlns:pic="http://schemas.openxmlformats.org/drawingml/2006/picture">
-      <w:pPr>
-        <w:pStyle w:val="Heading4"/>
-      </w:pPr>
-      <w:r>
-        <w:t xml:space="preserve">Datos de prueba (7 socios + 8 libros)</w:t>
-      </w:r>
-    </w:p>
     <w:p xmlns:a="http://schemas.openxmlformats.org/drawingml/2006/main" xmlns:pic="http://schemas.openxmlformats.org/drawingml/2006/picture">
       <w:pPr>
         <w:pStyle w:val="FirstParagraph"/>
@@ -14123,61 +14145,7 @@
           <w:b/>
           <w:bCs/>
         </w:rPr>
-        <w:t xml:space="preserve">socios:</w:t>
-      </w:r>
-      <w:r>
-        <w:t xml:space="preserve"> </w:t>
-      </w:r>
-      <w:r>
-        <w:t xml:space="preserve">| cedula | nombre | apellido | tipo | carrera_departamento | semestre |</w:t>
-      </w:r>
-      <w:r>
-        <w:t xml:space="preserve"> </w:t>
-      </w:r>
-      <w:r>
-        <w:t xml:space="preserve">|——–|——–|———-|——|———————|:——–:|</w:t>
-      </w:r>
-      <w:r>
-        <w:t xml:space="preserve"> </w:t>
-      </w:r>
-      <w:r>
-        <w:t xml:space="preserve">| 0956789012 | Henry | Pazmino | Estudiante | Computacion | 3 |</w:t>
-      </w:r>
-      <w:r>
-        <w:t xml:space="preserve"> </w:t>
-      </w:r>
-      <w:r>
-        <w:t xml:space="preserve">| 0956789013 | Jodie | Parrales | Estudiante | Computacion | 3 |</w:t>
-      </w:r>
-      <w:r>
-        <w:t xml:space="preserve"> </w:t>
-      </w:r>
-      <w:r>
-        <w:t xml:space="preserve">| 0956789014 | Cindy | Ayovi | Estudiante | Computacion | 3 |</w:t>
-      </w:r>
-      <w:r>
-        <w:t xml:space="preserve"> </w:t>
-      </w:r>
-      <w:r>
-        <w:t xml:space="preserve">| 0956789015 | Cesar | Gonzales | Estudiante | Computacion | 3 |</w:t>
-      </w:r>
-      <w:r>
-        <w:t xml:space="preserve"> </w:t>
-      </w:r>
-      <w:r>
-        <w:t xml:space="preserve">| 0956789016 | Mayra | Vera | Estudiante | Computacion | 3 |</w:t>
-      </w:r>
-      <w:r>
-        <w:t xml:space="preserve"> </w:t>
-      </w:r>
-      <w:r>
-        <w:t xml:space="preserve">| 0912345678 | Miguel | Velez | Docente | Sistemas | — |</w:t>
-      </w:r>
-      <w:r>
-        <w:t xml:space="preserve"> </w:t>
-      </w:r>
-      <w:r>
-        <w:t xml:space="preserve">| 0912345679 | Bryan | Velez | Docente | Computacion | — |</w:t>
+        <w:t xml:space="preserve">Datos de prueba (7 socios + 8 libros)</w:t>
       </w:r>
     </w:p>
     <w:p xmlns:a="http://schemas.openxmlformats.org/drawingml/2006/main" xmlns:pic="http://schemas.openxmlformats.org/drawingml/2006/picture">
@@ -14189,6 +14157,72 @@
           <w:b/>
           <w:bCs/>
         </w:rPr>
+        <w:t xml:space="preserve">socios:</w:t>
+      </w:r>
+      <w:r>
+        <w:t xml:space="preserve"> </w:t>
+      </w:r>
+      <w:r>
+        <w:t xml:space="preserve">| cedula | nombre | apellido | tipo | carrera_departamento | semestre |</w:t>
+      </w:r>
+      <w:r>
+        <w:t xml:space="preserve"> </w:t>
+      </w:r>
+      <w:r>
+        <w:t xml:space="preserve">|——–|——–|———-|——|———————|:——–:|</w:t>
+      </w:r>
+      <w:r>
+        <w:t xml:space="preserve"> </w:t>
+      </w:r>
+      <w:r>
+        <w:t xml:space="preserve">| 0956789012 | Henry | Pazmino | Estudiante | Computacion | 3 |</w:t>
+      </w:r>
+      <w:r>
+        <w:t xml:space="preserve"> </w:t>
+      </w:r>
+      <w:r>
+        <w:t xml:space="preserve">| 0956789013 | Jodie | Parrales | Estudiante | Computacion | 3 |</w:t>
+      </w:r>
+      <w:r>
+        <w:t xml:space="preserve"> </w:t>
+      </w:r>
+      <w:r>
+        <w:t xml:space="preserve">| 0956789014 | Cindy | Ayovi | Estudiante | Computacion | 3 |</w:t>
+      </w:r>
+      <w:r>
+        <w:t xml:space="preserve"> </w:t>
+      </w:r>
+      <w:r>
+        <w:t xml:space="preserve">| 0956789015 | Cesar | Gonzales | Estudiante | Computacion | 3 |</w:t>
+      </w:r>
+      <w:r>
+        <w:t xml:space="preserve"> </w:t>
+      </w:r>
+      <w:r>
+        <w:t xml:space="preserve">| 0956789016 | Mayra | Vera | Estudiante | Computacion | 3 |</w:t>
+      </w:r>
+      <w:r>
+        <w:t xml:space="preserve"> </w:t>
+      </w:r>
+      <w:r>
+        <w:t xml:space="preserve">| 0912345678 | Miguel | Velez | Docente | Sistemas | — |</w:t>
+      </w:r>
+      <w:r>
+        <w:t xml:space="preserve"> </w:t>
+      </w:r>
+      <w:r>
+        <w:t xml:space="preserve">| 0912345679 | Bryan | Velez | Docente | Computacion | — |</w:t>
+      </w:r>
+    </w:p>
+    <w:p xmlns:a="http://schemas.openxmlformats.org/drawingml/2006/main" xmlns:pic="http://schemas.openxmlformats.org/drawingml/2006/picture">
+      <w:pPr>
+        <w:pStyle w:val="BodyText"/>
+      </w:pPr>
+      <w:r>
+        <w:rPr>
+          <w:b/>
+          <w:bCs/>
+        </w:rPr>
         <w:t xml:space="preserve">libros:</w:t>
       </w:r>
       <w:r>
@@ -14252,8 +14286,7 @@
         <w:t xml:space="preserve">| 978-6073206037 | Ingeniería del Software | I. Sommerville | 2 | 2 |</w:t>
       </w:r>
     </w:p>
-    <w:bookmarkEnd xmlns:a="http://schemas.openxmlformats.org/drawingml/2006/main" xmlns:pic="http://schemas.openxmlformats.org/drawingml/2006/picture" w:id="78"/>
-    <w:bookmarkEnd xmlns:a="http://schemas.openxmlformats.org/drawingml/2006/main" xmlns:pic="http://schemas.openxmlformats.org/drawingml/2006/picture" w:id="79"/>
+    <w:bookmarkEnd xmlns:a="http://schemas.openxmlformats.org/drawingml/2006/main" xmlns:pic="http://schemas.openxmlformats.org/drawingml/2006/picture" w:id="68"/>
     <w:p xmlns:a="http://schemas.openxmlformats.org/drawingml/2006/main" xmlns:pic="http://schemas.openxmlformats.org/drawingml/2006/picture">
       <w:pPr>
         <w:pStyle w:val="Heading3"/>
@@ -14417,7 +14450,7 @@
         </w:tc>
       </w:tr>
     </w:tbl>
-    <w:bookmarkEnd xmlns:a="http://schemas.openxmlformats.org/drawingml/2006/main" xmlns:pic="http://schemas.openxmlformats.org/drawingml/2006/picture" w:id="80"/>
+    <w:bookmarkEnd xmlns:a="http://schemas.openxmlformats.org/drawingml/2006/main" xmlns:pic="http://schemas.openxmlformats.org/drawingml/2006/picture" w:id="69"/>
     <w:p xmlns:a="http://schemas.openxmlformats.org/drawingml/2006/main" xmlns:pic="http://schemas.openxmlformats.org/drawingml/2006/picture">
       <w:pPr>
         <w:pStyle w:val="Heading3"/>
@@ -14785,8 +14818,8 @@
         <w:t xml:space="preserve">20 de julio de 2026</w:t>
       </w:r>
     </w:p>
-    <w:bookmarkEnd xmlns:a="http://schemas.openxmlformats.org/drawingml/2006/main" xmlns:pic="http://schemas.openxmlformats.org/drawingml/2006/picture" w:id="81"/>
-    <w:bookmarkEnd xmlns:a="http://schemas.openxmlformats.org/drawingml/2006/main" xmlns:pic="http://schemas.openxmlformats.org/drawingml/2006/picture" w:id="82"/>
+    <w:bookmarkEnd xmlns:a="http://schemas.openxmlformats.org/drawingml/2006/main" xmlns:pic="http://schemas.openxmlformats.org/drawingml/2006/picture" w:id="70"/>
+    <w:bookmarkEnd xmlns:a="http://schemas.openxmlformats.org/drawingml/2006/main" xmlns:pic="http://schemas.openxmlformats.org/drawingml/2006/picture" w:id="71"/>
   </w:body>
 </w:document>
 </file>

</xml_diff>

<commit_message>
docs: simplificar diagramas UML y ER a ASCII, acortar tabla 6.3, regenerar PDF
</commit_message>
<xml_diff>
--- a/docs/especificacion-proyecto.docx
+++ b/docs/especificacion-proyecto.docx
@@ -200,7 +200,6 @@
           </w:tcPr>
           <w:p>
             <w:pPr>
-              <w:spacing w:before="20" w:after="20" w:line="240" w:lineRule="auto"/>
               <w:jc w:val="right"/>
             </w:pPr>
             <w:r>
@@ -252,7 +251,6 @@
           </w:tcPr>
           <w:p>
             <w:pPr>
-              <w:spacing w:before="20" w:after="20" w:line="240" w:lineRule="auto"/>
               <w:jc w:val="right"/>
             </w:pPr>
             <w:r>
@@ -304,7 +302,6 @@
           </w:tcPr>
           <w:p>
             <w:pPr>
-              <w:spacing w:before="20" w:after="20" w:line="240" w:lineRule="auto"/>
               <w:jc w:val="right"/>
             </w:pPr>
             <w:r>
@@ -356,7 +353,6 @@
           </w:tcPr>
           <w:p>
             <w:pPr>
-              <w:spacing w:before="20" w:after="20" w:line="240" w:lineRule="auto"/>
               <w:jc w:val="right"/>
             </w:pPr>
             <w:r>
@@ -408,7 +404,6 @@
           </w:tcPr>
           <w:p>
             <w:pPr>
-              <w:spacing w:before="20" w:after="20" w:line="240" w:lineRule="auto"/>
               <w:jc w:val="right"/>
             </w:pPr>
             <w:r>
@@ -460,7 +455,6 @@
           </w:tcPr>
           <w:p>
             <w:pPr>
-              <w:spacing w:before="20" w:after="20" w:line="240" w:lineRule="auto"/>
               <w:jc w:val="right"/>
             </w:pPr>
             <w:r>
@@ -2580,14 +2574,13 @@
     <w:tbl xmlns:a="http://schemas.openxmlformats.org/drawingml/2006/main" xmlns:pic="http://schemas.openxmlformats.org/drawingml/2006/picture">
       <w:tblPr>
         <w:tblStyle w:val="Table"/>
-        <w:tblW w:type="pct" w:w="5000"/>
+        <w:tblW w:type="auto" w:w="0"/>
         <w:jc w:val="left"/>
-        <w:tblLayout w:type="fixed"/>
         <w:tblLook w:firstRow="1" w:lastRow="0" w:firstColumn="0" w:lastColumn="0" w:noHBand="0" w:noVBand="0" w:val="0020"/>
       </w:tblPr>
       <w:tblGrid>
-        <w:gridCol w:w="3120"/>
-        <w:gridCol w:w="2160"/>
+        <w:gridCol w:w="2640"/>
+        <w:gridCol w:w="2640"/>
         <w:gridCol w:w="2640"/>
       </w:tblGrid>
       <w:tr>
@@ -2678,7 +2671,7 @@
               <w:jc w:val="left"/>
             </w:pPr>
             <w:r>
-              <w:t xml:space="preserve">Visual Studio Code</w:t>
+              <w:t xml:space="preserve">VS Code</w:t>
             </w:r>
           </w:p>
         </w:tc>
@@ -2702,7 +2695,7 @@
               <w:jc w:val="left"/>
             </w:pPr>
             <w:r>
-              <w:t xml:space="preserve">Editor de código con extensión Python (Microsoft) y GitLens</w:t>
+              <w:t xml:space="preserve">Editor de código con Python</w:t>
             </w:r>
           </w:p>
         </w:tc>
@@ -2740,7 +2733,7 @@
               <w:jc w:val="left"/>
             </w:pPr>
             <w:r>
-              <w:t xml:space="preserve">Biblioteca de interfaz gráfica (incluida en Python)</w:t>
+              <w:t xml:space="preserve">Biblioteca gráfica (incluida)</w:t>
             </w:r>
           </w:p>
         </w:tc>
@@ -2778,7 +2771,7 @@
               <w:jc w:val="left"/>
             </w:pPr>
             <w:r>
-              <w:t xml:space="preserve">Motor de base de datos embebido</w:t>
+              <w:t xml:space="preserve">Motor de base de datos</w:t>
             </w:r>
           </w:p>
         </w:tc>
@@ -2792,7 +2785,7 @@
               <w:jc w:val="left"/>
             </w:pPr>
             <w:r>
-              <w:t xml:space="preserve">DB Browser for SQLite</w:t>
+              <w:t xml:space="preserve">DB Browser</w:t>
             </w:r>
           </w:p>
         </w:tc>
@@ -2816,7 +2809,7 @@
               <w:jc w:val="left"/>
             </w:pPr>
             <w:r>
-              <w:t xml:space="preserve">Administración visual de la BD</w:t>
+              <w:t xml:space="preserve">Administración visual de BD</w:t>
             </w:r>
           </w:p>
         </w:tc>
@@ -2931,7 +2924,7 @@
         <w:rPr>
           <w:rStyle w:val="VerbatimChar"/>
         </w:rPr>
-        <w:t xml:space="preserve">┌────────────────────────────────────────┐</w:t>
+        <w:t xml:space="preserve">+----------------------------------------+</w:t>
       </w:r>
       <w:r>
         <w:br/>
@@ -2940,7 +2933,7 @@
         <w:rPr>
           <w:rStyle w:val="VerbatimChar"/>
         </w:rPr>
-        <w:t xml:space="preserve">│              Persona                    │ ◄── Abstracción</w:t>
+        <w:t xml:space="preserve">|              Persona                    | ◄-- Abstracción</w:t>
       </w:r>
       <w:r>
         <w:br/>
@@ -2949,7 +2942,7 @@
         <w:rPr>
           <w:rStyle w:val="VerbatimChar"/>
         </w:rPr>
-        <w:t xml:space="preserve">│  - __cedula: str                       │     (raise NotImplementedError)</w:t>
+        <w:t xml:space="preserve">|  - __cedula: str                       |     (raise NotImplementedError)</w:t>
       </w:r>
       <w:r>
         <w:br/>
@@ -2958,7 +2951,7 @@
         <w:rPr>
           <w:rStyle w:val="VerbatimChar"/>
         </w:rPr>
-        <w:t xml:space="preserve">│  - __nombre: str                       │</w:t>
+        <w:t xml:space="preserve">|  - __nombre: str                       |</w:t>
       </w:r>
       <w:r>
         <w:br/>
@@ -2967,7 +2960,7 @@
         <w:rPr>
           <w:rStyle w:val="VerbatimChar"/>
         </w:rPr>
-        <w:t xml:space="preserve">│  - __apellido: str                     │</w:t>
+        <w:t xml:space="preserve">|  - __apellido: str                     |</w:t>
       </w:r>
       <w:r>
         <w:br/>
@@ -2976,7 +2969,7 @@
         <w:rPr>
           <w:rStyle w:val="VerbatimChar"/>
         </w:rPr>
-        <w:t xml:space="preserve">│  - __telefono: str                     │</w:t>
+        <w:t xml:space="preserve">|  - __telefono: str                     |</w:t>
       </w:r>
       <w:r>
         <w:br/>
@@ -2985,7 +2978,7 @@
         <w:rPr>
           <w:rStyle w:val="VerbatimChar"/>
         </w:rPr>
-        <w:t xml:space="preserve">├────────────────────────────────────────┤</w:t>
+        <w:t xml:space="preserve">+----------------------------------------+</w:t>
       </w:r>
       <w:r>
         <w:br/>
@@ -2994,7 +2987,7 @@
         <w:rPr>
           <w:rStyle w:val="VerbatimChar"/>
         </w:rPr>
-        <w:t xml:space="preserve">│  + get_cedula(): str                   │</w:t>
+        <w:t xml:space="preserve">|  + get_cedula(): str                   |</w:t>
       </w:r>
       <w:r>
         <w:br/>
@@ -3003,7 +2996,7 @@
         <w:rPr>
           <w:rStyle w:val="VerbatimChar"/>
         </w:rPr>
-        <w:t xml:space="preserve">│  + get_nombre_completo(): str          │</w:t>
+        <w:t xml:space="preserve">|  + get_nombre_completo(): str          |</w:t>
       </w:r>
       <w:r>
         <w:br/>
@@ -3012,7 +3005,7 @@
         <w:rPr>
           <w:rStyle w:val="VerbatimChar"/>
         </w:rPr>
-        <w:t xml:space="preserve">│  + tipo_socio(): str                   │ ◄── Polimorfismo</w:t>
+        <w:t xml:space="preserve">|  + tipo_socio(): str                   | ◄-- Polimorfismo</w:t>
       </w:r>
       <w:r>
         <w:br/>
@@ -3021,7 +3014,7 @@
         <w:rPr>
           <w:rStyle w:val="VerbatimChar"/>
         </w:rPr>
-        <w:t xml:space="preserve">└────────────┬───────────────────────────┘</w:t>
+        <w:t xml:space="preserve">+------------+---------------------------+</w:t>
       </w:r>
       <w:r>
         <w:br/>
@@ -3030,7 +3023,7 @@
         <w:rPr>
           <w:rStyle w:val="VerbatimChar"/>
         </w:rPr>
-        <w:t xml:space="preserve">             │  Herencia</w:t>
+        <w:t xml:space="preserve">             |  Herencia</w:t>
       </w:r>
       <w:r>
         <w:br/>
@@ -3039,7 +3032,7 @@
         <w:rPr>
           <w:rStyle w:val="VerbatimChar"/>
         </w:rPr>
-        <w:t xml:space="preserve">    ┌────────┴────────┐</w:t>
+        <w:t xml:space="preserve">    +--------+--------+</w:t>
       </w:r>
       <w:r>
         <w:br/>
@@ -3048,7 +3041,7 @@
         <w:rPr>
           <w:rStyle w:val="VerbatimChar"/>
         </w:rPr>
-        <w:t xml:space="preserve">    ▼                 ▼</w:t>
+        <w:t xml:space="preserve">    V                 V</w:t>
       </w:r>
       <w:r>
         <w:br/>
@@ -3057,7 +3050,7 @@
         <w:rPr>
           <w:rStyle w:val="VerbatimChar"/>
         </w:rPr>
-        <w:t xml:space="preserve">┌─────────────┐ ┌─────────────┐</w:t>
+        <w:t xml:space="preserve">+-------------+ +-------------+</w:t>
       </w:r>
       <w:r>
         <w:br/>
@@ -3066,7 +3059,7 @@
         <w:rPr>
           <w:rStyle w:val="VerbatimChar"/>
         </w:rPr>
-        <w:t xml:space="preserve">│  Estudiante │ │   Docente   │</w:t>
+        <w:t xml:space="preserve">|  Estudiante | |   Docente   |</w:t>
       </w:r>
       <w:r>
         <w:br/>
@@ -3075,7 +3068,7 @@
         <w:rPr>
           <w:rStyle w:val="VerbatimChar"/>
         </w:rPr>
-        <w:t xml:space="preserve">├─────────────┤ ├─────────────┤</w:t>
+        <w:t xml:space="preserve">+-------------+ +-------------+</w:t>
       </w:r>
       <w:r>
         <w:br/>
@@ -3084,7 +3077,7 @@
         <w:rPr>
           <w:rStyle w:val="VerbatimChar"/>
         </w:rPr>
-        <w:t xml:space="preserve">│ - __carrera │ │ - __depto   │</w:t>
+        <w:t xml:space="preserve">| - __carrera | | - __depto   |</w:t>
       </w:r>
       <w:r>
         <w:br/>
@@ -3093,7 +3086,7 @@
         <w:rPr>
           <w:rStyle w:val="VerbatimChar"/>
         </w:rPr>
-        <w:t xml:space="preserve">│ - __semestre│ │             │</w:t>
+        <w:t xml:space="preserve">| - __semestre| |             |</w:t>
       </w:r>
       <w:r>
         <w:br/>
@@ -3102,7 +3095,7 @@
         <w:rPr>
           <w:rStyle w:val="VerbatimChar"/>
         </w:rPr>
-        <w:t xml:space="preserve">├─────────────┤ ├─────────────┤</w:t>
+        <w:t xml:space="preserve">+-------------+ +-------------+</w:t>
       </w:r>
       <w:r>
         <w:br/>
@@ -3111,7 +3104,7 @@
         <w:rPr>
           <w:rStyle w:val="VerbatimChar"/>
         </w:rPr>
-        <w:t xml:space="preserve">│ + tipo_socio│ │ + tipo_socio│</w:t>
+        <w:t xml:space="preserve">| + tipo_socio| | + tipo_socio|</w:t>
       </w:r>
       <w:r>
         <w:br/>
@@ -3120,7 +3113,7 @@
         <w:rPr>
           <w:rStyle w:val="VerbatimChar"/>
         </w:rPr>
-        <w:t xml:space="preserve">│ = Estudiante│ │ = Docente   │</w:t>
+        <w:t xml:space="preserve">| = Estudiante| | = Docente   |</w:t>
       </w:r>
       <w:r>
         <w:br/>
@@ -3129,7 +3122,7 @@
         <w:rPr>
           <w:rStyle w:val="VerbatimChar"/>
         </w:rPr>
-        <w:t xml:space="preserve">└─────────────┘ └─────────────┘</w:t>
+        <w:t xml:space="preserve">+-------------+ +-------------+</w:t>
       </w:r>
       <w:r>
         <w:br/>
@@ -3138,7 +3131,7 @@
         <w:rPr>
           <w:rStyle w:val="VerbatimChar"/>
         </w:rPr>
-        <w:t xml:space="preserve">        │                │</w:t>
+        <w:t xml:space="preserve">        |                |</w:t>
       </w:r>
       <w:r>
         <w:br/>
@@ -3147,7 +3140,7 @@
         <w:rPr>
           <w:rStyle w:val="VerbatimChar"/>
         </w:rPr>
-        <w:t xml:space="preserve">        └───────┬────────┘</w:t>
+        <w:t xml:space="preserve">        +-------+--------+</w:t>
       </w:r>
       <w:r>
         <w:br/>
@@ -3156,7 +3149,7 @@
         <w:rPr>
           <w:rStyle w:val="VerbatimChar"/>
         </w:rPr>
-        <w:t xml:space="preserve">                ▼</w:t>
+        <w:t xml:space="preserve">                V</w:t>
       </w:r>
       <w:r>
         <w:br/>
@@ -3165,7 +3158,7 @@
         <w:rPr>
           <w:rStyle w:val="VerbatimChar"/>
         </w:rPr>
-        <w:t xml:space="preserve">        ┌──────────────┐</w:t>
+        <w:t xml:space="preserve">        +--------------+</w:t>
       </w:r>
       <w:r>
         <w:br/>
@@ -3174,7 +3167,7 @@
         <w:rPr>
           <w:rStyle w:val="VerbatimChar"/>
         </w:rPr>
-        <w:t xml:space="preserve">        │    Socio     │ ◄── Wrapper polimórfico</w:t>
+        <w:t xml:space="preserve">        |    Socio     | ◄-- Wrapper polimórfico</w:t>
       </w:r>
       <w:r>
         <w:br/>
@@ -3183,7 +3176,7 @@
         <w:rPr>
           <w:rStyle w:val="VerbatimChar"/>
         </w:rPr>
-        <w:t xml:space="preserve">        │ - __persona  │      contiene Estudiante o Docente</w:t>
+        <w:t xml:space="preserve">        | - __persona  |      contiene Estudiante o Docente</w:t>
       </w:r>
       <w:r>
         <w:br/>
@@ -3192,7 +3185,7 @@
         <w:rPr>
           <w:rStyle w:val="VerbatimChar"/>
         </w:rPr>
-        <w:t xml:space="preserve">        └──────────────┘</w:t>
+        <w:t xml:space="preserve">        +--------------+</w:t>
       </w:r>
       <w:r>
         <w:br/>
@@ -3204,7 +3197,7 @@
         <w:rPr>
           <w:rStyle w:val="VerbatimChar"/>
         </w:rPr>
-        <w:t xml:space="preserve">┌──────────────────┐      ┌──────────────────┐</w:t>
+        <w:t xml:space="preserve">+------------------+      +------------------+</w:t>
       </w:r>
       <w:r>
         <w:br/>
@@ -3213,7 +3206,7 @@
         <w:rPr>
           <w:rStyle w:val="VerbatimChar"/>
         </w:rPr>
-        <w:t xml:space="preserve">│      Libro       │      │    Prestamo      │</w:t>
+        <w:t xml:space="preserve">|      Libro       |      |    Prestamo      |</w:t>
       </w:r>
       <w:r>
         <w:br/>
@@ -3222,7 +3215,7 @@
         <w:rPr>
           <w:rStyle w:val="VerbatimChar"/>
         </w:rPr>
-        <w:t xml:space="preserve">├──────────────────┤      ├──────────────────┤</w:t>
+        <w:t xml:space="preserve">+------------------+      +------------------+</w:t>
       </w:r>
       <w:r>
         <w:br/>
@@ -3231,7 +3224,7 @@
         <w:rPr>
           <w:rStyle w:val="VerbatimChar"/>
         </w:rPr>
-        <w:t xml:space="preserve">│ - __isbn         │      │ - __socio        │──► Socio</w:t>
+        <w:t xml:space="preserve">| - __isbn         |      | - __socio        |---&gt; Socio</w:t>
       </w:r>
       <w:r>
         <w:br/>
@@ -3240,7 +3233,7 @@
         <w:rPr>
           <w:rStyle w:val="VerbatimChar"/>
         </w:rPr>
-        <w:t xml:space="preserve">│ - __titulo       │      │ - __libro        │──► Libro</w:t>
+        <w:t xml:space="preserve">| - __titulo       |      | - __libro        |---&gt; Libro</w:t>
       </w:r>
       <w:r>
         <w:br/>
@@ -3249,7 +3242,7 @@
         <w:rPr>
           <w:rStyle w:val="VerbatimChar"/>
         </w:rPr>
-        <w:t xml:space="preserve">│ - __autor        │      │ - __fecha_prest  │</w:t>
+        <w:t xml:space="preserve">| - __autor        |      | - __fecha_prest  |</w:t>
       </w:r>
       <w:r>
         <w:br/>
@@ -3258,7 +3251,7 @@
         <w:rPr>
           <w:rStyle w:val="VerbatimChar"/>
         </w:rPr>
-        <w:t xml:space="preserve">│ - __ejemplares   │      │ - __fecha_dev    │</w:t>
+        <w:t xml:space="preserve">| - __ejemplares   |      | - __fecha_dev    |</w:t>
       </w:r>
       <w:r>
         <w:br/>
@@ -3267,7 +3260,7 @@
         <w:rPr>
           <w:rStyle w:val="VerbatimChar"/>
         </w:rPr>
-        <w:t xml:space="preserve">│ - __disponibles  │      └──────────────────┘</w:t>
+        <w:t xml:space="preserve">| - __disponibles  |      +------------------+</w:t>
       </w:r>
       <w:r>
         <w:br/>
@@ -3276,7 +3269,7 @@
         <w:rPr>
           <w:rStyle w:val="VerbatimChar"/>
         </w:rPr>
-        <w:t xml:space="preserve">├──────────────────┤</w:t>
+        <w:t xml:space="preserve">+------------------+</w:t>
       </w:r>
       <w:r>
         <w:br/>
@@ -3285,7 +3278,7 @@
         <w:rPr>
           <w:rStyle w:val="VerbatimChar"/>
         </w:rPr>
-        <w:t xml:space="preserve">│ + prestar()      │      ┌──────────────────┐</w:t>
+        <w:t xml:space="preserve">| + prestar()      |      +------------------+</w:t>
       </w:r>
       <w:r>
         <w:br/>
@@ -3294,7 +3287,7 @@
         <w:rPr>
           <w:rStyle w:val="VerbatimChar"/>
         </w:rPr>
-        <w:t xml:space="preserve">│ + devolver()     │      │    Reserva       │</w:t>
+        <w:t xml:space="preserve">| + devolver()     |      |    Reserva       |</w:t>
       </w:r>
       <w:r>
         <w:br/>
@@ -3303,7 +3296,7 @@
         <w:rPr>
           <w:rStyle w:val="VerbatimChar"/>
         </w:rPr>
-        <w:t xml:space="preserve">│ + esta_disp()    │      ├──────────────────┤</w:t>
+        <w:t xml:space="preserve">| + esta_disp()    |      +------------------+</w:t>
       </w:r>
       <w:r>
         <w:br/>
@@ -3312,7 +3305,7 @@
         <w:rPr>
           <w:rStyle w:val="VerbatimChar"/>
         </w:rPr>
-        <w:t xml:space="preserve">└──────────────────┘      │ - __socio        │──► Socio</w:t>
+        <w:t xml:space="preserve">+------------------+      | - __socio        |---&gt; Socio</w:t>
       </w:r>
       <w:r>
         <w:br/>
@@ -3321,7 +3314,7 @@
         <w:rPr>
           <w:rStyle w:val="VerbatimChar"/>
         </w:rPr>
-        <w:t xml:space="preserve">                          │ - __libro        │──► Libro</w:t>
+        <w:t xml:space="preserve">                          | - __libro        |---&gt; Libro</w:t>
       </w:r>
       <w:r>
         <w:br/>
@@ -3330,7 +3323,7 @@
         <w:rPr>
           <w:rStyle w:val="VerbatimChar"/>
         </w:rPr>
-        <w:t xml:space="preserve">                          │ - __fecha        │</w:t>
+        <w:t xml:space="preserve">                          | - __fecha        |</w:t>
       </w:r>
       <w:r>
         <w:br/>
@@ -3339,7 +3332,7 @@
         <w:rPr>
           <w:rStyle w:val="VerbatimChar"/>
         </w:rPr>
-        <w:t xml:space="preserve">                          │ - __activa       │</w:t>
+        <w:t xml:space="preserve">                          | - __activa       |</w:t>
       </w:r>
       <w:r>
         <w:br/>
@@ -3348,7 +3341,7 @@
         <w:rPr>
           <w:rStyle w:val="VerbatimChar"/>
         </w:rPr>
-        <w:t xml:space="preserve">                          └──────────────────┘</w:t>
+        <w:t xml:space="preserve">                          +------------------+</w:t>
       </w:r>
       <w:r>
         <w:br/>
@@ -3369,7 +3362,7 @@
         <w:rPr>
           <w:rStyle w:val="VerbatimChar"/>
         </w:rPr>
-        <w:t xml:space="preserve">┌──────────────┐  ┌──────────────┐  ┌──────────────┐</w:t>
+        <w:t xml:space="preserve">+--------------+  +--------------+  +--------------+</w:t>
       </w:r>
       <w:r>
         <w:br/>
@@ -3378,7 +3371,7 @@
         <w:rPr>
           <w:rStyle w:val="VerbatimChar"/>
         </w:rPr>
-        <w:t xml:space="preserve">│ LinkedList   │  │    Queue     │  │    Stack     │</w:t>
+        <w:t xml:space="preserve">| LinkedList   |  |    Queue     |  |    Stack     |</w:t>
       </w:r>
       <w:r>
         <w:br/>
@@ -3387,7 +3380,7 @@
         <w:rPr>
           <w:rStyle w:val="VerbatimChar"/>
         </w:rPr>
-        <w:t xml:space="preserve">│ (Nodo → Nodo)│  │  (FIFO)     │  │  (LIFO)      │</w:t>
+        <w:t xml:space="preserve">| (Nodo → Nodo)|  |  (FIFO)     |  |  (LIFO)      |</w:t>
       </w:r>
       <w:r>
         <w:br/>
@@ -3396,7 +3389,7 @@
         <w:rPr>
           <w:rStyle w:val="VerbatimChar"/>
         </w:rPr>
-        <w:t xml:space="preserve">│ append()     │  │ enqueue()   │  │ push()       │</w:t>
+        <w:t xml:space="preserve">| append()     |  | enqueue()   |  | push()       |</w:t>
       </w:r>
       <w:r>
         <w:br/>
@@ -3405,7 +3398,7 @@
         <w:rPr>
           <w:rStyle w:val="VerbatimChar"/>
         </w:rPr>
-        <w:t xml:space="preserve">│ prepend()    │  │ dequeue()   │  │ pop()        │</w:t>
+        <w:t xml:space="preserve">| prepend()    |  | dequeue()   |  | pop()        |</w:t>
       </w:r>
       <w:r>
         <w:br/>
@@ -3414,7 +3407,7 @@
         <w:rPr>
           <w:rStyle w:val="VerbatimChar"/>
         </w:rPr>
-        <w:t xml:space="preserve">│ remove()     │  │ peek()      │  │ peek()       │</w:t>
+        <w:t xml:space="preserve">| remove()     |  | peek()      |  | peek()       |</w:t>
       </w:r>
       <w:r>
         <w:br/>
@@ -3423,7 +3416,7 @@
         <w:rPr>
           <w:rStyle w:val="VerbatimChar"/>
         </w:rPr>
-        <w:t xml:space="preserve">│ find()       │  │             │  │              │</w:t>
+        <w:t xml:space="preserve">| find()       |  |             |  |              |</w:t>
       </w:r>
       <w:r>
         <w:br/>
@@ -3432,7 +3425,7 @@
         <w:rPr>
           <w:rStyle w:val="VerbatimChar"/>
         </w:rPr>
-        <w:t xml:space="preserve">└──────────────┘  └──────────────┘  └──────────────┘</w:t>
+        <w:t xml:space="preserve">+--------------+  +--------------+  +--------------+</w:t>
       </w:r>
       <w:r>
         <w:br/>
@@ -3453,7 +3446,7 @@
         <w:rPr>
           <w:rStyle w:val="VerbatimChar"/>
         </w:rPr>
-        <w:t xml:space="preserve">┌──────────────────┐  ┌──────────────────────┐</w:t>
+        <w:t xml:space="preserve">+------------------+  +----------------------+</w:t>
       </w:r>
       <w:r>
         <w:br/>
@@ -3462,7 +3455,7 @@
         <w:rPr>
           <w:rStyle w:val="VerbatimChar"/>
         </w:rPr>
-        <w:t xml:space="preserve">│    Búsqueda      │  │   Ordenamiento       │</w:t>
+        <w:t xml:space="preserve">|    Búsqueda      |  |   Ordenamiento       |</w:t>
       </w:r>
       <w:r>
         <w:br/>
@@ -3471,7 +3464,7 @@
         <w:rPr>
           <w:rStyle w:val="VerbatimChar"/>
         </w:rPr>
-        <w:t xml:space="preserve">│ Lineal (O(n))    │  │ Bubble (O(n²))       │</w:t>
+        <w:t xml:space="preserve">| Lineal (O(n))    |  | Bubble (O(n²))       |</w:t>
       </w:r>
       <w:r>
         <w:br/>
@@ -3480,7 +3473,7 @@
         <w:rPr>
           <w:rStyle w:val="VerbatimChar"/>
         </w:rPr>
-        <w:t xml:space="preserve">│ Binaria (O(log n))│  │ Insertion (O(n²))   │</w:t>
+        <w:t xml:space="preserve">| Binaria (O(log n))|  | Insertion (O(n²))   |</w:t>
       </w:r>
       <w:r>
         <w:br/>
@@ -3489,7 +3482,7 @@
         <w:rPr>
           <w:rStyle w:val="VerbatimChar"/>
         </w:rPr>
-        <w:t xml:space="preserve">└──────────────────┘  │ Merge (O(n log n))   │</w:t>
+        <w:t xml:space="preserve">+------------------+  | Merge (O(n log n))   |</w:t>
       </w:r>
       <w:r>
         <w:br/>
@@ -3498,7 +3491,7 @@
         <w:rPr>
           <w:rStyle w:val="VerbatimChar"/>
         </w:rPr>
-        <w:t xml:space="preserve">                      │ Quick (O(n log n))   │</w:t>
+        <w:t xml:space="preserve">                      | Quick (O(n log n))   |</w:t>
       </w:r>
       <w:r>
         <w:br/>
@@ -3507,7 +3500,7 @@
         <w:rPr>
           <w:rStyle w:val="VerbatimChar"/>
         </w:rPr>
-        <w:t xml:space="preserve">                      └──────────────────────┘</w:t>
+        <w:t xml:space="preserve">                      +----------------------+</w:t>
       </w:r>
     </w:p>
     <w:bookmarkEnd xmlns:a="http://schemas.openxmlformats.org/drawingml/2006/main" xmlns:pic="http://schemas.openxmlformats.org/drawingml/2006/picture" w:id="39"/>
@@ -3527,7 +3520,7 @@
         <w:rPr>
           <w:rStyle w:val="VerbatimChar"/>
         </w:rPr>
-        <w:t xml:space="preserve">┌────────────────────┐       ┌────────────────────────┐</w:t>
+        <w:t xml:space="preserve">+-----------------------+         +---------------------------+</w:t>
       </w:r>
       <w:r>
         <w:br/>
@@ -3536,7 +3529,7 @@
         <w:rPr>
           <w:rStyle w:val="VerbatimChar"/>
         </w:rPr>
-        <w:t xml:space="preserve">│      socios        │       │       libros           │</w:t>
+        <w:t xml:space="preserve">|       socios          |         |         libros             |</w:t>
       </w:r>
       <w:r>
         <w:br/>
@@ -3545,7 +3538,7 @@
         <w:rPr>
           <w:rStyle w:val="VerbatimChar"/>
         </w:rPr>
-        <w:t xml:space="preserve">├────────────────────┤       ├────────────────────────┤</w:t>
+        <w:t xml:space="preserve">+-----------------------+         +---------------------------+</w:t>
       </w:r>
       <w:r>
         <w:br/>
@@ -3554,7 +3547,7 @@
         <w:rPr>
           <w:rStyle w:val="VerbatimChar"/>
         </w:rPr>
-        <w:t xml:space="preserve">│ PK  cedula: TEXT   │       │ PK  isbn: TEXT         │</w:t>
+        <w:t xml:space="preserve">| PK cedula: TEXT       |         | PK isbn: TEXT              |</w:t>
       </w:r>
       <w:r>
         <w:br/>
@@ -3563,7 +3556,7 @@
         <w:rPr>
           <w:rStyle w:val="VerbatimChar"/>
         </w:rPr>
-        <w:t xml:space="preserve">│     nombre: TEXT   │       │     titulo: TEXT       │</w:t>
+        <w:t xml:space="preserve">|     nombre: TEXT      |         |     titulo: TEXT           |</w:t>
       </w:r>
       <w:r>
         <w:br/>
@@ -3572,7 +3565,7 @@
         <w:rPr>
           <w:rStyle w:val="VerbatimChar"/>
         </w:rPr>
-        <w:t xml:space="preserve">│     apellido: TEXT │       │     autor: TEXT        │</w:t>
+        <w:t xml:space="preserve">|     apellido: TEXT    |         |     autor: TEXT            |</w:t>
       </w:r>
       <w:r>
         <w:br/>
@@ -3581,7 +3574,7 @@
         <w:rPr>
           <w:rStyle w:val="VerbatimChar"/>
         </w:rPr>
-        <w:t xml:space="preserve">│     tipo: TEXT     │       │     editorial: TEXT    │</w:t>
+        <w:t xml:space="preserve">|     tipo: TEXT        |         |     editorial: TEXT        |</w:t>
       </w:r>
       <w:r>
         <w:br/>
@@ -3590,7 +3583,7 @@
         <w:rPr>
           <w:rStyle w:val="VerbatimChar"/>
         </w:rPr>
-        <w:t xml:space="preserve">│     carrera: TEXT  │       │     anio: INTEGER      │</w:t>
+        <w:t xml:space="preserve">|     carrera: TEXT     |         |     anio: INTEGER          |</w:t>
       </w:r>
       <w:r>
         <w:br/>
@@ -3599,7 +3592,7 @@
         <w:rPr>
           <w:rStyle w:val="VerbatimChar"/>
         </w:rPr>
-        <w:t xml:space="preserve">│     semestre: INT  │       │     ejemplares: INT    │</w:t>
+        <w:t xml:space="preserve">|     semestre: INT     |         |     ejemplares: INT        |</w:t>
       </w:r>
       <w:r>
         <w:br/>
@@ -3608,7 +3601,7 @@
         <w:rPr>
           <w:rStyle w:val="VerbatimChar"/>
         </w:rPr>
-        <w:t xml:space="preserve">│     telefono: TEXT │       │     disponibles: INT   │</w:t>
+        <w:t xml:space="preserve">|     telefono: TEXT    |         |     disponibles: INT       |</w:t>
       </w:r>
       <w:r>
         <w:br/>
@@ -3617,7 +3610,7 @@
         <w:rPr>
           <w:rStyle w:val="VerbatimChar"/>
         </w:rPr>
-        <w:t xml:space="preserve">└────────┬───────────┘       └──────────┬─────────────┘</w:t>
+        <w:t xml:space="preserve">+-----------+-----------+         +-------------+-------------+</w:t>
       </w:r>
       <w:r>
         <w:br/>
@@ -3626,7 +3619,7 @@
         <w:rPr>
           <w:rStyle w:val="VerbatimChar"/>
         </w:rPr>
-        <w:t xml:space="preserve">         │                              │</w:t>
+        <w:t xml:space="preserve">            |                                   |</w:t>
       </w:r>
       <w:r>
         <w:br/>
@@ -3635,7 +3628,7 @@
         <w:rPr>
           <w:rStyle w:val="VerbatimChar"/>
         </w:rPr>
-        <w:t xml:space="preserve">         │  ┌───────────────────────────┘</w:t>
+        <w:t xml:space="preserve">            |                                   |</w:t>
       </w:r>
       <w:r>
         <w:br/>
@@ -3644,7 +3637,7 @@
         <w:rPr>
           <w:rStyle w:val="VerbatimChar"/>
         </w:rPr>
-        <w:t xml:space="preserve">         │  │</w:t>
+        <w:t xml:space="preserve">            +----------+------------------------+</w:t>
       </w:r>
       <w:r>
         <w:br/>
@@ -3653,7 +3646,7 @@
         <w:rPr>
           <w:rStyle w:val="VerbatimChar"/>
         </w:rPr>
-        <w:t xml:space="preserve">         ▼  ▼</w:t>
+        <w:t xml:space="preserve">                       |</w:t>
       </w:r>
       <w:r>
         <w:br/>
@@ -3662,7 +3655,7 @@
         <w:rPr>
           <w:rStyle w:val="VerbatimChar"/>
         </w:rPr>
-        <w:t xml:space="preserve">┌────────────────────┐       ┌────────────────────────┐</w:t>
+        <w:t xml:space="preserve">              +--------+--------+</w:t>
       </w:r>
       <w:r>
         <w:br/>
@@ -3671,7 +3664,7 @@
         <w:rPr>
           <w:rStyle w:val="VerbatimChar"/>
         </w:rPr>
-        <w:t xml:space="preserve">│     prestamos      │       │       reservas          │</w:t>
+        <w:t xml:space="preserve">              |    prestamos    |        |      reservas      |</w:t>
       </w:r>
       <w:r>
         <w:br/>
@@ -3680,7 +3673,7 @@
         <w:rPr>
           <w:rStyle w:val="VerbatimChar"/>
         </w:rPr>
-        <w:t xml:space="preserve">├────────────────────┤       ├────────────────────────┤</w:t>
+        <w:t xml:space="preserve">              | PK id: INTEGER  |        | PK id: INTEGER     |</w:t>
       </w:r>
       <w:r>
         <w:br/>
@@ -3689,7 +3682,7 @@
         <w:rPr>
           <w:rStyle w:val="VerbatimChar"/>
         </w:rPr>
-        <w:t xml:space="preserve">│ PK  id: INTEGER    │       │ PK  id: INTEGER        │</w:t>
+        <w:t xml:space="preserve">              | FK cedula_socio |----    | FK cedula_socio    |---- socios</w:t>
       </w:r>
       <w:r>
         <w:br/>
@@ -3698,7 +3691,7 @@
         <w:rPr>
           <w:rStyle w:val="VerbatimChar"/>
         </w:rPr>
-        <w:t xml:space="preserve">│ FK  cedula_socio   │──►    │ FK  cedula_socio       │──► socios</w:t>
+        <w:t xml:space="preserve">              | FK isbn_libro   |----    | FK isbn_libro      |---- libros</w:t>
       </w:r>
       <w:r>
         <w:br/>
@@ -3707,7 +3700,7 @@
         <w:rPr>
           <w:rStyle w:val="VerbatimChar"/>
         </w:rPr>
-        <w:t xml:space="preserve">│ FK  isbn_libro     │──►    │ FK  isbn_libro         │──► libros</w:t>
+        <w:t xml:space="preserve">              | fecha_prestamo  |        | fecha_reserva      |</w:t>
       </w:r>
       <w:r>
         <w:br/>
@@ -3716,7 +3709,7 @@
         <w:rPr>
           <w:rStyle w:val="VerbatimChar"/>
         </w:rPr>
-        <w:t xml:space="preserve">│     fecha_prestamo │       │     fecha_reserva      │</w:t>
+        <w:t xml:space="preserve">              | fecha_devuelto  |        | activa: INTEGER    |</w:t>
       </w:r>
       <w:r>
         <w:br/>
@@ -3725,16 +3718,55 @@
         <w:rPr>
           <w:rStyle w:val="VerbatimChar"/>
         </w:rPr>
-        <w:t xml:space="preserve">│     fecha_devuelto │       │     activa: INTEGER    │</w:t>
+        <w:t xml:space="preserve">              +-----------------+        +--------------------+</w:t>
       </w:r>
       <w:r>
         <w:br/>
       </w:r>
       <w:r>
+        <w:br/>
+      </w:r>
+      <w:r>
         <w:rPr>
           <w:rStyle w:val="VerbatimChar"/>
         </w:rPr>
-        <w:t xml:space="preserve">└────────────────────┘       └────────────────────────┘</w:t>
+        <w:t xml:space="preserve">Relaciones:</w:t>
+      </w:r>
+      <w:r>
+        <w:br/>
+      </w:r>
+      <w:r>
+        <w:rPr>
+          <w:rStyle w:val="VerbatimChar"/>
+        </w:rPr>
+        <w:t xml:space="preserve">- socios (1) -&gt; (N) prestamos   : Un socio puede tener 0 o muchos prestamos</w:t>
+      </w:r>
+      <w:r>
+        <w:br/>
+      </w:r>
+      <w:r>
+        <w:rPr>
+          <w:rStyle w:val="VerbatimChar"/>
+        </w:rPr>
+        <w:t xml:space="preserve">- socios (1) -&gt; (N) reservas    : Un socio puede tener 0 o muchas reservas</w:t>
+      </w:r>
+      <w:r>
+        <w:br/>
+      </w:r>
+      <w:r>
+        <w:rPr>
+          <w:rStyle w:val="VerbatimChar"/>
+        </w:rPr>
+        <w:t xml:space="preserve">- libros (1) -&gt; (N) prestamos   : Un libro puede estar en 0 o muchos prestamos</w:t>
+      </w:r>
+      <w:r>
+        <w:br/>
+      </w:r>
+      <w:r>
+        <w:rPr>
+          <w:rStyle w:val="VerbatimChar"/>
+        </w:rPr>
+        <w:t xml:space="preserve">- libros (1) -&gt; (N) reservas    : Un libro puede tener 0 o muchas reservas</w:t>
       </w:r>
     </w:p>
     <w:p xmlns:a="http://schemas.openxmlformats.org/drawingml/2006/main" xmlns:pic="http://schemas.openxmlformats.org/drawingml/2006/picture">

</xml_diff>